<commit_message>
I have succesfully created all the tables in my database. I can now slowly begin to add the data into the tables
</commit_message>
<xml_diff>
--- a/DATABASE/Data dictionary/Database Tables.docx
+++ b/DATABASE/Data dictionary/Database Tables.docx
@@ -1131,8 +1131,23 @@
     </w:tbl>
     <w:p/>
     <w:p/>
+    <w:p/>
+    <w:p/>
+    <w:p/>
+    <w:p/>
+    <w:p/>
+    <w:p/>
+    <w:p/>
+    <w:p/>
+    <w:p/>
+    <w:p/>
+    <w:p/>
+    <w:p/>
+    <w:p/>
+    <w:p/>
     <w:p>
       <w:r>
+        <w:lastRenderedPageBreak/>
         <w:t xml:space="preserve">Table: </w:t>
       </w:r>
       <w:r>
@@ -1154,9 +1169,9 @@
         <w:tblLook w:val="04A0" w:firstRow="1" w:lastRow="0" w:firstColumn="1" w:lastColumn="0" w:noHBand="0" w:noVBand="1"/>
       </w:tblPr>
       <w:tblGrid>
-        <w:gridCol w:w="1957"/>
+        <w:gridCol w:w="1759"/>
         <w:gridCol w:w="1984"/>
-        <w:gridCol w:w="5069"/>
+        <w:gridCol w:w="5267"/>
       </w:tblGrid>
       <w:tr>
         <w:trPr>
@@ -1402,14 +1417,14 @@
           </w:tcPr>
           <w:p>
             <w:r>
-              <w:t xml:space="preserve">The unique display name chosen by the student. </w:t>
+              <w:t xml:space="preserve">Unique student handle. </w:t>
             </w:r>
             <w:r>
               <w:rPr>
                 <w:b/>
                 <w:bCs/>
               </w:rPr>
-              <w:t>Must be UNIQUE and NOT NULL.</w:t>
+              <w:t>UNIQUE and NOT NULL.</w:t>
             </w:r>
           </w:p>
         </w:tc>
@@ -1437,14 +1452,9 @@
             <w:hideMark/>
           </w:tcPr>
           <w:p>
-            <w:proofErr w:type="spellStart"/>
-            <w:r>
-              <w:t>Student_</w:t>
-            </w:r>
             <w:r>
               <w:t>email</w:t>
             </w:r>
-            <w:proofErr w:type="spellEnd"/>
           </w:p>
         </w:tc>
         <w:tc>
@@ -1472,48 +1482,38 @@
             </w:r>
             <w:proofErr w:type="gramEnd"/>
             <w:r>
-              <w:t>100)</w:t>
-            </w:r>
-          </w:p>
-        </w:tc>
-        <w:tc>
-          <w:tcPr>
-            <w:tcW w:w="0" w:type="auto"/>
-            <w:tcBorders>
-              <w:top w:val="single" w:sz="6" w:space="0" w:color="C4C7C5"/>
-              <w:left w:val="single" w:sz="6" w:space="0" w:color="C4C7C5"/>
-              <w:bottom w:val="single" w:sz="6" w:space="0" w:color="C4C7C5"/>
-              <w:right w:val="single" w:sz="6" w:space="0" w:color="C4C7C5"/>
-            </w:tcBorders>
-            <w:tcMar>
-              <w:top w:w="120" w:type="dxa"/>
-              <w:left w:w="180" w:type="dxa"/>
-              <w:bottom w:w="120" w:type="dxa"/>
-              <w:right w:w="180" w:type="dxa"/>
-            </w:tcMar>
-            <w:vAlign w:val="center"/>
-            <w:hideMark/>
-          </w:tcPr>
-          <w:p>
-            <w:r>
-              <w:t xml:space="preserve">The student's university email address used for logging in. </w:t>
+              <w:t>50)</w:t>
+            </w:r>
+          </w:p>
+        </w:tc>
+        <w:tc>
+          <w:tcPr>
+            <w:tcW w:w="0" w:type="auto"/>
+            <w:tcBorders>
+              <w:top w:val="single" w:sz="6" w:space="0" w:color="C4C7C5"/>
+              <w:left w:val="single" w:sz="6" w:space="0" w:color="C4C7C5"/>
+              <w:bottom w:val="single" w:sz="6" w:space="0" w:color="C4C7C5"/>
+              <w:right w:val="single" w:sz="6" w:space="0" w:color="C4C7C5"/>
+            </w:tcBorders>
+            <w:tcMar>
+              <w:top w:w="120" w:type="dxa"/>
+              <w:left w:w="180" w:type="dxa"/>
+              <w:bottom w:w="120" w:type="dxa"/>
+              <w:right w:w="180" w:type="dxa"/>
+            </w:tcMar>
+            <w:vAlign w:val="center"/>
+            <w:hideMark/>
+          </w:tcPr>
+          <w:p>
+            <w:r>
+              <w:t xml:space="preserve">UWC student email (4492340@uwc.ac.za). </w:t>
             </w:r>
             <w:r>
               <w:rPr>
                 <w:b/>
                 <w:bCs/>
               </w:rPr>
-              <w:t>Must be UNIQUE and NOT NULL.</w:t>
-            </w:r>
-            <w:r>
-              <w:rPr>
-                <w:b/>
-                <w:bCs/>
-              </w:rPr>
-              <w:t xml:space="preserve"> </w:t>
-            </w:r>
-            <w:r>
-              <w:t>(Include a prompt that encourages them to use their student email)</w:t>
+              <w:t>UNIQUE and NOT NULL.</w:t>
             </w:r>
           </w:p>
         </w:tc>
@@ -1595,14 +1595,1228 @@
           </w:tcPr>
           <w:p>
             <w:r>
-              <w:t xml:space="preserve">Stores the encrypted login security string generated by Spring Boot. </w:t>
+              <w:t xml:space="preserve">Encrypted password string. </w:t>
             </w:r>
             <w:r>
               <w:rPr>
                 <w:b/>
                 <w:bCs/>
               </w:rPr>
-              <w:t>Must be NOT NULL.</w:t>
+              <w:t>NOT NULL.</w:t>
+            </w:r>
+          </w:p>
+        </w:tc>
+      </w:tr>
+      <w:tr>
+        <w:trPr>
+          <w:tblCellSpacing w:w="15" w:type="dxa"/>
+        </w:trPr>
+        <w:tc>
+          <w:tcPr>
+            <w:tcW w:w="0" w:type="auto"/>
+            <w:tcBorders>
+              <w:top w:val="single" w:sz="6" w:space="0" w:color="C4C7C5"/>
+              <w:left w:val="single" w:sz="6" w:space="0" w:color="C4C7C5"/>
+              <w:bottom w:val="single" w:sz="6" w:space="0" w:color="C4C7C5"/>
+              <w:right w:val="single" w:sz="6" w:space="0" w:color="C4C7C5"/>
+            </w:tcBorders>
+            <w:tcMar>
+              <w:top w:w="120" w:type="dxa"/>
+              <w:left w:w="180" w:type="dxa"/>
+              <w:bottom w:w="120" w:type="dxa"/>
+              <w:right w:w="180" w:type="dxa"/>
+            </w:tcMar>
+            <w:vAlign w:val="center"/>
+            <w:hideMark/>
+          </w:tcPr>
+          <w:p>
+            <w:r>
+              <w:t>role</w:t>
+            </w:r>
+          </w:p>
+        </w:tc>
+        <w:tc>
+          <w:tcPr>
+            <w:tcW w:w="0" w:type="auto"/>
+            <w:tcBorders>
+              <w:top w:val="single" w:sz="6" w:space="0" w:color="C4C7C5"/>
+              <w:left w:val="single" w:sz="6" w:space="0" w:color="C4C7C5"/>
+              <w:bottom w:val="single" w:sz="6" w:space="0" w:color="C4C7C5"/>
+              <w:right w:val="single" w:sz="6" w:space="0" w:color="C4C7C5"/>
+            </w:tcBorders>
+            <w:tcMar>
+              <w:top w:w="120" w:type="dxa"/>
+              <w:left w:w="180" w:type="dxa"/>
+              <w:bottom w:w="120" w:type="dxa"/>
+              <w:right w:w="180" w:type="dxa"/>
+            </w:tcMar>
+            <w:vAlign w:val="center"/>
+            <w:hideMark/>
+          </w:tcPr>
+          <w:p>
+            <w:proofErr w:type="gramStart"/>
+            <w:r>
+              <w:t>VARCHAR(</w:t>
+            </w:r>
+            <w:proofErr w:type="gramEnd"/>
+            <w:r>
+              <w:t>20)</w:t>
+            </w:r>
+          </w:p>
+        </w:tc>
+        <w:tc>
+          <w:tcPr>
+            <w:tcW w:w="0" w:type="auto"/>
+            <w:tcBorders>
+              <w:top w:val="single" w:sz="6" w:space="0" w:color="C4C7C5"/>
+              <w:left w:val="single" w:sz="6" w:space="0" w:color="C4C7C5"/>
+              <w:bottom w:val="single" w:sz="6" w:space="0" w:color="C4C7C5"/>
+              <w:right w:val="single" w:sz="6" w:space="0" w:color="C4C7C5"/>
+            </w:tcBorders>
+            <w:tcMar>
+              <w:top w:w="120" w:type="dxa"/>
+              <w:left w:w="180" w:type="dxa"/>
+              <w:bottom w:w="120" w:type="dxa"/>
+              <w:right w:w="180" w:type="dxa"/>
+            </w:tcMar>
+            <w:vAlign w:val="center"/>
+            <w:hideMark/>
+          </w:tcPr>
+          <w:p>
+            <w:r>
+              <w:t>Set to 'ROLE_STUDENT' or 'ROLE_ADMIN' for Spring Security limits.</w:t>
+            </w:r>
+          </w:p>
+        </w:tc>
+      </w:tr>
+    </w:tbl>
+    <w:p/>
+    <w:p/>
+    <w:p/>
+    <w:p/>
+    <w:p/>
+    <w:p/>
+    <w:p/>
+    <w:p/>
+    <w:p/>
+    <w:p/>
+    <w:p/>
+    <w:p/>
+    <w:p/>
+    <w:p/>
+    <w:p>
+      <w:r>
+        <w:lastRenderedPageBreak/>
+        <w:t xml:space="preserve">Table: </w:t>
+      </w:r>
+      <w:r>
+        <w:rPr>
+          <w:b/>
+          <w:bCs/>
+        </w:rPr>
+        <w:t>courses</w:t>
+      </w:r>
+    </w:p>
+    <w:tbl>
+      <w:tblPr>
+        <w:tblW w:w="0" w:type="auto"/>
+        <w:tblCellSpacing w:w="15" w:type="dxa"/>
+        <w:tblCellMar>
+          <w:left w:w="0" w:type="dxa"/>
+          <w:right w:w="0" w:type="dxa"/>
+        </w:tblCellMar>
+        <w:tblLook w:val="04A0" w:firstRow="1" w:lastRow="0" w:firstColumn="1" w:lastColumn="0" w:noHBand="0" w:noVBand="1"/>
+      </w:tblPr>
+      <w:tblGrid>
+        <w:gridCol w:w="1984"/>
+        <w:gridCol w:w="1984"/>
+        <w:gridCol w:w="5042"/>
+      </w:tblGrid>
+      <w:tr>
+        <w:trPr>
+          <w:tblHeader/>
+          <w:tblCellSpacing w:w="15" w:type="dxa"/>
+        </w:trPr>
+        <w:tc>
+          <w:tcPr>
+            <w:tcW w:w="0" w:type="auto"/>
+            <w:tcBorders>
+              <w:top w:val="single" w:sz="6" w:space="0" w:color="C4C7C5"/>
+              <w:left w:val="single" w:sz="6" w:space="0" w:color="C4C7C5"/>
+              <w:bottom w:val="single" w:sz="6" w:space="0" w:color="C4C7C5"/>
+              <w:right w:val="single" w:sz="6" w:space="0" w:color="C4C7C5"/>
+            </w:tcBorders>
+            <w:tcMar>
+              <w:top w:w="120" w:type="dxa"/>
+              <w:left w:w="180" w:type="dxa"/>
+              <w:bottom w:w="120" w:type="dxa"/>
+              <w:right w:w="180" w:type="dxa"/>
+            </w:tcMar>
+            <w:vAlign w:val="center"/>
+            <w:hideMark/>
+          </w:tcPr>
+          <w:p>
+            <w:r>
+              <w:rPr>
+                <w:b/>
+                <w:bCs/>
+              </w:rPr>
+              <w:t>Column Name</w:t>
+            </w:r>
+          </w:p>
+        </w:tc>
+        <w:tc>
+          <w:tcPr>
+            <w:tcW w:w="0" w:type="auto"/>
+            <w:tcBorders>
+              <w:top w:val="single" w:sz="6" w:space="0" w:color="C4C7C5"/>
+              <w:left w:val="single" w:sz="6" w:space="0" w:color="C4C7C5"/>
+              <w:bottom w:val="single" w:sz="6" w:space="0" w:color="C4C7C5"/>
+              <w:right w:val="single" w:sz="6" w:space="0" w:color="C4C7C5"/>
+            </w:tcBorders>
+            <w:tcMar>
+              <w:top w:w="120" w:type="dxa"/>
+              <w:left w:w="180" w:type="dxa"/>
+              <w:bottom w:w="120" w:type="dxa"/>
+              <w:right w:w="180" w:type="dxa"/>
+            </w:tcMar>
+            <w:vAlign w:val="center"/>
+            <w:hideMark/>
+          </w:tcPr>
+          <w:p>
+            <w:r>
+              <w:rPr>
+                <w:b/>
+                <w:bCs/>
+              </w:rPr>
+              <w:t>Type</w:t>
+            </w:r>
+          </w:p>
+        </w:tc>
+        <w:tc>
+          <w:tcPr>
+            <w:tcW w:w="0" w:type="auto"/>
+            <w:tcBorders>
+              <w:top w:val="single" w:sz="6" w:space="0" w:color="C4C7C5"/>
+              <w:left w:val="single" w:sz="6" w:space="0" w:color="C4C7C5"/>
+              <w:bottom w:val="single" w:sz="6" w:space="0" w:color="C4C7C5"/>
+              <w:right w:val="single" w:sz="6" w:space="0" w:color="C4C7C5"/>
+            </w:tcBorders>
+            <w:tcMar>
+              <w:top w:w="120" w:type="dxa"/>
+              <w:left w:w="180" w:type="dxa"/>
+              <w:bottom w:w="120" w:type="dxa"/>
+              <w:right w:w="180" w:type="dxa"/>
+            </w:tcMar>
+            <w:vAlign w:val="center"/>
+            <w:hideMark/>
+          </w:tcPr>
+          <w:p>
+            <w:r>
+              <w:rPr>
+                <w:b/>
+                <w:bCs/>
+              </w:rPr>
+              <w:t>Purpose</w:t>
+            </w:r>
+          </w:p>
+        </w:tc>
+      </w:tr>
+      <w:tr>
+        <w:trPr>
+          <w:tblCellSpacing w:w="15" w:type="dxa"/>
+        </w:trPr>
+        <w:tc>
+          <w:tcPr>
+            <w:tcW w:w="0" w:type="auto"/>
+            <w:tcBorders>
+              <w:top w:val="single" w:sz="6" w:space="0" w:color="C4C7C5"/>
+              <w:left w:val="single" w:sz="6" w:space="0" w:color="C4C7C5"/>
+              <w:bottom w:val="single" w:sz="6" w:space="0" w:color="C4C7C5"/>
+              <w:right w:val="single" w:sz="6" w:space="0" w:color="C4C7C5"/>
+            </w:tcBorders>
+            <w:tcMar>
+              <w:top w:w="120" w:type="dxa"/>
+              <w:left w:w="180" w:type="dxa"/>
+              <w:bottom w:w="120" w:type="dxa"/>
+              <w:right w:w="180" w:type="dxa"/>
+            </w:tcMar>
+            <w:vAlign w:val="center"/>
+            <w:hideMark/>
+          </w:tcPr>
+          <w:p>
+            <w:r>
+              <w:t>id</w:t>
+            </w:r>
+          </w:p>
+        </w:tc>
+        <w:tc>
+          <w:tcPr>
+            <w:tcW w:w="0" w:type="auto"/>
+            <w:tcBorders>
+              <w:top w:val="single" w:sz="6" w:space="0" w:color="C4C7C5"/>
+              <w:left w:val="single" w:sz="6" w:space="0" w:color="C4C7C5"/>
+              <w:bottom w:val="single" w:sz="6" w:space="0" w:color="C4C7C5"/>
+              <w:right w:val="single" w:sz="6" w:space="0" w:color="C4C7C5"/>
+            </w:tcBorders>
+            <w:tcMar>
+              <w:top w:w="120" w:type="dxa"/>
+              <w:left w:w="180" w:type="dxa"/>
+              <w:bottom w:w="120" w:type="dxa"/>
+              <w:right w:w="180" w:type="dxa"/>
+            </w:tcMar>
+            <w:vAlign w:val="center"/>
+            <w:hideMark/>
+          </w:tcPr>
+          <w:p>
+            <w:r>
+              <w:t>INT (PK)</w:t>
+            </w:r>
+          </w:p>
+        </w:tc>
+        <w:tc>
+          <w:tcPr>
+            <w:tcW w:w="0" w:type="auto"/>
+            <w:tcBorders>
+              <w:top w:val="single" w:sz="6" w:space="0" w:color="C4C7C5"/>
+              <w:left w:val="single" w:sz="6" w:space="0" w:color="C4C7C5"/>
+              <w:bottom w:val="single" w:sz="6" w:space="0" w:color="C4C7C5"/>
+              <w:right w:val="single" w:sz="6" w:space="0" w:color="C4C7C5"/>
+            </w:tcBorders>
+            <w:tcMar>
+              <w:top w:w="120" w:type="dxa"/>
+              <w:left w:w="180" w:type="dxa"/>
+              <w:bottom w:w="120" w:type="dxa"/>
+              <w:right w:w="180" w:type="dxa"/>
+            </w:tcMar>
+            <w:vAlign w:val="center"/>
+            <w:hideMark/>
+          </w:tcPr>
+          <w:p>
+            <w:r>
+              <w:t>Internal unique ID (Auto Incremented)</w:t>
+            </w:r>
+          </w:p>
+        </w:tc>
+      </w:tr>
+      <w:tr>
+        <w:trPr>
+          <w:tblCellSpacing w:w="15" w:type="dxa"/>
+        </w:trPr>
+        <w:tc>
+          <w:tcPr>
+            <w:tcW w:w="0" w:type="auto"/>
+            <w:tcBorders>
+              <w:top w:val="single" w:sz="6" w:space="0" w:color="C4C7C5"/>
+              <w:left w:val="single" w:sz="6" w:space="0" w:color="C4C7C5"/>
+              <w:bottom w:val="single" w:sz="6" w:space="0" w:color="C4C7C5"/>
+              <w:right w:val="single" w:sz="6" w:space="0" w:color="C4C7C5"/>
+            </w:tcBorders>
+            <w:tcMar>
+              <w:top w:w="120" w:type="dxa"/>
+              <w:left w:w="180" w:type="dxa"/>
+              <w:bottom w:w="120" w:type="dxa"/>
+              <w:right w:w="180" w:type="dxa"/>
+            </w:tcMar>
+            <w:vAlign w:val="center"/>
+            <w:hideMark/>
+          </w:tcPr>
+          <w:p>
+            <w:proofErr w:type="spellStart"/>
+            <w:r>
+              <w:t>course_code</w:t>
+            </w:r>
+            <w:proofErr w:type="spellEnd"/>
+          </w:p>
+        </w:tc>
+        <w:tc>
+          <w:tcPr>
+            <w:tcW w:w="0" w:type="auto"/>
+            <w:tcBorders>
+              <w:top w:val="single" w:sz="6" w:space="0" w:color="C4C7C5"/>
+              <w:left w:val="single" w:sz="6" w:space="0" w:color="C4C7C5"/>
+              <w:bottom w:val="single" w:sz="6" w:space="0" w:color="C4C7C5"/>
+              <w:right w:val="single" w:sz="6" w:space="0" w:color="C4C7C5"/>
+            </w:tcBorders>
+            <w:tcMar>
+              <w:top w:w="120" w:type="dxa"/>
+              <w:left w:w="180" w:type="dxa"/>
+              <w:bottom w:w="120" w:type="dxa"/>
+              <w:right w:w="180" w:type="dxa"/>
+            </w:tcMar>
+            <w:vAlign w:val="center"/>
+            <w:hideMark/>
+          </w:tcPr>
+          <w:p>
+            <w:proofErr w:type="gramStart"/>
+            <w:r>
+              <w:t>VARCHAR(</w:t>
+            </w:r>
+            <w:proofErr w:type="gramEnd"/>
+            <w:r>
+              <w:t>15)</w:t>
+            </w:r>
+          </w:p>
+        </w:tc>
+        <w:tc>
+          <w:tcPr>
+            <w:tcW w:w="0" w:type="auto"/>
+            <w:tcBorders>
+              <w:top w:val="single" w:sz="6" w:space="0" w:color="C4C7C5"/>
+              <w:left w:val="single" w:sz="6" w:space="0" w:color="C4C7C5"/>
+              <w:bottom w:val="single" w:sz="6" w:space="0" w:color="C4C7C5"/>
+              <w:right w:val="single" w:sz="6" w:space="0" w:color="C4C7C5"/>
+            </w:tcBorders>
+            <w:tcMar>
+              <w:top w:w="120" w:type="dxa"/>
+              <w:left w:w="180" w:type="dxa"/>
+              <w:bottom w:w="120" w:type="dxa"/>
+              <w:right w:w="180" w:type="dxa"/>
+            </w:tcMar>
+            <w:vAlign w:val="center"/>
+            <w:hideMark/>
+          </w:tcPr>
+          <w:p>
+            <w:r>
+              <w:t xml:space="preserve">The numeric qualification code from the yearbook (e.g., '3214'). </w:t>
+            </w:r>
+            <w:r>
+              <w:rPr>
+                <w:b/>
+                <w:bCs/>
+              </w:rPr>
+              <w:t>UNIQUE and NOT NULL.</w:t>
+            </w:r>
+          </w:p>
+        </w:tc>
+      </w:tr>
+      <w:tr>
+        <w:trPr>
+          <w:tblCellSpacing w:w="15" w:type="dxa"/>
+        </w:trPr>
+        <w:tc>
+          <w:tcPr>
+            <w:tcW w:w="0" w:type="auto"/>
+            <w:tcBorders>
+              <w:top w:val="single" w:sz="6" w:space="0" w:color="C4C7C5"/>
+              <w:left w:val="single" w:sz="6" w:space="0" w:color="C4C7C5"/>
+              <w:bottom w:val="single" w:sz="6" w:space="0" w:color="C4C7C5"/>
+              <w:right w:val="single" w:sz="6" w:space="0" w:color="C4C7C5"/>
+            </w:tcBorders>
+            <w:tcMar>
+              <w:top w:w="120" w:type="dxa"/>
+              <w:left w:w="180" w:type="dxa"/>
+              <w:bottom w:w="120" w:type="dxa"/>
+              <w:right w:w="180" w:type="dxa"/>
+            </w:tcMar>
+            <w:vAlign w:val="center"/>
+            <w:hideMark/>
+          </w:tcPr>
+          <w:p>
+            <w:proofErr w:type="spellStart"/>
+            <w:r>
+              <w:t>course_name</w:t>
+            </w:r>
+            <w:proofErr w:type="spellEnd"/>
+          </w:p>
+        </w:tc>
+        <w:tc>
+          <w:tcPr>
+            <w:tcW w:w="0" w:type="auto"/>
+            <w:tcBorders>
+              <w:top w:val="single" w:sz="6" w:space="0" w:color="C4C7C5"/>
+              <w:left w:val="single" w:sz="6" w:space="0" w:color="C4C7C5"/>
+              <w:bottom w:val="single" w:sz="6" w:space="0" w:color="C4C7C5"/>
+              <w:right w:val="single" w:sz="6" w:space="0" w:color="C4C7C5"/>
+            </w:tcBorders>
+            <w:tcMar>
+              <w:top w:w="120" w:type="dxa"/>
+              <w:left w:w="180" w:type="dxa"/>
+              <w:bottom w:w="120" w:type="dxa"/>
+              <w:right w:w="180" w:type="dxa"/>
+            </w:tcMar>
+            <w:vAlign w:val="center"/>
+            <w:hideMark/>
+          </w:tcPr>
+          <w:p>
+            <w:proofErr w:type="gramStart"/>
+            <w:r>
+              <w:t>VARCHAR(</w:t>
+            </w:r>
+            <w:proofErr w:type="gramEnd"/>
+            <w:r>
+              <w:t>127)</w:t>
+            </w:r>
+          </w:p>
+        </w:tc>
+        <w:tc>
+          <w:tcPr>
+            <w:tcW w:w="0" w:type="auto"/>
+            <w:tcBorders>
+              <w:top w:val="single" w:sz="6" w:space="0" w:color="C4C7C5"/>
+              <w:left w:val="single" w:sz="6" w:space="0" w:color="C4C7C5"/>
+              <w:bottom w:val="single" w:sz="6" w:space="0" w:color="C4C7C5"/>
+              <w:right w:val="single" w:sz="6" w:space="0" w:color="C4C7C5"/>
+            </w:tcBorders>
+            <w:tcMar>
+              <w:top w:w="120" w:type="dxa"/>
+              <w:left w:w="180" w:type="dxa"/>
+              <w:bottom w:w="120" w:type="dxa"/>
+              <w:right w:w="180" w:type="dxa"/>
+            </w:tcMar>
+            <w:vAlign w:val="center"/>
+            <w:hideMark/>
+          </w:tcPr>
+          <w:p>
+            <w:r>
+              <w:t xml:space="preserve">Full qualification name (e.g., 'Bachelor of Science in Applied Geology'). </w:t>
+            </w:r>
+            <w:r>
+              <w:rPr>
+                <w:b/>
+                <w:bCs/>
+              </w:rPr>
+              <w:t>NOT NULL.</w:t>
+            </w:r>
+          </w:p>
+        </w:tc>
+      </w:tr>
+      <w:tr>
+        <w:trPr>
+          <w:tblCellSpacing w:w="15" w:type="dxa"/>
+        </w:trPr>
+        <w:tc>
+          <w:tcPr>
+            <w:tcW w:w="0" w:type="auto"/>
+            <w:tcBorders>
+              <w:top w:val="single" w:sz="6" w:space="0" w:color="C4C7C5"/>
+              <w:left w:val="single" w:sz="6" w:space="0" w:color="C4C7C5"/>
+              <w:bottom w:val="single" w:sz="6" w:space="0" w:color="C4C7C5"/>
+              <w:right w:val="single" w:sz="6" w:space="0" w:color="C4C7C5"/>
+            </w:tcBorders>
+            <w:tcMar>
+              <w:top w:w="120" w:type="dxa"/>
+              <w:left w:w="180" w:type="dxa"/>
+              <w:bottom w:w="120" w:type="dxa"/>
+              <w:right w:w="180" w:type="dxa"/>
+            </w:tcMar>
+            <w:vAlign w:val="center"/>
+            <w:hideMark/>
+          </w:tcPr>
+          <w:p>
+            <w:r>
+              <w:t>abbreviation</w:t>
+            </w:r>
+          </w:p>
+        </w:tc>
+        <w:tc>
+          <w:tcPr>
+            <w:tcW w:w="0" w:type="auto"/>
+            <w:tcBorders>
+              <w:top w:val="single" w:sz="6" w:space="0" w:color="C4C7C5"/>
+              <w:left w:val="single" w:sz="6" w:space="0" w:color="C4C7C5"/>
+              <w:bottom w:val="single" w:sz="6" w:space="0" w:color="C4C7C5"/>
+              <w:right w:val="single" w:sz="6" w:space="0" w:color="C4C7C5"/>
+            </w:tcBorders>
+            <w:tcMar>
+              <w:top w:w="120" w:type="dxa"/>
+              <w:left w:w="180" w:type="dxa"/>
+              <w:bottom w:w="120" w:type="dxa"/>
+              <w:right w:w="180" w:type="dxa"/>
+            </w:tcMar>
+            <w:vAlign w:val="center"/>
+            <w:hideMark/>
+          </w:tcPr>
+          <w:p>
+            <w:proofErr w:type="gramStart"/>
+            <w:r>
+              <w:t>VARCHAR(</w:t>
+            </w:r>
+            <w:proofErr w:type="gramEnd"/>
+            <w:r>
+              <w:t>63)</w:t>
+            </w:r>
+          </w:p>
+        </w:tc>
+        <w:tc>
+          <w:tcPr>
+            <w:tcW w:w="0" w:type="auto"/>
+            <w:tcBorders>
+              <w:top w:val="single" w:sz="6" w:space="0" w:color="C4C7C5"/>
+              <w:left w:val="single" w:sz="6" w:space="0" w:color="C4C7C5"/>
+              <w:bottom w:val="single" w:sz="6" w:space="0" w:color="C4C7C5"/>
+              <w:right w:val="single" w:sz="6" w:space="0" w:color="C4C7C5"/>
+            </w:tcBorders>
+            <w:tcMar>
+              <w:top w:w="120" w:type="dxa"/>
+              <w:left w:w="180" w:type="dxa"/>
+              <w:bottom w:w="120" w:type="dxa"/>
+              <w:right w:w="180" w:type="dxa"/>
+            </w:tcMar>
+            <w:vAlign w:val="center"/>
+            <w:hideMark/>
+          </w:tcPr>
+          <w:p>
+            <w:r>
+              <w:t xml:space="preserve">Shorthand title for easy display layouts (e.g., 'BSc (Applied Geology)'). </w:t>
+            </w:r>
+            <w:r>
+              <w:rPr>
+                <w:b/>
+                <w:bCs/>
+              </w:rPr>
+              <w:t>NOT NULL.</w:t>
+            </w:r>
+          </w:p>
+        </w:tc>
+      </w:tr>
+      <w:tr>
+        <w:trPr>
+          <w:tblCellSpacing w:w="15" w:type="dxa"/>
+        </w:trPr>
+        <w:tc>
+          <w:tcPr>
+            <w:tcW w:w="0" w:type="auto"/>
+            <w:tcBorders>
+              <w:top w:val="single" w:sz="6" w:space="0" w:color="C4C7C5"/>
+              <w:left w:val="single" w:sz="6" w:space="0" w:color="C4C7C5"/>
+              <w:bottom w:val="single" w:sz="6" w:space="0" w:color="C4C7C5"/>
+              <w:right w:val="single" w:sz="6" w:space="0" w:color="C4C7C5"/>
+            </w:tcBorders>
+            <w:tcMar>
+              <w:top w:w="120" w:type="dxa"/>
+              <w:left w:w="180" w:type="dxa"/>
+              <w:bottom w:w="120" w:type="dxa"/>
+              <w:right w:w="180" w:type="dxa"/>
+            </w:tcMar>
+            <w:vAlign w:val="center"/>
+            <w:hideMark/>
+          </w:tcPr>
+          <w:p>
+            <w:proofErr w:type="spellStart"/>
+            <w:r>
+              <w:t>duration_years</w:t>
+            </w:r>
+            <w:proofErr w:type="spellEnd"/>
+          </w:p>
+        </w:tc>
+        <w:tc>
+          <w:tcPr>
+            <w:tcW w:w="0" w:type="auto"/>
+            <w:tcBorders>
+              <w:top w:val="single" w:sz="6" w:space="0" w:color="C4C7C5"/>
+              <w:left w:val="single" w:sz="6" w:space="0" w:color="C4C7C5"/>
+              <w:bottom w:val="single" w:sz="6" w:space="0" w:color="C4C7C5"/>
+              <w:right w:val="single" w:sz="6" w:space="0" w:color="C4C7C5"/>
+            </w:tcBorders>
+            <w:tcMar>
+              <w:top w:w="120" w:type="dxa"/>
+              <w:left w:w="180" w:type="dxa"/>
+              <w:bottom w:w="120" w:type="dxa"/>
+              <w:right w:w="180" w:type="dxa"/>
+            </w:tcMar>
+            <w:vAlign w:val="center"/>
+            <w:hideMark/>
+          </w:tcPr>
+          <w:p>
+            <w:r>
+              <w:t>INT</w:t>
+            </w:r>
+          </w:p>
+        </w:tc>
+        <w:tc>
+          <w:tcPr>
+            <w:tcW w:w="0" w:type="auto"/>
+            <w:tcBorders>
+              <w:top w:val="single" w:sz="6" w:space="0" w:color="C4C7C5"/>
+              <w:left w:val="single" w:sz="6" w:space="0" w:color="C4C7C5"/>
+              <w:bottom w:val="single" w:sz="6" w:space="0" w:color="C4C7C5"/>
+              <w:right w:val="single" w:sz="6" w:space="0" w:color="C4C7C5"/>
+            </w:tcBorders>
+            <w:tcMar>
+              <w:top w:w="120" w:type="dxa"/>
+              <w:left w:w="180" w:type="dxa"/>
+              <w:bottom w:w="120" w:type="dxa"/>
+              <w:right w:w="180" w:type="dxa"/>
+            </w:tcMar>
+            <w:vAlign w:val="center"/>
+            <w:hideMark/>
+          </w:tcPr>
+          <w:p>
+            <w:r>
+              <w:t xml:space="preserve">Minimum study period required from the yearbook (e.g., 3). </w:t>
+            </w:r>
+            <w:r>
+              <w:rPr>
+                <w:b/>
+                <w:bCs/>
+              </w:rPr>
+              <w:t>NOT NULL.</w:t>
+            </w:r>
+          </w:p>
+        </w:tc>
+      </w:tr>
+      <w:tr>
+        <w:trPr>
+          <w:tblCellSpacing w:w="15" w:type="dxa"/>
+        </w:trPr>
+        <w:tc>
+          <w:tcPr>
+            <w:tcW w:w="0" w:type="auto"/>
+            <w:tcBorders>
+              <w:top w:val="single" w:sz="6" w:space="0" w:color="C4C7C5"/>
+              <w:left w:val="single" w:sz="6" w:space="0" w:color="C4C7C5"/>
+              <w:bottom w:val="single" w:sz="6" w:space="0" w:color="C4C7C5"/>
+              <w:right w:val="single" w:sz="6" w:space="0" w:color="C4C7C5"/>
+            </w:tcBorders>
+            <w:tcMar>
+              <w:top w:w="120" w:type="dxa"/>
+              <w:left w:w="180" w:type="dxa"/>
+              <w:bottom w:w="120" w:type="dxa"/>
+              <w:right w:w="180" w:type="dxa"/>
+            </w:tcMar>
+            <w:vAlign w:val="center"/>
+            <w:hideMark/>
+          </w:tcPr>
+          <w:p>
+            <w:proofErr w:type="spellStart"/>
+            <w:r>
+              <w:t>faculty_id</w:t>
+            </w:r>
+            <w:proofErr w:type="spellEnd"/>
+          </w:p>
+        </w:tc>
+        <w:tc>
+          <w:tcPr>
+            <w:tcW w:w="0" w:type="auto"/>
+            <w:tcBorders>
+              <w:top w:val="single" w:sz="6" w:space="0" w:color="C4C7C5"/>
+              <w:left w:val="single" w:sz="6" w:space="0" w:color="C4C7C5"/>
+              <w:bottom w:val="single" w:sz="6" w:space="0" w:color="C4C7C5"/>
+              <w:right w:val="single" w:sz="6" w:space="0" w:color="C4C7C5"/>
+            </w:tcBorders>
+            <w:tcMar>
+              <w:top w:w="120" w:type="dxa"/>
+              <w:left w:w="180" w:type="dxa"/>
+              <w:bottom w:w="120" w:type="dxa"/>
+              <w:right w:w="180" w:type="dxa"/>
+            </w:tcMar>
+            <w:vAlign w:val="center"/>
+            <w:hideMark/>
+          </w:tcPr>
+          <w:p>
+            <w:r>
+              <w:t>INT (FK)</w:t>
+            </w:r>
+          </w:p>
+        </w:tc>
+        <w:tc>
+          <w:tcPr>
+            <w:tcW w:w="0" w:type="auto"/>
+            <w:tcBorders>
+              <w:top w:val="single" w:sz="6" w:space="0" w:color="C4C7C5"/>
+              <w:left w:val="single" w:sz="6" w:space="0" w:color="C4C7C5"/>
+              <w:bottom w:val="single" w:sz="6" w:space="0" w:color="C4C7C5"/>
+              <w:right w:val="single" w:sz="6" w:space="0" w:color="C4C7C5"/>
+            </w:tcBorders>
+            <w:tcMar>
+              <w:top w:w="120" w:type="dxa"/>
+              <w:left w:w="180" w:type="dxa"/>
+              <w:bottom w:w="120" w:type="dxa"/>
+              <w:right w:w="180" w:type="dxa"/>
+            </w:tcMar>
+            <w:vAlign w:val="center"/>
+            <w:hideMark/>
+          </w:tcPr>
+          <w:p>
+            <w:r>
+              <w:t xml:space="preserve">Links the degree back to its parent faculty. </w:t>
+            </w:r>
+            <w:r>
+              <w:rPr>
+                <w:b/>
+                <w:bCs/>
+              </w:rPr>
+              <w:t>NOT NULL.</w:t>
+            </w:r>
+          </w:p>
+        </w:tc>
+      </w:tr>
+    </w:tbl>
+    <w:p/>
+    <w:p/>
+    <w:p/>
+    <w:p/>
+    <w:p/>
+    <w:p/>
+    <w:p/>
+    <w:p/>
+    <w:p/>
+    <w:p/>
+    <w:p/>
+    <w:p>
+      <w:r>
+        <w:lastRenderedPageBreak/>
+        <w:t xml:space="preserve">Table: </w:t>
+      </w:r>
+      <w:proofErr w:type="spellStart"/>
+      <w:r>
+        <w:rPr>
+          <w:b/>
+          <w:bCs/>
+        </w:rPr>
+        <w:t>course_modules</w:t>
+      </w:r>
+      <w:proofErr w:type="spellEnd"/>
+    </w:p>
+    <w:tbl>
+      <w:tblPr>
+        <w:tblW w:w="0" w:type="auto"/>
+        <w:tblCellSpacing w:w="15" w:type="dxa"/>
+        <w:tblCellMar>
+          <w:left w:w="0" w:type="dxa"/>
+          <w:right w:w="0" w:type="dxa"/>
+        </w:tblCellMar>
+        <w:tblLook w:val="04A0" w:firstRow="1" w:lastRow="0" w:firstColumn="1" w:lastColumn="0" w:noHBand="0" w:noVBand="1"/>
+      </w:tblPr>
+      <w:tblGrid>
+        <w:gridCol w:w="1931"/>
+        <w:gridCol w:w="1856"/>
+        <w:gridCol w:w="5223"/>
+      </w:tblGrid>
+      <w:tr>
+        <w:trPr>
+          <w:tblHeader/>
+          <w:tblCellSpacing w:w="15" w:type="dxa"/>
+        </w:trPr>
+        <w:tc>
+          <w:tcPr>
+            <w:tcW w:w="0" w:type="auto"/>
+            <w:tcBorders>
+              <w:top w:val="single" w:sz="6" w:space="0" w:color="C4C7C5"/>
+              <w:left w:val="single" w:sz="6" w:space="0" w:color="C4C7C5"/>
+              <w:bottom w:val="single" w:sz="6" w:space="0" w:color="C4C7C5"/>
+              <w:right w:val="single" w:sz="6" w:space="0" w:color="C4C7C5"/>
+            </w:tcBorders>
+            <w:tcMar>
+              <w:top w:w="120" w:type="dxa"/>
+              <w:left w:w="180" w:type="dxa"/>
+              <w:bottom w:w="120" w:type="dxa"/>
+              <w:right w:w="180" w:type="dxa"/>
+            </w:tcMar>
+            <w:vAlign w:val="center"/>
+            <w:hideMark/>
+          </w:tcPr>
+          <w:p>
+            <w:r>
+              <w:rPr>
+                <w:b/>
+                <w:bCs/>
+              </w:rPr>
+              <w:t>Column Name</w:t>
+            </w:r>
+          </w:p>
+        </w:tc>
+        <w:tc>
+          <w:tcPr>
+            <w:tcW w:w="0" w:type="auto"/>
+            <w:tcBorders>
+              <w:top w:val="single" w:sz="6" w:space="0" w:color="C4C7C5"/>
+              <w:left w:val="single" w:sz="6" w:space="0" w:color="C4C7C5"/>
+              <w:bottom w:val="single" w:sz="6" w:space="0" w:color="C4C7C5"/>
+              <w:right w:val="single" w:sz="6" w:space="0" w:color="C4C7C5"/>
+            </w:tcBorders>
+            <w:tcMar>
+              <w:top w:w="120" w:type="dxa"/>
+              <w:left w:w="180" w:type="dxa"/>
+              <w:bottom w:w="120" w:type="dxa"/>
+              <w:right w:w="180" w:type="dxa"/>
+            </w:tcMar>
+            <w:vAlign w:val="center"/>
+            <w:hideMark/>
+          </w:tcPr>
+          <w:p>
+            <w:r>
+              <w:rPr>
+                <w:b/>
+                <w:bCs/>
+              </w:rPr>
+              <w:t>Type</w:t>
+            </w:r>
+          </w:p>
+        </w:tc>
+        <w:tc>
+          <w:tcPr>
+            <w:tcW w:w="0" w:type="auto"/>
+            <w:tcBorders>
+              <w:top w:val="single" w:sz="6" w:space="0" w:color="C4C7C5"/>
+              <w:left w:val="single" w:sz="6" w:space="0" w:color="C4C7C5"/>
+              <w:bottom w:val="single" w:sz="6" w:space="0" w:color="C4C7C5"/>
+              <w:right w:val="single" w:sz="6" w:space="0" w:color="C4C7C5"/>
+            </w:tcBorders>
+            <w:tcMar>
+              <w:top w:w="120" w:type="dxa"/>
+              <w:left w:w="180" w:type="dxa"/>
+              <w:bottom w:w="120" w:type="dxa"/>
+              <w:right w:w="180" w:type="dxa"/>
+            </w:tcMar>
+            <w:vAlign w:val="center"/>
+            <w:hideMark/>
+          </w:tcPr>
+          <w:p>
+            <w:r>
+              <w:rPr>
+                <w:b/>
+                <w:bCs/>
+              </w:rPr>
+              <w:t>Purpose</w:t>
+            </w:r>
+          </w:p>
+        </w:tc>
+      </w:tr>
+      <w:tr>
+        <w:trPr>
+          <w:tblCellSpacing w:w="15" w:type="dxa"/>
+        </w:trPr>
+        <w:tc>
+          <w:tcPr>
+            <w:tcW w:w="0" w:type="auto"/>
+            <w:tcBorders>
+              <w:top w:val="single" w:sz="6" w:space="0" w:color="C4C7C5"/>
+              <w:left w:val="single" w:sz="6" w:space="0" w:color="C4C7C5"/>
+              <w:bottom w:val="single" w:sz="6" w:space="0" w:color="C4C7C5"/>
+              <w:right w:val="single" w:sz="6" w:space="0" w:color="C4C7C5"/>
+            </w:tcBorders>
+            <w:tcMar>
+              <w:top w:w="120" w:type="dxa"/>
+              <w:left w:w="180" w:type="dxa"/>
+              <w:bottom w:w="120" w:type="dxa"/>
+              <w:right w:w="180" w:type="dxa"/>
+            </w:tcMar>
+            <w:vAlign w:val="center"/>
+            <w:hideMark/>
+          </w:tcPr>
+          <w:p>
+            <w:proofErr w:type="spellStart"/>
+            <w:r>
+              <w:t>course_id</w:t>
+            </w:r>
+            <w:proofErr w:type="spellEnd"/>
+          </w:p>
+        </w:tc>
+        <w:tc>
+          <w:tcPr>
+            <w:tcW w:w="0" w:type="auto"/>
+            <w:tcBorders>
+              <w:top w:val="single" w:sz="6" w:space="0" w:color="C4C7C5"/>
+              <w:left w:val="single" w:sz="6" w:space="0" w:color="C4C7C5"/>
+              <w:bottom w:val="single" w:sz="6" w:space="0" w:color="C4C7C5"/>
+              <w:right w:val="single" w:sz="6" w:space="0" w:color="C4C7C5"/>
+            </w:tcBorders>
+            <w:tcMar>
+              <w:top w:w="120" w:type="dxa"/>
+              <w:left w:w="180" w:type="dxa"/>
+              <w:bottom w:w="120" w:type="dxa"/>
+              <w:right w:w="180" w:type="dxa"/>
+            </w:tcMar>
+            <w:vAlign w:val="center"/>
+            <w:hideMark/>
+          </w:tcPr>
+          <w:p>
+            <w:r>
+              <w:t>INT (FK)</w:t>
+            </w:r>
+          </w:p>
+        </w:tc>
+        <w:tc>
+          <w:tcPr>
+            <w:tcW w:w="0" w:type="auto"/>
+            <w:tcBorders>
+              <w:top w:val="single" w:sz="6" w:space="0" w:color="C4C7C5"/>
+              <w:left w:val="single" w:sz="6" w:space="0" w:color="C4C7C5"/>
+              <w:bottom w:val="single" w:sz="6" w:space="0" w:color="C4C7C5"/>
+              <w:right w:val="single" w:sz="6" w:space="0" w:color="C4C7C5"/>
+            </w:tcBorders>
+            <w:tcMar>
+              <w:top w:w="120" w:type="dxa"/>
+              <w:left w:w="180" w:type="dxa"/>
+              <w:bottom w:w="120" w:type="dxa"/>
+              <w:right w:w="180" w:type="dxa"/>
+            </w:tcMar>
+            <w:vAlign w:val="center"/>
+            <w:hideMark/>
+          </w:tcPr>
+          <w:p>
+            <w:r>
+              <w:t xml:space="preserve">Links to the specific degree in the courses table. </w:t>
+            </w:r>
+            <w:r>
+              <w:rPr>
+                <w:b/>
+                <w:bCs/>
+              </w:rPr>
+              <w:t>Part of Composite PK.</w:t>
+            </w:r>
+          </w:p>
+        </w:tc>
+      </w:tr>
+      <w:tr>
+        <w:trPr>
+          <w:tblCellSpacing w:w="15" w:type="dxa"/>
+        </w:trPr>
+        <w:tc>
+          <w:tcPr>
+            <w:tcW w:w="0" w:type="auto"/>
+            <w:tcBorders>
+              <w:top w:val="single" w:sz="6" w:space="0" w:color="C4C7C5"/>
+              <w:left w:val="single" w:sz="6" w:space="0" w:color="C4C7C5"/>
+              <w:bottom w:val="single" w:sz="6" w:space="0" w:color="C4C7C5"/>
+              <w:right w:val="single" w:sz="6" w:space="0" w:color="C4C7C5"/>
+            </w:tcBorders>
+            <w:tcMar>
+              <w:top w:w="120" w:type="dxa"/>
+              <w:left w:w="180" w:type="dxa"/>
+              <w:bottom w:w="120" w:type="dxa"/>
+              <w:right w:w="180" w:type="dxa"/>
+            </w:tcMar>
+            <w:vAlign w:val="center"/>
+            <w:hideMark/>
+          </w:tcPr>
+          <w:p>
+            <w:proofErr w:type="spellStart"/>
+            <w:r>
+              <w:t>module_id</w:t>
+            </w:r>
+            <w:proofErr w:type="spellEnd"/>
+          </w:p>
+        </w:tc>
+        <w:tc>
+          <w:tcPr>
+            <w:tcW w:w="0" w:type="auto"/>
+            <w:tcBorders>
+              <w:top w:val="single" w:sz="6" w:space="0" w:color="C4C7C5"/>
+              <w:left w:val="single" w:sz="6" w:space="0" w:color="C4C7C5"/>
+              <w:bottom w:val="single" w:sz="6" w:space="0" w:color="C4C7C5"/>
+              <w:right w:val="single" w:sz="6" w:space="0" w:color="C4C7C5"/>
+            </w:tcBorders>
+            <w:tcMar>
+              <w:top w:w="120" w:type="dxa"/>
+              <w:left w:w="180" w:type="dxa"/>
+              <w:bottom w:w="120" w:type="dxa"/>
+              <w:right w:w="180" w:type="dxa"/>
+            </w:tcMar>
+            <w:vAlign w:val="center"/>
+            <w:hideMark/>
+          </w:tcPr>
+          <w:p>
+            <w:r>
+              <w:t>INT (FK)</w:t>
+            </w:r>
+          </w:p>
+        </w:tc>
+        <w:tc>
+          <w:tcPr>
+            <w:tcW w:w="0" w:type="auto"/>
+            <w:tcBorders>
+              <w:top w:val="single" w:sz="6" w:space="0" w:color="C4C7C5"/>
+              <w:left w:val="single" w:sz="6" w:space="0" w:color="C4C7C5"/>
+              <w:bottom w:val="single" w:sz="6" w:space="0" w:color="C4C7C5"/>
+              <w:right w:val="single" w:sz="6" w:space="0" w:color="C4C7C5"/>
+            </w:tcBorders>
+            <w:tcMar>
+              <w:top w:w="120" w:type="dxa"/>
+              <w:left w:w="180" w:type="dxa"/>
+              <w:bottom w:w="120" w:type="dxa"/>
+              <w:right w:w="180" w:type="dxa"/>
+            </w:tcMar>
+            <w:vAlign w:val="center"/>
+            <w:hideMark/>
+          </w:tcPr>
+          <w:p>
+            <w:r>
+              <w:t xml:space="preserve">Links to the specific subject in the modules table. </w:t>
+            </w:r>
+            <w:r>
+              <w:rPr>
+                <w:b/>
+                <w:bCs/>
+              </w:rPr>
+              <w:t>Part of Composite PK.</w:t>
+            </w:r>
+          </w:p>
+        </w:tc>
+      </w:tr>
+      <w:tr>
+        <w:trPr>
+          <w:tblCellSpacing w:w="15" w:type="dxa"/>
+        </w:trPr>
+        <w:tc>
+          <w:tcPr>
+            <w:tcW w:w="0" w:type="auto"/>
+            <w:tcBorders>
+              <w:top w:val="single" w:sz="6" w:space="0" w:color="C4C7C5"/>
+              <w:left w:val="single" w:sz="6" w:space="0" w:color="C4C7C5"/>
+              <w:bottom w:val="single" w:sz="6" w:space="0" w:color="C4C7C5"/>
+              <w:right w:val="single" w:sz="6" w:space="0" w:color="C4C7C5"/>
+            </w:tcBorders>
+            <w:tcMar>
+              <w:top w:w="120" w:type="dxa"/>
+              <w:left w:w="180" w:type="dxa"/>
+              <w:bottom w:w="120" w:type="dxa"/>
+              <w:right w:w="180" w:type="dxa"/>
+            </w:tcMar>
+            <w:vAlign w:val="center"/>
+            <w:hideMark/>
+          </w:tcPr>
+          <w:p>
+            <w:proofErr w:type="spellStart"/>
+            <w:r>
+              <w:t>year_of_study</w:t>
+            </w:r>
+            <w:proofErr w:type="spellEnd"/>
+          </w:p>
+        </w:tc>
+        <w:tc>
+          <w:tcPr>
+            <w:tcW w:w="0" w:type="auto"/>
+            <w:tcBorders>
+              <w:top w:val="single" w:sz="6" w:space="0" w:color="C4C7C5"/>
+              <w:left w:val="single" w:sz="6" w:space="0" w:color="C4C7C5"/>
+              <w:bottom w:val="single" w:sz="6" w:space="0" w:color="C4C7C5"/>
+              <w:right w:val="single" w:sz="6" w:space="0" w:color="C4C7C5"/>
+            </w:tcBorders>
+            <w:tcMar>
+              <w:top w:w="120" w:type="dxa"/>
+              <w:left w:w="180" w:type="dxa"/>
+              <w:bottom w:w="120" w:type="dxa"/>
+              <w:right w:w="180" w:type="dxa"/>
+            </w:tcMar>
+            <w:vAlign w:val="center"/>
+            <w:hideMark/>
+          </w:tcPr>
+          <w:p>
+            <w:r>
+              <w:t>INT</w:t>
+            </w:r>
+          </w:p>
+        </w:tc>
+        <w:tc>
+          <w:tcPr>
+            <w:tcW w:w="0" w:type="auto"/>
+            <w:tcBorders>
+              <w:top w:val="single" w:sz="6" w:space="0" w:color="C4C7C5"/>
+              <w:left w:val="single" w:sz="6" w:space="0" w:color="C4C7C5"/>
+              <w:bottom w:val="single" w:sz="6" w:space="0" w:color="C4C7C5"/>
+              <w:right w:val="single" w:sz="6" w:space="0" w:color="C4C7C5"/>
+            </w:tcBorders>
+            <w:tcMar>
+              <w:top w:w="120" w:type="dxa"/>
+              <w:left w:w="180" w:type="dxa"/>
+              <w:bottom w:w="120" w:type="dxa"/>
+              <w:right w:w="180" w:type="dxa"/>
+            </w:tcMar>
+            <w:vAlign w:val="center"/>
+            <w:hideMark/>
+          </w:tcPr>
+          <w:p>
+            <w:r>
+              <w:t xml:space="preserve">Records which academic year this module belongs to (e.g., 1, 2, 3). </w:t>
+            </w:r>
+            <w:r>
+              <w:rPr>
+                <w:b/>
+                <w:bCs/>
+              </w:rPr>
+              <w:t>NOT NULL.</w:t>
+            </w:r>
+          </w:p>
+        </w:tc>
+      </w:tr>
+      <w:tr>
+        <w:trPr>
+          <w:tblCellSpacing w:w="15" w:type="dxa"/>
+        </w:trPr>
+        <w:tc>
+          <w:tcPr>
+            <w:tcW w:w="0" w:type="auto"/>
+            <w:tcBorders>
+              <w:top w:val="single" w:sz="6" w:space="0" w:color="C4C7C5"/>
+              <w:left w:val="single" w:sz="6" w:space="0" w:color="C4C7C5"/>
+              <w:bottom w:val="single" w:sz="6" w:space="0" w:color="C4C7C5"/>
+              <w:right w:val="single" w:sz="6" w:space="0" w:color="C4C7C5"/>
+            </w:tcBorders>
+            <w:tcMar>
+              <w:top w:w="120" w:type="dxa"/>
+              <w:left w:w="180" w:type="dxa"/>
+              <w:bottom w:w="120" w:type="dxa"/>
+              <w:right w:w="180" w:type="dxa"/>
+            </w:tcMar>
+            <w:vAlign w:val="center"/>
+            <w:hideMark/>
+          </w:tcPr>
+          <w:p>
+            <w:r>
+              <w:t>semester</w:t>
+            </w:r>
+          </w:p>
+        </w:tc>
+        <w:tc>
+          <w:tcPr>
+            <w:tcW w:w="0" w:type="auto"/>
+            <w:tcBorders>
+              <w:top w:val="single" w:sz="6" w:space="0" w:color="C4C7C5"/>
+              <w:left w:val="single" w:sz="6" w:space="0" w:color="C4C7C5"/>
+              <w:bottom w:val="single" w:sz="6" w:space="0" w:color="C4C7C5"/>
+              <w:right w:val="single" w:sz="6" w:space="0" w:color="C4C7C5"/>
+            </w:tcBorders>
+            <w:tcMar>
+              <w:top w:w="120" w:type="dxa"/>
+              <w:left w:w="180" w:type="dxa"/>
+              <w:bottom w:w="120" w:type="dxa"/>
+              <w:right w:w="180" w:type="dxa"/>
+            </w:tcMar>
+            <w:vAlign w:val="center"/>
+            <w:hideMark/>
+          </w:tcPr>
+          <w:p>
+            <w:proofErr w:type="gramStart"/>
+            <w:r>
+              <w:t>VARCHAR(</w:t>
+            </w:r>
+            <w:proofErr w:type="gramEnd"/>
+            <w:r>
+              <w:t>15)</w:t>
+            </w:r>
+          </w:p>
+        </w:tc>
+        <w:tc>
+          <w:tcPr>
+            <w:tcW w:w="0" w:type="auto"/>
+            <w:tcBorders>
+              <w:top w:val="single" w:sz="6" w:space="0" w:color="C4C7C5"/>
+              <w:left w:val="single" w:sz="6" w:space="0" w:color="C4C7C5"/>
+              <w:bottom w:val="single" w:sz="6" w:space="0" w:color="C4C7C5"/>
+              <w:right w:val="single" w:sz="6" w:space="0" w:color="C4C7C5"/>
+            </w:tcBorders>
+            <w:tcMar>
+              <w:top w:w="120" w:type="dxa"/>
+              <w:left w:w="180" w:type="dxa"/>
+              <w:bottom w:w="120" w:type="dxa"/>
+              <w:right w:w="180" w:type="dxa"/>
+            </w:tcMar>
+            <w:vAlign w:val="center"/>
+            <w:hideMark/>
+          </w:tcPr>
+          <w:p>
+            <w:r>
+              <w:t xml:space="preserve">Records when the module is taken (e.g., 'Semester 1', 'Semester 2', 'Year-Long'). </w:t>
+            </w:r>
+            <w:r>
+              <w:rPr>
+                <w:b/>
+                <w:bCs/>
+              </w:rPr>
+              <w:t>NOT NULL.</w:t>
             </w:r>
           </w:p>
         </w:tc>

</xml_diff>

<commit_message>
I have written the python code to add all the modules into my database using the csv files that I created through R
</commit_message>
<xml_diff>
--- a/DATABASE/Data dictionary/Database Tables.docx
+++ b/DATABASE/Data dictionary/Database Tables.docx
@@ -405,62 +405,67 @@
           </w:tcPr>
           <w:p>
             <w:r>
-              <w:t>credits</w:t>
-            </w:r>
-          </w:p>
-        </w:tc>
-        <w:tc>
-          <w:tcPr>
-            <w:tcW w:w="0" w:type="auto"/>
-            <w:tcBorders>
-              <w:top w:val="single" w:sz="6" w:space="0" w:color="C4C7C5"/>
-              <w:left w:val="single" w:sz="6" w:space="0" w:color="C4C7C5"/>
-              <w:bottom w:val="single" w:sz="6" w:space="0" w:color="C4C7C5"/>
-              <w:right w:val="single" w:sz="6" w:space="0" w:color="C4C7C5"/>
-            </w:tcBorders>
-            <w:tcMar>
-              <w:top w:w="120" w:type="dxa"/>
-              <w:left w:w="180" w:type="dxa"/>
-              <w:bottom w:w="120" w:type="dxa"/>
-              <w:right w:w="180" w:type="dxa"/>
-            </w:tcMar>
-            <w:vAlign w:val="center"/>
-            <w:hideMark/>
-          </w:tcPr>
-          <w:p>
-            <w:r>
-              <w:t>INT</w:t>
-            </w:r>
-          </w:p>
-        </w:tc>
-        <w:tc>
-          <w:tcPr>
-            <w:tcW w:w="0" w:type="auto"/>
-            <w:tcBorders>
-              <w:top w:val="single" w:sz="6" w:space="0" w:color="C4C7C5"/>
-              <w:left w:val="single" w:sz="6" w:space="0" w:color="C4C7C5"/>
-              <w:bottom w:val="single" w:sz="6" w:space="0" w:color="C4C7C5"/>
-              <w:right w:val="single" w:sz="6" w:space="0" w:color="C4C7C5"/>
-            </w:tcBorders>
-            <w:tcMar>
-              <w:top w:w="120" w:type="dxa"/>
-              <w:left w:w="180" w:type="dxa"/>
-              <w:bottom w:w="120" w:type="dxa"/>
-              <w:right w:w="180" w:type="dxa"/>
-            </w:tcMar>
-            <w:vAlign w:val="center"/>
-            <w:hideMark/>
-          </w:tcPr>
-          <w:p>
-            <w:r>
-              <w:t xml:space="preserve">Workload credit value. </w:t>
+              <w:t>prerequisites</w:t>
+            </w:r>
+          </w:p>
+        </w:tc>
+        <w:tc>
+          <w:tcPr>
+            <w:tcW w:w="0" w:type="auto"/>
+            <w:tcBorders>
+              <w:top w:val="single" w:sz="6" w:space="0" w:color="C4C7C5"/>
+              <w:left w:val="single" w:sz="6" w:space="0" w:color="C4C7C5"/>
+              <w:bottom w:val="single" w:sz="6" w:space="0" w:color="C4C7C5"/>
+              <w:right w:val="single" w:sz="6" w:space="0" w:color="C4C7C5"/>
+            </w:tcBorders>
+            <w:tcMar>
+              <w:top w:w="120" w:type="dxa"/>
+              <w:left w:w="180" w:type="dxa"/>
+              <w:bottom w:w="120" w:type="dxa"/>
+              <w:right w:w="180" w:type="dxa"/>
+            </w:tcMar>
+            <w:vAlign w:val="center"/>
+            <w:hideMark/>
+          </w:tcPr>
+          <w:p>
+            <w:proofErr w:type="gramStart"/>
+            <w:r>
+              <w:t>VARCHAR(</w:t>
+            </w:r>
+            <w:proofErr w:type="gramEnd"/>
+            <w:r>
+              <w:t>255)</w:t>
+            </w:r>
+          </w:p>
+        </w:tc>
+        <w:tc>
+          <w:tcPr>
+            <w:tcW w:w="0" w:type="auto"/>
+            <w:tcBorders>
+              <w:top w:val="single" w:sz="6" w:space="0" w:color="C4C7C5"/>
+              <w:left w:val="single" w:sz="6" w:space="0" w:color="C4C7C5"/>
+              <w:bottom w:val="single" w:sz="6" w:space="0" w:color="C4C7C5"/>
+              <w:right w:val="single" w:sz="6" w:space="0" w:color="C4C7C5"/>
+            </w:tcBorders>
+            <w:tcMar>
+              <w:top w:w="120" w:type="dxa"/>
+              <w:left w:w="180" w:type="dxa"/>
+              <w:bottom w:w="120" w:type="dxa"/>
+              <w:right w:w="180" w:type="dxa"/>
+            </w:tcMar>
+            <w:vAlign w:val="center"/>
+            <w:hideMark/>
+          </w:tcPr>
+          <w:p>
+            <w:r>
+              <w:t xml:space="preserve">Required prior modules. </w:t>
             </w:r>
             <w:r>
               <w:rPr>
                 <w:b/>
                 <w:bCs/>
               </w:rPr>
-              <w:t>Cannot be empty.</w:t>
+              <w:t>Defaults to 'None'</w:t>
             </w:r>
           </w:p>
         </w:tc>
@@ -489,7 +494,7 @@
           </w:tcPr>
           <w:p>
             <w:r>
-              <w:t>prerequisites</w:t>
+              <w:t>corequisites</w:t>
             </w:r>
           </w:p>
         </w:tc>
@@ -542,7 +547,7 @@
           </w:tcPr>
           <w:p>
             <w:r>
-              <w:t xml:space="preserve">Required prior modules. </w:t>
+              <w:t xml:space="preserve">Required parallel modules. </w:t>
             </w:r>
             <w:r>
               <w:rPr>
@@ -554,96 +559,9 @@
           </w:p>
         </w:tc>
       </w:tr>
-      <w:tr>
-        <w:trPr>
-          <w:tblCellSpacing w:w="15" w:type="dxa"/>
-        </w:trPr>
-        <w:tc>
-          <w:tcPr>
-            <w:tcW w:w="0" w:type="auto"/>
-            <w:tcBorders>
-              <w:top w:val="single" w:sz="6" w:space="0" w:color="C4C7C5"/>
-              <w:left w:val="single" w:sz="6" w:space="0" w:color="C4C7C5"/>
-              <w:bottom w:val="single" w:sz="6" w:space="0" w:color="C4C7C5"/>
-              <w:right w:val="single" w:sz="6" w:space="0" w:color="C4C7C5"/>
-            </w:tcBorders>
-            <w:tcMar>
-              <w:top w:w="120" w:type="dxa"/>
-              <w:left w:w="180" w:type="dxa"/>
-              <w:bottom w:w="120" w:type="dxa"/>
-              <w:right w:w="180" w:type="dxa"/>
-            </w:tcMar>
-            <w:vAlign w:val="center"/>
-            <w:hideMark/>
-          </w:tcPr>
-          <w:p>
-            <w:r>
-              <w:t>corequisites</w:t>
-            </w:r>
-          </w:p>
-        </w:tc>
-        <w:tc>
-          <w:tcPr>
-            <w:tcW w:w="0" w:type="auto"/>
-            <w:tcBorders>
-              <w:top w:val="single" w:sz="6" w:space="0" w:color="C4C7C5"/>
-              <w:left w:val="single" w:sz="6" w:space="0" w:color="C4C7C5"/>
-              <w:bottom w:val="single" w:sz="6" w:space="0" w:color="C4C7C5"/>
-              <w:right w:val="single" w:sz="6" w:space="0" w:color="C4C7C5"/>
-            </w:tcBorders>
-            <w:tcMar>
-              <w:top w:w="120" w:type="dxa"/>
-              <w:left w:w="180" w:type="dxa"/>
-              <w:bottom w:w="120" w:type="dxa"/>
-              <w:right w:w="180" w:type="dxa"/>
-            </w:tcMar>
-            <w:vAlign w:val="center"/>
-            <w:hideMark/>
-          </w:tcPr>
-          <w:p>
-            <w:proofErr w:type="gramStart"/>
-            <w:r>
-              <w:t>VARCHAR(</w:t>
-            </w:r>
-            <w:proofErr w:type="gramEnd"/>
-            <w:r>
-              <w:t>255)</w:t>
-            </w:r>
-          </w:p>
-        </w:tc>
-        <w:tc>
-          <w:tcPr>
-            <w:tcW w:w="0" w:type="auto"/>
-            <w:tcBorders>
-              <w:top w:val="single" w:sz="6" w:space="0" w:color="C4C7C5"/>
-              <w:left w:val="single" w:sz="6" w:space="0" w:color="C4C7C5"/>
-              <w:bottom w:val="single" w:sz="6" w:space="0" w:color="C4C7C5"/>
-              <w:right w:val="single" w:sz="6" w:space="0" w:color="C4C7C5"/>
-            </w:tcBorders>
-            <w:tcMar>
-              <w:top w:w="120" w:type="dxa"/>
-              <w:left w:w="180" w:type="dxa"/>
-              <w:bottom w:w="120" w:type="dxa"/>
-              <w:right w:w="180" w:type="dxa"/>
-            </w:tcMar>
-            <w:vAlign w:val="center"/>
-            <w:hideMark/>
-          </w:tcPr>
-          <w:p>
-            <w:r>
-              <w:t xml:space="preserve">Required parallel modules. </w:t>
-            </w:r>
-            <w:r>
-              <w:rPr>
-                <w:b/>
-                <w:bCs/>
-              </w:rPr>
-              <w:t>Defaults to 'None'</w:t>
-            </w:r>
-          </w:p>
-        </w:tc>
-      </w:tr>
     </w:tbl>
+    <w:p/>
+    <w:p/>
     <w:p/>
     <w:p/>
     <w:p/>
@@ -1145,9 +1063,9 @@
     <w:p/>
     <w:p/>
     <w:p/>
+    <w:p/>
     <w:p>
       <w:r>
-        <w:lastRenderedPageBreak/>
         <w:t xml:space="preserve">Table: </w:t>
       </w:r>
       <w:r>
@@ -1706,7 +1624,6 @@
     <w:p/>
     <w:p>
       <w:r>
-        <w:lastRenderedPageBreak/>
         <w:t xml:space="preserve">Table: </w:t>
       </w:r>
       <w:r>
@@ -2158,7 +2075,13 @@
           </w:tcPr>
           <w:p>
             <w:r>
-              <w:t xml:space="preserve">Shorthand title for easy display layouts (e.g., 'BSc (Applied Geology)'). </w:t>
+              <w:t>Shorthand title for easy display layouts (e.g., 'BSc Applied Geology</w:t>
+            </w:r>
+            <w:r>
+              <w:t xml:space="preserve"> 3211</w:t>
+            </w:r>
+            <w:r>
+              <w:t xml:space="preserve">'). </w:t>
             </w:r>
             <w:r>
               <w:rPr>
@@ -2356,7 +2279,6 @@
     <w:p/>
     <w:p>
       <w:r>
-        <w:lastRenderedPageBreak/>
         <w:t xml:space="preserve">Table: </w:t>
       </w:r>
       <w:proofErr w:type="spellStart"/>
@@ -3436,6 +3358,7 @@
   <w:style w:type="character" w:default="1" w:styleId="DefaultParagraphFont">
     <w:name w:val="Default Paragraph Font"/>
     <w:uiPriority w:val="1"/>
+    <w:semiHidden/>
     <w:unhideWhenUsed/>
   </w:style>
   <w:style w:type="table" w:default="1" w:styleId="TableNormal">

</xml_diff>

<commit_message>
I have made some adjustments to the [users] and [reviews] tables in order to improve the user experience. I have also created a document that I will use to guide me in the creating of my frontend
</commit_message>
<xml_diff>
--- a/DATABASE/Data dictionary/Database Tables.docx
+++ b/DATABASE/Data dictionary/Database Tables.docx
@@ -222,11 +222,9 @@
             <w:hideMark/>
           </w:tcPr>
           <w:p>
-            <w:proofErr w:type="spellStart"/>
             <w:r>
               <w:t>mod_code</w:t>
             </w:r>
-            <w:proofErr w:type="spellEnd"/>
           </w:p>
         </w:tc>
         <w:tc>
@@ -313,11 +311,9 @@
             <w:hideMark/>
           </w:tcPr>
           <w:p>
-            <w:proofErr w:type="spellStart"/>
             <w:r>
               <w:t>mod_name</w:t>
             </w:r>
-            <w:proofErr w:type="spellEnd"/>
           </w:p>
         </w:tc>
         <w:tc>
@@ -560,18 +556,6 @@
         </w:tc>
       </w:tr>
     </w:tbl>
-    <w:p/>
-    <w:p/>
-    <w:p/>
-    <w:p/>
-    <w:p/>
-    <w:p/>
-    <w:p/>
-    <w:p/>
-    <w:p/>
-    <w:p/>
-    <w:p/>
-    <w:p/>
     <w:p/>
     <w:p/>
     <w:p>
@@ -582,7 +566,6 @@
         </w:rPr>
       </w:pPr>
       <w:r>
-        <w:lastRenderedPageBreak/>
         <w:t xml:space="preserve">Table name: </w:t>
       </w:r>
       <w:r>
@@ -798,11 +781,9 @@
             <w:hideMark/>
           </w:tcPr>
           <w:p>
-            <w:proofErr w:type="spellStart"/>
             <w:r>
               <w:t>fac_name</w:t>
             </w:r>
-            <w:proofErr w:type="spellEnd"/>
           </w:p>
         </w:tc>
         <w:tc>
@@ -889,11 +870,9 @@
             <w:hideMark/>
           </w:tcPr>
           <w:p>
-            <w:proofErr w:type="spellStart"/>
             <w:r>
               <w:t>is_available</w:t>
             </w:r>
-            <w:proofErr w:type="spellEnd"/>
           </w:p>
         </w:tc>
         <w:tc>
@@ -978,11 +957,9 @@
             <w:hideMark/>
           </w:tcPr>
           <w:p>
-            <w:proofErr w:type="spellStart"/>
             <w:r>
               <w:t>icon_name</w:t>
             </w:r>
-            <w:proofErr w:type="spellEnd"/>
           </w:p>
         </w:tc>
         <w:tc>
@@ -1047,25 +1024,9 @@
         </w:tc>
       </w:tr>
     </w:tbl>
-    <w:p/>
-    <w:p/>
-    <w:p/>
-    <w:p/>
-    <w:p/>
-    <w:p/>
-    <w:p/>
-    <w:p/>
-    <w:p/>
-    <w:p/>
-    <w:p/>
-    <w:p/>
-    <w:p/>
-    <w:p/>
-    <w:p/>
-    <w:p/>
-    <w:p/>
     <w:p>
       <w:r>
+        <w:lastRenderedPageBreak/>
         <w:t xml:space="preserve">Table: </w:t>
       </w:r>
       <w:r>
@@ -1078,6 +1039,8 @@
     </w:p>
     <w:tbl>
       <w:tblPr>
+        <w:tblpPr w:leftFromText="180" w:rightFromText="180" w:vertAnchor="text" w:tblpY="1"/>
+        <w:tblOverlap w:val="never"/>
         <w:tblW w:w="0" w:type="auto"/>
         <w:tblCellSpacing w:w="15" w:type="dxa"/>
         <w:tblCellMar>
@@ -1087,9 +1050,9 @@
         <w:tblLook w:val="04A0" w:firstRow="1" w:lastRow="0" w:firstColumn="1" w:lastColumn="0" w:noHBand="0" w:noVBand="1"/>
       </w:tblPr>
       <w:tblGrid>
-        <w:gridCol w:w="1759"/>
+        <w:gridCol w:w="2209"/>
         <w:gridCol w:w="1984"/>
-        <w:gridCol w:w="5267"/>
+        <w:gridCol w:w="4817"/>
       </w:tblGrid>
       <w:tr>
         <w:trPr>
@@ -1120,63 +1083,63 @@
                 <w:b/>
                 <w:bCs/>
               </w:rPr>
-              <w:t>Column Name</w:t>
-            </w:r>
-          </w:p>
-        </w:tc>
-        <w:tc>
-          <w:tcPr>
-            <w:tcW w:w="0" w:type="auto"/>
-            <w:tcBorders>
-              <w:top w:val="single" w:sz="6" w:space="0" w:color="C4C7C5"/>
-              <w:left w:val="single" w:sz="6" w:space="0" w:color="C4C7C5"/>
-              <w:bottom w:val="single" w:sz="6" w:space="0" w:color="C4C7C5"/>
-              <w:right w:val="single" w:sz="6" w:space="0" w:color="C4C7C5"/>
-            </w:tcBorders>
-            <w:tcMar>
-              <w:top w:w="120" w:type="dxa"/>
-              <w:left w:w="180" w:type="dxa"/>
-              <w:bottom w:w="120" w:type="dxa"/>
-              <w:right w:w="180" w:type="dxa"/>
-            </w:tcMar>
-            <w:vAlign w:val="center"/>
-            <w:hideMark/>
-          </w:tcPr>
-          <w:p>
-            <w:r>
-              <w:rPr>
-                <w:b/>
-                <w:bCs/>
-              </w:rPr>
-              <w:t>Type</w:t>
-            </w:r>
-          </w:p>
-        </w:tc>
-        <w:tc>
-          <w:tcPr>
-            <w:tcW w:w="0" w:type="auto"/>
-            <w:tcBorders>
-              <w:top w:val="single" w:sz="6" w:space="0" w:color="C4C7C5"/>
-              <w:left w:val="single" w:sz="6" w:space="0" w:color="C4C7C5"/>
-              <w:bottom w:val="single" w:sz="6" w:space="0" w:color="C4C7C5"/>
-              <w:right w:val="single" w:sz="6" w:space="0" w:color="C4C7C5"/>
-            </w:tcBorders>
-            <w:tcMar>
-              <w:top w:w="120" w:type="dxa"/>
-              <w:left w:w="180" w:type="dxa"/>
-              <w:bottom w:w="120" w:type="dxa"/>
-              <w:right w:w="180" w:type="dxa"/>
-            </w:tcMar>
-            <w:vAlign w:val="center"/>
-            <w:hideMark/>
-          </w:tcPr>
-          <w:p>
-            <w:r>
-              <w:rPr>
-                <w:b/>
-                <w:bCs/>
-              </w:rPr>
-              <w:t>Purpose</w:t>
+              <w:t>Field Name</w:t>
+            </w:r>
+          </w:p>
+        </w:tc>
+        <w:tc>
+          <w:tcPr>
+            <w:tcW w:w="0" w:type="auto"/>
+            <w:tcBorders>
+              <w:top w:val="single" w:sz="6" w:space="0" w:color="C4C7C5"/>
+              <w:left w:val="single" w:sz="6" w:space="0" w:color="C4C7C5"/>
+              <w:bottom w:val="single" w:sz="6" w:space="0" w:color="C4C7C5"/>
+              <w:right w:val="single" w:sz="6" w:space="0" w:color="C4C7C5"/>
+            </w:tcBorders>
+            <w:tcMar>
+              <w:top w:w="120" w:type="dxa"/>
+              <w:left w:w="180" w:type="dxa"/>
+              <w:bottom w:w="120" w:type="dxa"/>
+              <w:right w:w="180" w:type="dxa"/>
+            </w:tcMar>
+            <w:vAlign w:val="center"/>
+            <w:hideMark/>
+          </w:tcPr>
+          <w:p>
+            <w:r>
+              <w:rPr>
+                <w:b/>
+                <w:bCs/>
+              </w:rPr>
+              <w:t>Data Type</w:t>
+            </w:r>
+          </w:p>
+        </w:tc>
+        <w:tc>
+          <w:tcPr>
+            <w:tcW w:w="0" w:type="auto"/>
+            <w:tcBorders>
+              <w:top w:val="single" w:sz="6" w:space="0" w:color="C4C7C5"/>
+              <w:left w:val="single" w:sz="6" w:space="0" w:color="C4C7C5"/>
+              <w:bottom w:val="single" w:sz="6" w:space="0" w:color="C4C7C5"/>
+              <w:right w:val="single" w:sz="6" w:space="0" w:color="C4C7C5"/>
+            </w:tcBorders>
+            <w:tcMar>
+              <w:top w:w="120" w:type="dxa"/>
+              <w:left w:w="180" w:type="dxa"/>
+              <w:bottom w:w="120" w:type="dxa"/>
+              <w:right w:w="180" w:type="dxa"/>
+            </w:tcMar>
+            <w:vAlign w:val="center"/>
+            <w:hideMark/>
+          </w:tcPr>
+          <w:p>
+            <w:r>
+              <w:rPr>
+                <w:b/>
+                <w:bCs/>
+              </w:rPr>
+              <w:t>Description</w:t>
             </w:r>
           </w:p>
         </w:tc>
@@ -1205,6 +1168,10 @@
           </w:tcPr>
           <w:p>
             <w:r>
+              <w:rPr>
+                <w:b/>
+                <w:bCs/>
+              </w:rPr>
               <w:t>id</w:t>
             </w:r>
           </w:p>
@@ -1229,31 +1196,31 @@
           </w:tcPr>
           <w:p>
             <w:r>
-              <w:t>INT (PK)</w:t>
-            </w:r>
-          </w:p>
-        </w:tc>
-        <w:tc>
-          <w:tcPr>
-            <w:tcW w:w="0" w:type="auto"/>
-            <w:tcBorders>
-              <w:top w:val="single" w:sz="6" w:space="0" w:color="C4C7C5"/>
-              <w:left w:val="single" w:sz="6" w:space="0" w:color="C4C7C5"/>
-              <w:bottom w:val="single" w:sz="6" w:space="0" w:color="C4C7C5"/>
-              <w:right w:val="single" w:sz="6" w:space="0" w:color="C4C7C5"/>
-            </w:tcBorders>
-            <w:tcMar>
-              <w:top w:w="120" w:type="dxa"/>
-              <w:left w:w="180" w:type="dxa"/>
-              <w:bottom w:w="120" w:type="dxa"/>
-              <w:right w:w="180" w:type="dxa"/>
-            </w:tcMar>
-            <w:vAlign w:val="center"/>
-            <w:hideMark/>
-          </w:tcPr>
-          <w:p>
-            <w:r>
-              <w:t>Internal unique ID (Auto Incremented)</w:t>
+              <w:t>INT</w:t>
+            </w:r>
+          </w:p>
+        </w:tc>
+        <w:tc>
+          <w:tcPr>
+            <w:tcW w:w="0" w:type="auto"/>
+            <w:tcBorders>
+              <w:top w:val="single" w:sz="6" w:space="0" w:color="C4C7C5"/>
+              <w:left w:val="single" w:sz="6" w:space="0" w:color="C4C7C5"/>
+              <w:bottom w:val="single" w:sz="6" w:space="0" w:color="C4C7C5"/>
+              <w:right w:val="single" w:sz="6" w:space="0" w:color="C4C7C5"/>
+            </w:tcBorders>
+            <w:tcMar>
+              <w:top w:w="120" w:type="dxa"/>
+              <w:left w:w="180" w:type="dxa"/>
+              <w:bottom w:w="120" w:type="dxa"/>
+              <w:right w:w="180" w:type="dxa"/>
+            </w:tcMar>
+            <w:vAlign w:val="center"/>
+            <w:hideMark/>
+          </w:tcPr>
+          <w:p>
+            <w:r>
+              <w:t>Primary Key, auto-incremented unique identifier for the user.</w:t>
             </w:r>
           </w:p>
         </w:tc>
@@ -1282,6 +1249,10 @@
           </w:tcPr>
           <w:p>
             <w:r>
+              <w:rPr>
+                <w:b/>
+                <w:bCs/>
+              </w:rPr>
               <w:t>username</w:t>
             </w:r>
           </w:p>
@@ -1335,14 +1306,7 @@
           </w:tcPr>
           <w:p>
             <w:r>
-              <w:t xml:space="preserve">Unique student handle. </w:t>
-            </w:r>
-            <w:r>
-              <w:rPr>
-                <w:b/>
-                <w:bCs/>
-              </w:rPr>
-              <w:t>UNIQUE and NOT NULL.</w:t>
+              <w:t>Unique display name chosen by the user.</w:t>
             </w:r>
           </w:p>
         </w:tc>
@@ -1371,7 +1335,11 @@
           </w:tcPr>
           <w:p>
             <w:r>
-              <w:t>email</w:t>
+              <w:rPr>
+                <w:b/>
+                <w:bCs/>
+              </w:rPr>
+              <w:t>student_email</w:t>
             </w:r>
           </w:p>
         </w:tc>
@@ -1400,38 +1368,31 @@
             </w:r>
             <w:proofErr w:type="gramEnd"/>
             <w:r>
-              <w:t>50)</w:t>
-            </w:r>
-          </w:p>
-        </w:tc>
-        <w:tc>
-          <w:tcPr>
-            <w:tcW w:w="0" w:type="auto"/>
-            <w:tcBorders>
-              <w:top w:val="single" w:sz="6" w:space="0" w:color="C4C7C5"/>
-              <w:left w:val="single" w:sz="6" w:space="0" w:color="C4C7C5"/>
-              <w:bottom w:val="single" w:sz="6" w:space="0" w:color="C4C7C5"/>
-              <w:right w:val="single" w:sz="6" w:space="0" w:color="C4C7C5"/>
-            </w:tcBorders>
-            <w:tcMar>
-              <w:top w:w="120" w:type="dxa"/>
-              <w:left w:w="180" w:type="dxa"/>
-              <w:bottom w:w="120" w:type="dxa"/>
-              <w:right w:w="180" w:type="dxa"/>
-            </w:tcMar>
-            <w:vAlign w:val="center"/>
-            <w:hideMark/>
-          </w:tcPr>
-          <w:p>
-            <w:r>
-              <w:t xml:space="preserve">UWC student email (4492340@uwc.ac.za). </w:t>
-            </w:r>
-            <w:r>
-              <w:rPr>
-                <w:b/>
-                <w:bCs/>
-              </w:rPr>
-              <w:t>UNIQUE and NOT NULL.</w:t>
+              <w:t>100)</w:t>
+            </w:r>
+          </w:p>
+        </w:tc>
+        <w:tc>
+          <w:tcPr>
+            <w:tcW w:w="0" w:type="auto"/>
+            <w:tcBorders>
+              <w:top w:val="single" w:sz="6" w:space="0" w:color="C4C7C5"/>
+              <w:left w:val="single" w:sz="6" w:space="0" w:color="C4C7C5"/>
+              <w:bottom w:val="single" w:sz="6" w:space="0" w:color="C4C7C5"/>
+              <w:right w:val="single" w:sz="6" w:space="0" w:color="C4C7C5"/>
+            </w:tcBorders>
+            <w:tcMar>
+              <w:top w:w="120" w:type="dxa"/>
+              <w:left w:w="180" w:type="dxa"/>
+              <w:bottom w:w="120" w:type="dxa"/>
+              <w:right w:w="180" w:type="dxa"/>
+            </w:tcMar>
+            <w:vAlign w:val="center"/>
+            <w:hideMark/>
+          </w:tcPr>
+          <w:p>
+            <w:r>
+              <w:t>Unique university email used for registration and verification.</w:t>
             </w:r>
           </w:p>
         </w:tc>
@@ -1460,6 +1421,10 @@
           </w:tcPr>
           <w:p>
             <w:r>
+              <w:rPr>
+                <w:b/>
+                <w:bCs/>
+              </w:rPr>
               <w:t>password</w:t>
             </w:r>
           </w:p>
@@ -1513,14 +1478,7 @@
           </w:tcPr>
           <w:p>
             <w:r>
-              <w:t xml:space="preserve">Encrypted password string. </w:t>
-            </w:r>
-            <w:r>
-              <w:rPr>
-                <w:b/>
-                <w:bCs/>
-              </w:rPr>
-              <w:t>NOT NULL.</w:t>
+              <w:t>Hashed password for secure authentication.</w:t>
             </w:r>
           </w:p>
         </w:tc>
@@ -1549,6 +1507,10 @@
           </w:tcPr>
           <w:p>
             <w:r>
+              <w:rPr>
+                <w:b/>
+                <w:bCs/>
+              </w:rPr>
               <w:t>role</w:t>
             </w:r>
           </w:p>
@@ -1602,7 +1564,349 @@
           </w:tcPr>
           <w:p>
             <w:r>
-              <w:t>Set to 'ROLE_STUDENT' or 'ROLE_ADMIN' for Spring Security limits.</w:t>
+              <w:t>User's access level (defaults to student).</w:t>
+            </w:r>
+          </w:p>
+        </w:tc>
+      </w:tr>
+      <w:tr>
+        <w:trPr>
+          <w:tblCellSpacing w:w="15" w:type="dxa"/>
+        </w:trPr>
+        <w:tc>
+          <w:tcPr>
+            <w:tcW w:w="0" w:type="auto"/>
+            <w:tcBorders>
+              <w:top w:val="single" w:sz="6" w:space="0" w:color="C4C7C5"/>
+              <w:left w:val="single" w:sz="6" w:space="0" w:color="C4C7C5"/>
+              <w:bottom w:val="single" w:sz="6" w:space="0" w:color="C4C7C5"/>
+              <w:right w:val="single" w:sz="6" w:space="0" w:color="C4C7C5"/>
+            </w:tcBorders>
+            <w:tcMar>
+              <w:top w:w="120" w:type="dxa"/>
+              <w:left w:w="180" w:type="dxa"/>
+              <w:bottom w:w="120" w:type="dxa"/>
+              <w:right w:w="180" w:type="dxa"/>
+            </w:tcMar>
+            <w:vAlign w:val="center"/>
+            <w:hideMark/>
+          </w:tcPr>
+          <w:p>
+            <w:r>
+              <w:rPr>
+                <w:b/>
+                <w:bCs/>
+              </w:rPr>
+              <w:t>degree_program</w:t>
+            </w:r>
+          </w:p>
+        </w:tc>
+        <w:tc>
+          <w:tcPr>
+            <w:tcW w:w="0" w:type="auto"/>
+            <w:tcBorders>
+              <w:top w:val="single" w:sz="6" w:space="0" w:color="C4C7C5"/>
+              <w:left w:val="single" w:sz="6" w:space="0" w:color="C4C7C5"/>
+              <w:bottom w:val="single" w:sz="6" w:space="0" w:color="C4C7C5"/>
+              <w:right w:val="single" w:sz="6" w:space="0" w:color="C4C7C5"/>
+            </w:tcBorders>
+            <w:tcMar>
+              <w:top w:w="120" w:type="dxa"/>
+              <w:left w:w="180" w:type="dxa"/>
+              <w:bottom w:w="120" w:type="dxa"/>
+              <w:right w:w="180" w:type="dxa"/>
+            </w:tcMar>
+            <w:vAlign w:val="center"/>
+            <w:hideMark/>
+          </w:tcPr>
+          <w:p>
+            <w:proofErr w:type="gramStart"/>
+            <w:r>
+              <w:t>VARCHAR(</w:t>
+            </w:r>
+            <w:proofErr w:type="gramEnd"/>
+            <w:r>
+              <w:t>100)</w:t>
+            </w:r>
+          </w:p>
+        </w:tc>
+        <w:tc>
+          <w:tcPr>
+            <w:tcW w:w="0" w:type="auto"/>
+            <w:tcBorders>
+              <w:top w:val="single" w:sz="6" w:space="0" w:color="C4C7C5"/>
+              <w:left w:val="single" w:sz="6" w:space="0" w:color="C4C7C5"/>
+              <w:bottom w:val="single" w:sz="6" w:space="0" w:color="C4C7C5"/>
+              <w:right w:val="single" w:sz="6" w:space="0" w:color="C4C7C5"/>
+            </w:tcBorders>
+            <w:tcMar>
+              <w:top w:w="120" w:type="dxa"/>
+              <w:left w:w="180" w:type="dxa"/>
+              <w:bottom w:w="120" w:type="dxa"/>
+              <w:right w:w="180" w:type="dxa"/>
+            </w:tcMar>
+            <w:vAlign w:val="center"/>
+            <w:hideMark/>
+          </w:tcPr>
+          <w:p>
+            <w:r>
+              <w:t>The degree or major the student is currently pursuing.</w:t>
+            </w:r>
+          </w:p>
+        </w:tc>
+      </w:tr>
+      <w:tr>
+        <w:trPr>
+          <w:tblCellSpacing w:w="15" w:type="dxa"/>
+        </w:trPr>
+        <w:tc>
+          <w:tcPr>
+            <w:tcW w:w="0" w:type="auto"/>
+            <w:tcBorders>
+              <w:top w:val="single" w:sz="6" w:space="0" w:color="C4C7C5"/>
+              <w:left w:val="single" w:sz="6" w:space="0" w:color="C4C7C5"/>
+              <w:bottom w:val="single" w:sz="6" w:space="0" w:color="C4C7C5"/>
+              <w:right w:val="single" w:sz="6" w:space="0" w:color="C4C7C5"/>
+            </w:tcBorders>
+            <w:tcMar>
+              <w:top w:w="120" w:type="dxa"/>
+              <w:left w:w="180" w:type="dxa"/>
+              <w:bottom w:w="120" w:type="dxa"/>
+              <w:right w:w="180" w:type="dxa"/>
+            </w:tcMar>
+            <w:vAlign w:val="center"/>
+            <w:hideMark/>
+          </w:tcPr>
+          <w:p>
+            <w:r>
+              <w:rPr>
+                <w:b/>
+                <w:bCs/>
+              </w:rPr>
+              <w:t>year_of_study</w:t>
+            </w:r>
+          </w:p>
+        </w:tc>
+        <w:tc>
+          <w:tcPr>
+            <w:tcW w:w="0" w:type="auto"/>
+            <w:tcBorders>
+              <w:top w:val="single" w:sz="6" w:space="0" w:color="C4C7C5"/>
+              <w:left w:val="single" w:sz="6" w:space="0" w:color="C4C7C5"/>
+              <w:bottom w:val="single" w:sz="6" w:space="0" w:color="C4C7C5"/>
+              <w:right w:val="single" w:sz="6" w:space="0" w:color="C4C7C5"/>
+            </w:tcBorders>
+            <w:tcMar>
+              <w:top w:w="120" w:type="dxa"/>
+              <w:left w:w="180" w:type="dxa"/>
+              <w:bottom w:w="120" w:type="dxa"/>
+              <w:right w:w="180" w:type="dxa"/>
+            </w:tcMar>
+            <w:vAlign w:val="center"/>
+            <w:hideMark/>
+          </w:tcPr>
+          <w:p>
+            <w:proofErr w:type="gramStart"/>
+            <w:r>
+              <w:t>VARCHAR(</w:t>
+            </w:r>
+            <w:proofErr w:type="gramEnd"/>
+            <w:r>
+              <w:t>20)</w:t>
+            </w:r>
+          </w:p>
+        </w:tc>
+        <w:tc>
+          <w:tcPr>
+            <w:tcW w:w="0" w:type="auto"/>
+            <w:tcBorders>
+              <w:top w:val="single" w:sz="6" w:space="0" w:color="C4C7C5"/>
+              <w:left w:val="single" w:sz="6" w:space="0" w:color="C4C7C5"/>
+              <w:bottom w:val="single" w:sz="6" w:space="0" w:color="C4C7C5"/>
+              <w:right w:val="single" w:sz="6" w:space="0" w:color="C4C7C5"/>
+            </w:tcBorders>
+            <w:tcMar>
+              <w:top w:w="120" w:type="dxa"/>
+              <w:left w:w="180" w:type="dxa"/>
+              <w:bottom w:w="120" w:type="dxa"/>
+              <w:right w:w="180" w:type="dxa"/>
+            </w:tcMar>
+            <w:vAlign w:val="center"/>
+            <w:hideMark/>
+          </w:tcPr>
+          <w:p>
+            <w:r>
+              <w:t>The student's current academic year.</w:t>
+            </w:r>
+          </w:p>
+        </w:tc>
+      </w:tr>
+      <w:tr>
+        <w:trPr>
+          <w:tblCellSpacing w:w="15" w:type="dxa"/>
+        </w:trPr>
+        <w:tc>
+          <w:tcPr>
+            <w:tcW w:w="0" w:type="auto"/>
+            <w:tcBorders>
+              <w:top w:val="single" w:sz="6" w:space="0" w:color="C4C7C5"/>
+              <w:left w:val="single" w:sz="6" w:space="0" w:color="C4C7C5"/>
+              <w:bottom w:val="single" w:sz="6" w:space="0" w:color="C4C7C5"/>
+              <w:right w:val="single" w:sz="6" w:space="0" w:color="C4C7C5"/>
+            </w:tcBorders>
+            <w:tcMar>
+              <w:top w:w="120" w:type="dxa"/>
+              <w:left w:w="180" w:type="dxa"/>
+              <w:bottom w:w="120" w:type="dxa"/>
+              <w:right w:w="180" w:type="dxa"/>
+            </w:tcMar>
+            <w:vAlign w:val="center"/>
+            <w:hideMark/>
+          </w:tcPr>
+          <w:p>
+            <w:r>
+              <w:rPr>
+                <w:b/>
+                <w:bCs/>
+              </w:rPr>
+              <w:t>helpful_votes</w:t>
+            </w:r>
+          </w:p>
+        </w:tc>
+        <w:tc>
+          <w:tcPr>
+            <w:tcW w:w="0" w:type="auto"/>
+            <w:tcBorders>
+              <w:top w:val="single" w:sz="6" w:space="0" w:color="C4C7C5"/>
+              <w:left w:val="single" w:sz="6" w:space="0" w:color="C4C7C5"/>
+              <w:bottom w:val="single" w:sz="6" w:space="0" w:color="C4C7C5"/>
+              <w:right w:val="single" w:sz="6" w:space="0" w:color="C4C7C5"/>
+            </w:tcBorders>
+            <w:tcMar>
+              <w:top w:w="120" w:type="dxa"/>
+              <w:left w:w="180" w:type="dxa"/>
+              <w:bottom w:w="120" w:type="dxa"/>
+              <w:right w:w="180" w:type="dxa"/>
+            </w:tcMar>
+            <w:vAlign w:val="center"/>
+            <w:hideMark/>
+          </w:tcPr>
+          <w:p>
+            <w:r>
+              <w:t>INT</w:t>
+            </w:r>
+          </w:p>
+        </w:tc>
+        <w:tc>
+          <w:tcPr>
+            <w:tcW w:w="0" w:type="auto"/>
+            <w:tcBorders>
+              <w:top w:val="single" w:sz="6" w:space="0" w:color="C4C7C5"/>
+              <w:left w:val="single" w:sz="6" w:space="0" w:color="C4C7C5"/>
+              <w:bottom w:val="single" w:sz="6" w:space="0" w:color="C4C7C5"/>
+              <w:right w:val="single" w:sz="6" w:space="0" w:color="C4C7C5"/>
+            </w:tcBorders>
+            <w:tcMar>
+              <w:top w:w="120" w:type="dxa"/>
+              <w:left w:w="180" w:type="dxa"/>
+              <w:bottom w:w="120" w:type="dxa"/>
+              <w:right w:w="180" w:type="dxa"/>
+            </w:tcMar>
+            <w:vAlign w:val="center"/>
+            <w:hideMark/>
+          </w:tcPr>
+          <w:p>
+            <w:r>
+              <w:t xml:space="preserve">Total number of "Useful" upvotes received across </w:t>
+            </w:r>
+            <w:proofErr w:type="gramStart"/>
+            <w:r>
+              <w:t>all of</w:t>
+            </w:r>
+            <w:proofErr w:type="gramEnd"/>
+            <w:r>
+              <w:t xml:space="preserve"> their reviews.</w:t>
+            </w:r>
+          </w:p>
+        </w:tc>
+      </w:tr>
+      <w:tr>
+        <w:trPr>
+          <w:tblCellSpacing w:w="15" w:type="dxa"/>
+        </w:trPr>
+        <w:tc>
+          <w:tcPr>
+            <w:tcW w:w="0" w:type="auto"/>
+            <w:tcBorders>
+              <w:top w:val="single" w:sz="6" w:space="0" w:color="C4C7C5"/>
+              <w:left w:val="single" w:sz="6" w:space="0" w:color="C4C7C5"/>
+              <w:bottom w:val="single" w:sz="6" w:space="0" w:color="C4C7C5"/>
+              <w:right w:val="single" w:sz="6" w:space="0" w:color="C4C7C5"/>
+            </w:tcBorders>
+            <w:tcMar>
+              <w:top w:w="120" w:type="dxa"/>
+              <w:left w:w="180" w:type="dxa"/>
+              <w:bottom w:w="120" w:type="dxa"/>
+              <w:right w:w="180" w:type="dxa"/>
+            </w:tcMar>
+            <w:vAlign w:val="center"/>
+            <w:hideMark/>
+          </w:tcPr>
+          <w:p>
+            <w:r>
+              <w:rPr>
+                <w:b/>
+                <w:bCs/>
+              </w:rPr>
+              <w:t>created_at</w:t>
+            </w:r>
+          </w:p>
+        </w:tc>
+        <w:tc>
+          <w:tcPr>
+            <w:tcW w:w="0" w:type="auto"/>
+            <w:tcBorders>
+              <w:top w:val="single" w:sz="6" w:space="0" w:color="C4C7C5"/>
+              <w:left w:val="single" w:sz="6" w:space="0" w:color="C4C7C5"/>
+              <w:bottom w:val="single" w:sz="6" w:space="0" w:color="C4C7C5"/>
+              <w:right w:val="single" w:sz="6" w:space="0" w:color="C4C7C5"/>
+            </w:tcBorders>
+            <w:tcMar>
+              <w:top w:w="120" w:type="dxa"/>
+              <w:left w:w="180" w:type="dxa"/>
+              <w:bottom w:w="120" w:type="dxa"/>
+              <w:right w:w="180" w:type="dxa"/>
+            </w:tcMar>
+            <w:vAlign w:val="center"/>
+            <w:hideMark/>
+          </w:tcPr>
+          <w:p>
+            <w:r>
+              <w:t>TIMESTAMP</w:t>
+            </w:r>
+          </w:p>
+        </w:tc>
+        <w:tc>
+          <w:tcPr>
+            <w:tcW w:w="0" w:type="auto"/>
+            <w:tcBorders>
+              <w:top w:val="single" w:sz="6" w:space="0" w:color="C4C7C5"/>
+              <w:left w:val="single" w:sz="6" w:space="0" w:color="C4C7C5"/>
+              <w:bottom w:val="single" w:sz="6" w:space="0" w:color="C4C7C5"/>
+              <w:right w:val="single" w:sz="6" w:space="0" w:color="C4C7C5"/>
+            </w:tcBorders>
+            <w:tcMar>
+              <w:top w:w="120" w:type="dxa"/>
+              <w:left w:w="180" w:type="dxa"/>
+              <w:bottom w:w="120" w:type="dxa"/>
+              <w:right w:w="180" w:type="dxa"/>
+            </w:tcMar>
+            <w:vAlign w:val="center"/>
+            <w:hideMark/>
+          </w:tcPr>
+          <w:p>
+            <w:r>
+              <w:t>The date and time the account was created.</w:t>
             </w:r>
           </w:p>
         </w:tc>
@@ -1615,15 +1919,1109 @@
     <w:p/>
     <w:p/>
     <w:p/>
-    <w:p/>
-    <w:p/>
-    <w:p/>
-    <w:p/>
-    <w:p/>
-    <w:p/>
-    <w:p/>
+    <w:tbl>
+      <w:tblPr>
+        <w:tblpPr w:leftFromText="180" w:rightFromText="180" w:vertAnchor="page" w:horzAnchor="margin" w:tblpY="1895"/>
+        <w:tblW w:w="0" w:type="auto"/>
+        <w:tblCellSpacing w:w="15" w:type="dxa"/>
+        <w:tblCellMar>
+          <w:left w:w="0" w:type="dxa"/>
+          <w:right w:w="0" w:type="dxa"/>
+        </w:tblCellMar>
+        <w:tblLook w:val="04A0" w:firstRow="1" w:lastRow="0" w:firstColumn="1" w:lastColumn="0" w:noHBand="0" w:noVBand="1"/>
+      </w:tblPr>
+      <w:tblGrid>
+        <w:gridCol w:w="2144"/>
+        <w:gridCol w:w="1626"/>
+        <w:gridCol w:w="5240"/>
+      </w:tblGrid>
+      <w:tr>
+        <w:trPr>
+          <w:tblHeader/>
+          <w:tblCellSpacing w:w="15" w:type="dxa"/>
+        </w:trPr>
+        <w:tc>
+          <w:tcPr>
+            <w:tcW w:w="0" w:type="auto"/>
+            <w:tcBorders>
+              <w:top w:val="single" w:sz="6" w:space="0" w:color="C4C7C5"/>
+              <w:left w:val="single" w:sz="6" w:space="0" w:color="C4C7C5"/>
+              <w:bottom w:val="single" w:sz="6" w:space="0" w:color="C4C7C5"/>
+              <w:right w:val="single" w:sz="6" w:space="0" w:color="C4C7C5"/>
+            </w:tcBorders>
+            <w:tcMar>
+              <w:top w:w="120" w:type="dxa"/>
+              <w:left w:w="180" w:type="dxa"/>
+              <w:bottom w:w="120" w:type="dxa"/>
+              <w:right w:w="180" w:type="dxa"/>
+            </w:tcMar>
+            <w:vAlign w:val="center"/>
+            <w:hideMark/>
+          </w:tcPr>
+          <w:p>
+            <w:r>
+              <w:rPr>
+                <w:b/>
+                <w:bCs/>
+              </w:rPr>
+              <w:lastRenderedPageBreak/>
+              <w:t>Field Name</w:t>
+            </w:r>
+          </w:p>
+        </w:tc>
+        <w:tc>
+          <w:tcPr>
+            <w:tcW w:w="0" w:type="auto"/>
+            <w:tcBorders>
+              <w:top w:val="single" w:sz="6" w:space="0" w:color="C4C7C5"/>
+              <w:left w:val="single" w:sz="6" w:space="0" w:color="C4C7C5"/>
+              <w:bottom w:val="single" w:sz="6" w:space="0" w:color="C4C7C5"/>
+              <w:right w:val="single" w:sz="6" w:space="0" w:color="C4C7C5"/>
+            </w:tcBorders>
+            <w:tcMar>
+              <w:top w:w="120" w:type="dxa"/>
+              <w:left w:w="180" w:type="dxa"/>
+              <w:bottom w:w="120" w:type="dxa"/>
+              <w:right w:w="180" w:type="dxa"/>
+            </w:tcMar>
+            <w:vAlign w:val="center"/>
+            <w:hideMark/>
+          </w:tcPr>
+          <w:p>
+            <w:r>
+              <w:rPr>
+                <w:b/>
+                <w:bCs/>
+              </w:rPr>
+              <w:t>Data Type</w:t>
+            </w:r>
+          </w:p>
+        </w:tc>
+        <w:tc>
+          <w:tcPr>
+            <w:tcW w:w="0" w:type="auto"/>
+            <w:tcBorders>
+              <w:top w:val="single" w:sz="6" w:space="0" w:color="C4C7C5"/>
+              <w:left w:val="single" w:sz="6" w:space="0" w:color="C4C7C5"/>
+              <w:bottom w:val="single" w:sz="6" w:space="0" w:color="C4C7C5"/>
+              <w:right w:val="single" w:sz="6" w:space="0" w:color="C4C7C5"/>
+            </w:tcBorders>
+            <w:tcMar>
+              <w:top w:w="120" w:type="dxa"/>
+              <w:left w:w="180" w:type="dxa"/>
+              <w:bottom w:w="120" w:type="dxa"/>
+              <w:right w:w="180" w:type="dxa"/>
+            </w:tcMar>
+            <w:vAlign w:val="center"/>
+            <w:hideMark/>
+          </w:tcPr>
+          <w:p>
+            <w:r>
+              <w:rPr>
+                <w:b/>
+                <w:bCs/>
+              </w:rPr>
+              <w:t>Description</w:t>
+            </w:r>
+          </w:p>
+        </w:tc>
+      </w:tr>
+      <w:tr>
+        <w:trPr>
+          <w:tblCellSpacing w:w="15" w:type="dxa"/>
+        </w:trPr>
+        <w:tc>
+          <w:tcPr>
+            <w:tcW w:w="0" w:type="auto"/>
+            <w:tcBorders>
+              <w:top w:val="single" w:sz="6" w:space="0" w:color="C4C7C5"/>
+              <w:left w:val="single" w:sz="6" w:space="0" w:color="C4C7C5"/>
+              <w:bottom w:val="single" w:sz="6" w:space="0" w:color="C4C7C5"/>
+              <w:right w:val="single" w:sz="6" w:space="0" w:color="C4C7C5"/>
+            </w:tcBorders>
+            <w:tcMar>
+              <w:top w:w="120" w:type="dxa"/>
+              <w:left w:w="180" w:type="dxa"/>
+              <w:bottom w:w="120" w:type="dxa"/>
+              <w:right w:w="180" w:type="dxa"/>
+            </w:tcMar>
+            <w:vAlign w:val="center"/>
+            <w:hideMark/>
+          </w:tcPr>
+          <w:p>
+            <w:r>
+              <w:rPr>
+                <w:b/>
+                <w:bCs/>
+              </w:rPr>
+              <w:t>id</w:t>
+            </w:r>
+          </w:p>
+        </w:tc>
+        <w:tc>
+          <w:tcPr>
+            <w:tcW w:w="0" w:type="auto"/>
+            <w:tcBorders>
+              <w:top w:val="single" w:sz="6" w:space="0" w:color="C4C7C5"/>
+              <w:left w:val="single" w:sz="6" w:space="0" w:color="C4C7C5"/>
+              <w:bottom w:val="single" w:sz="6" w:space="0" w:color="C4C7C5"/>
+              <w:right w:val="single" w:sz="6" w:space="0" w:color="C4C7C5"/>
+            </w:tcBorders>
+            <w:tcMar>
+              <w:top w:w="120" w:type="dxa"/>
+              <w:left w:w="180" w:type="dxa"/>
+              <w:bottom w:w="120" w:type="dxa"/>
+              <w:right w:w="180" w:type="dxa"/>
+            </w:tcMar>
+            <w:vAlign w:val="center"/>
+            <w:hideMark/>
+          </w:tcPr>
+          <w:p>
+            <w:r>
+              <w:t>INT</w:t>
+            </w:r>
+          </w:p>
+        </w:tc>
+        <w:tc>
+          <w:tcPr>
+            <w:tcW w:w="0" w:type="auto"/>
+            <w:tcBorders>
+              <w:top w:val="single" w:sz="6" w:space="0" w:color="C4C7C5"/>
+              <w:left w:val="single" w:sz="6" w:space="0" w:color="C4C7C5"/>
+              <w:bottom w:val="single" w:sz="6" w:space="0" w:color="C4C7C5"/>
+              <w:right w:val="single" w:sz="6" w:space="0" w:color="C4C7C5"/>
+            </w:tcBorders>
+            <w:tcMar>
+              <w:top w:w="120" w:type="dxa"/>
+              <w:left w:w="180" w:type="dxa"/>
+              <w:bottom w:w="120" w:type="dxa"/>
+              <w:right w:w="180" w:type="dxa"/>
+            </w:tcMar>
+            <w:vAlign w:val="center"/>
+            <w:hideMark/>
+          </w:tcPr>
+          <w:p>
+            <w:r>
+              <w:t>Primary Key, auto-incremented unique identifier for the review.</w:t>
+            </w:r>
+          </w:p>
+        </w:tc>
+      </w:tr>
+      <w:tr>
+        <w:trPr>
+          <w:tblCellSpacing w:w="15" w:type="dxa"/>
+        </w:trPr>
+        <w:tc>
+          <w:tcPr>
+            <w:tcW w:w="0" w:type="auto"/>
+            <w:tcBorders>
+              <w:top w:val="single" w:sz="6" w:space="0" w:color="C4C7C5"/>
+              <w:left w:val="single" w:sz="6" w:space="0" w:color="C4C7C5"/>
+              <w:bottom w:val="single" w:sz="6" w:space="0" w:color="C4C7C5"/>
+              <w:right w:val="single" w:sz="6" w:space="0" w:color="C4C7C5"/>
+            </w:tcBorders>
+            <w:tcMar>
+              <w:top w:w="120" w:type="dxa"/>
+              <w:left w:w="180" w:type="dxa"/>
+              <w:bottom w:w="120" w:type="dxa"/>
+              <w:right w:w="180" w:type="dxa"/>
+            </w:tcMar>
+            <w:vAlign w:val="center"/>
+            <w:hideMark/>
+          </w:tcPr>
+          <w:p>
+            <w:r>
+              <w:rPr>
+                <w:b/>
+                <w:bCs/>
+              </w:rPr>
+              <w:t>difficulty_rating</w:t>
+            </w:r>
+          </w:p>
+        </w:tc>
+        <w:tc>
+          <w:tcPr>
+            <w:tcW w:w="0" w:type="auto"/>
+            <w:tcBorders>
+              <w:top w:val="single" w:sz="6" w:space="0" w:color="C4C7C5"/>
+              <w:left w:val="single" w:sz="6" w:space="0" w:color="C4C7C5"/>
+              <w:bottom w:val="single" w:sz="6" w:space="0" w:color="C4C7C5"/>
+              <w:right w:val="single" w:sz="6" w:space="0" w:color="C4C7C5"/>
+            </w:tcBorders>
+            <w:tcMar>
+              <w:top w:w="120" w:type="dxa"/>
+              <w:left w:w="180" w:type="dxa"/>
+              <w:bottom w:w="120" w:type="dxa"/>
+              <w:right w:w="180" w:type="dxa"/>
+            </w:tcMar>
+            <w:vAlign w:val="center"/>
+            <w:hideMark/>
+          </w:tcPr>
+          <w:p>
+            <w:r>
+              <w:t>INT</w:t>
+            </w:r>
+          </w:p>
+        </w:tc>
+        <w:tc>
+          <w:tcPr>
+            <w:tcW w:w="0" w:type="auto"/>
+            <w:tcBorders>
+              <w:top w:val="single" w:sz="6" w:space="0" w:color="C4C7C5"/>
+              <w:left w:val="single" w:sz="6" w:space="0" w:color="C4C7C5"/>
+              <w:bottom w:val="single" w:sz="6" w:space="0" w:color="C4C7C5"/>
+              <w:right w:val="single" w:sz="6" w:space="0" w:color="C4C7C5"/>
+            </w:tcBorders>
+            <w:tcMar>
+              <w:top w:w="120" w:type="dxa"/>
+              <w:left w:w="180" w:type="dxa"/>
+              <w:bottom w:w="120" w:type="dxa"/>
+              <w:right w:w="180" w:type="dxa"/>
+            </w:tcMar>
+            <w:vAlign w:val="center"/>
+            <w:hideMark/>
+          </w:tcPr>
+          <w:p>
+            <w:r>
+              <w:t>Rating out of 10 for how challenging the module is.</w:t>
+            </w:r>
+          </w:p>
+        </w:tc>
+      </w:tr>
+      <w:tr>
+        <w:trPr>
+          <w:tblCellSpacing w:w="15" w:type="dxa"/>
+        </w:trPr>
+        <w:tc>
+          <w:tcPr>
+            <w:tcW w:w="0" w:type="auto"/>
+            <w:tcBorders>
+              <w:top w:val="single" w:sz="6" w:space="0" w:color="C4C7C5"/>
+              <w:left w:val="single" w:sz="6" w:space="0" w:color="C4C7C5"/>
+              <w:bottom w:val="single" w:sz="6" w:space="0" w:color="C4C7C5"/>
+              <w:right w:val="single" w:sz="6" w:space="0" w:color="C4C7C5"/>
+            </w:tcBorders>
+            <w:tcMar>
+              <w:top w:w="120" w:type="dxa"/>
+              <w:left w:w="180" w:type="dxa"/>
+              <w:bottom w:w="120" w:type="dxa"/>
+              <w:right w:w="180" w:type="dxa"/>
+            </w:tcMar>
+            <w:vAlign w:val="center"/>
+            <w:hideMark/>
+          </w:tcPr>
+          <w:p>
+            <w:r>
+              <w:rPr>
+                <w:b/>
+                <w:bCs/>
+              </w:rPr>
+              <w:t>teaching_rating</w:t>
+            </w:r>
+          </w:p>
+        </w:tc>
+        <w:tc>
+          <w:tcPr>
+            <w:tcW w:w="0" w:type="auto"/>
+            <w:tcBorders>
+              <w:top w:val="single" w:sz="6" w:space="0" w:color="C4C7C5"/>
+              <w:left w:val="single" w:sz="6" w:space="0" w:color="C4C7C5"/>
+              <w:bottom w:val="single" w:sz="6" w:space="0" w:color="C4C7C5"/>
+              <w:right w:val="single" w:sz="6" w:space="0" w:color="C4C7C5"/>
+            </w:tcBorders>
+            <w:tcMar>
+              <w:top w:w="120" w:type="dxa"/>
+              <w:left w:w="180" w:type="dxa"/>
+              <w:bottom w:w="120" w:type="dxa"/>
+              <w:right w:w="180" w:type="dxa"/>
+            </w:tcMar>
+            <w:vAlign w:val="center"/>
+            <w:hideMark/>
+          </w:tcPr>
+          <w:p>
+            <w:r>
+              <w:t>INT</w:t>
+            </w:r>
+          </w:p>
+        </w:tc>
+        <w:tc>
+          <w:tcPr>
+            <w:tcW w:w="0" w:type="auto"/>
+            <w:tcBorders>
+              <w:top w:val="single" w:sz="6" w:space="0" w:color="C4C7C5"/>
+              <w:left w:val="single" w:sz="6" w:space="0" w:color="C4C7C5"/>
+              <w:bottom w:val="single" w:sz="6" w:space="0" w:color="C4C7C5"/>
+              <w:right w:val="single" w:sz="6" w:space="0" w:color="C4C7C5"/>
+            </w:tcBorders>
+            <w:tcMar>
+              <w:top w:w="120" w:type="dxa"/>
+              <w:left w:w="180" w:type="dxa"/>
+              <w:bottom w:w="120" w:type="dxa"/>
+              <w:right w:w="180" w:type="dxa"/>
+            </w:tcMar>
+            <w:vAlign w:val="center"/>
+            <w:hideMark/>
+          </w:tcPr>
+          <w:p>
+            <w:r>
+              <w:t>Rating out of 10 for the quality of the lecturer/teaching.</w:t>
+            </w:r>
+          </w:p>
+        </w:tc>
+      </w:tr>
+      <w:tr>
+        <w:trPr>
+          <w:tblCellSpacing w:w="15" w:type="dxa"/>
+        </w:trPr>
+        <w:tc>
+          <w:tcPr>
+            <w:tcW w:w="0" w:type="auto"/>
+            <w:tcBorders>
+              <w:top w:val="single" w:sz="6" w:space="0" w:color="C4C7C5"/>
+              <w:left w:val="single" w:sz="6" w:space="0" w:color="C4C7C5"/>
+              <w:bottom w:val="single" w:sz="6" w:space="0" w:color="C4C7C5"/>
+              <w:right w:val="single" w:sz="6" w:space="0" w:color="C4C7C5"/>
+            </w:tcBorders>
+            <w:tcMar>
+              <w:top w:w="120" w:type="dxa"/>
+              <w:left w:w="180" w:type="dxa"/>
+              <w:bottom w:w="120" w:type="dxa"/>
+              <w:right w:w="180" w:type="dxa"/>
+            </w:tcMar>
+            <w:vAlign w:val="center"/>
+            <w:hideMark/>
+          </w:tcPr>
+          <w:p>
+            <w:r>
+              <w:rPr>
+                <w:b/>
+                <w:bCs/>
+              </w:rPr>
+              <w:t>content_rating</w:t>
+            </w:r>
+          </w:p>
+        </w:tc>
+        <w:tc>
+          <w:tcPr>
+            <w:tcW w:w="0" w:type="auto"/>
+            <w:tcBorders>
+              <w:top w:val="single" w:sz="6" w:space="0" w:color="C4C7C5"/>
+              <w:left w:val="single" w:sz="6" w:space="0" w:color="C4C7C5"/>
+              <w:bottom w:val="single" w:sz="6" w:space="0" w:color="C4C7C5"/>
+              <w:right w:val="single" w:sz="6" w:space="0" w:color="C4C7C5"/>
+            </w:tcBorders>
+            <w:tcMar>
+              <w:top w:w="120" w:type="dxa"/>
+              <w:left w:w="180" w:type="dxa"/>
+              <w:bottom w:w="120" w:type="dxa"/>
+              <w:right w:w="180" w:type="dxa"/>
+            </w:tcMar>
+            <w:vAlign w:val="center"/>
+            <w:hideMark/>
+          </w:tcPr>
+          <w:p>
+            <w:r>
+              <w:t>INT</w:t>
+            </w:r>
+          </w:p>
+        </w:tc>
+        <w:tc>
+          <w:tcPr>
+            <w:tcW w:w="0" w:type="auto"/>
+            <w:tcBorders>
+              <w:top w:val="single" w:sz="6" w:space="0" w:color="C4C7C5"/>
+              <w:left w:val="single" w:sz="6" w:space="0" w:color="C4C7C5"/>
+              <w:bottom w:val="single" w:sz="6" w:space="0" w:color="C4C7C5"/>
+              <w:right w:val="single" w:sz="6" w:space="0" w:color="C4C7C5"/>
+            </w:tcBorders>
+            <w:tcMar>
+              <w:top w:w="120" w:type="dxa"/>
+              <w:left w:w="180" w:type="dxa"/>
+              <w:bottom w:w="120" w:type="dxa"/>
+              <w:right w:w="180" w:type="dxa"/>
+            </w:tcMar>
+            <w:vAlign w:val="center"/>
+            <w:hideMark/>
+          </w:tcPr>
+          <w:p>
+            <w:r>
+              <w:t>Rating out of 10 for the relevance and quality of the material.</w:t>
+            </w:r>
+          </w:p>
+        </w:tc>
+      </w:tr>
+      <w:tr>
+        <w:trPr>
+          <w:tblCellSpacing w:w="15" w:type="dxa"/>
+        </w:trPr>
+        <w:tc>
+          <w:tcPr>
+            <w:tcW w:w="0" w:type="auto"/>
+            <w:tcBorders>
+              <w:top w:val="single" w:sz="6" w:space="0" w:color="C4C7C5"/>
+              <w:left w:val="single" w:sz="6" w:space="0" w:color="C4C7C5"/>
+              <w:bottom w:val="single" w:sz="6" w:space="0" w:color="C4C7C5"/>
+              <w:right w:val="single" w:sz="6" w:space="0" w:color="C4C7C5"/>
+            </w:tcBorders>
+            <w:tcMar>
+              <w:top w:w="120" w:type="dxa"/>
+              <w:left w:w="180" w:type="dxa"/>
+              <w:bottom w:w="120" w:type="dxa"/>
+              <w:right w:w="180" w:type="dxa"/>
+            </w:tcMar>
+            <w:vAlign w:val="center"/>
+            <w:hideMark/>
+          </w:tcPr>
+          <w:p>
+            <w:r>
+              <w:rPr>
+                <w:b/>
+                <w:bCs/>
+              </w:rPr>
+              <w:t>pros</w:t>
+            </w:r>
+          </w:p>
+        </w:tc>
+        <w:tc>
+          <w:tcPr>
+            <w:tcW w:w="0" w:type="auto"/>
+            <w:tcBorders>
+              <w:top w:val="single" w:sz="6" w:space="0" w:color="C4C7C5"/>
+              <w:left w:val="single" w:sz="6" w:space="0" w:color="C4C7C5"/>
+              <w:bottom w:val="single" w:sz="6" w:space="0" w:color="C4C7C5"/>
+              <w:right w:val="single" w:sz="6" w:space="0" w:color="C4C7C5"/>
+            </w:tcBorders>
+            <w:tcMar>
+              <w:top w:w="120" w:type="dxa"/>
+              <w:left w:w="180" w:type="dxa"/>
+              <w:bottom w:w="120" w:type="dxa"/>
+              <w:right w:w="180" w:type="dxa"/>
+            </w:tcMar>
+            <w:vAlign w:val="center"/>
+            <w:hideMark/>
+          </w:tcPr>
+          <w:p>
+            <w:r>
+              <w:t>TEXT</w:t>
+            </w:r>
+          </w:p>
+        </w:tc>
+        <w:tc>
+          <w:tcPr>
+            <w:tcW w:w="0" w:type="auto"/>
+            <w:tcBorders>
+              <w:top w:val="single" w:sz="6" w:space="0" w:color="C4C7C5"/>
+              <w:left w:val="single" w:sz="6" w:space="0" w:color="C4C7C5"/>
+              <w:bottom w:val="single" w:sz="6" w:space="0" w:color="C4C7C5"/>
+              <w:right w:val="single" w:sz="6" w:space="0" w:color="C4C7C5"/>
+            </w:tcBorders>
+            <w:tcMar>
+              <w:top w:w="120" w:type="dxa"/>
+              <w:left w:w="180" w:type="dxa"/>
+              <w:bottom w:w="120" w:type="dxa"/>
+              <w:right w:w="180" w:type="dxa"/>
+            </w:tcMar>
+            <w:vAlign w:val="center"/>
+            <w:hideMark/>
+          </w:tcPr>
+          <w:p>
+            <w:r>
+              <w:t>The positive aspects of the module.</w:t>
+            </w:r>
+          </w:p>
+        </w:tc>
+      </w:tr>
+      <w:tr>
+        <w:trPr>
+          <w:tblCellSpacing w:w="15" w:type="dxa"/>
+        </w:trPr>
+        <w:tc>
+          <w:tcPr>
+            <w:tcW w:w="0" w:type="auto"/>
+            <w:tcBorders>
+              <w:top w:val="single" w:sz="6" w:space="0" w:color="C4C7C5"/>
+              <w:left w:val="single" w:sz="6" w:space="0" w:color="C4C7C5"/>
+              <w:bottom w:val="single" w:sz="6" w:space="0" w:color="C4C7C5"/>
+              <w:right w:val="single" w:sz="6" w:space="0" w:color="C4C7C5"/>
+            </w:tcBorders>
+            <w:tcMar>
+              <w:top w:w="120" w:type="dxa"/>
+              <w:left w:w="180" w:type="dxa"/>
+              <w:bottom w:w="120" w:type="dxa"/>
+              <w:right w:w="180" w:type="dxa"/>
+            </w:tcMar>
+            <w:vAlign w:val="center"/>
+            <w:hideMark/>
+          </w:tcPr>
+          <w:p>
+            <w:r>
+              <w:rPr>
+                <w:b/>
+                <w:bCs/>
+              </w:rPr>
+              <w:t>cons</w:t>
+            </w:r>
+          </w:p>
+        </w:tc>
+        <w:tc>
+          <w:tcPr>
+            <w:tcW w:w="0" w:type="auto"/>
+            <w:tcBorders>
+              <w:top w:val="single" w:sz="6" w:space="0" w:color="C4C7C5"/>
+              <w:left w:val="single" w:sz="6" w:space="0" w:color="C4C7C5"/>
+              <w:bottom w:val="single" w:sz="6" w:space="0" w:color="C4C7C5"/>
+              <w:right w:val="single" w:sz="6" w:space="0" w:color="C4C7C5"/>
+            </w:tcBorders>
+            <w:tcMar>
+              <w:top w:w="120" w:type="dxa"/>
+              <w:left w:w="180" w:type="dxa"/>
+              <w:bottom w:w="120" w:type="dxa"/>
+              <w:right w:w="180" w:type="dxa"/>
+            </w:tcMar>
+            <w:vAlign w:val="center"/>
+            <w:hideMark/>
+          </w:tcPr>
+          <w:p>
+            <w:r>
+              <w:t>TEXT</w:t>
+            </w:r>
+          </w:p>
+        </w:tc>
+        <w:tc>
+          <w:tcPr>
+            <w:tcW w:w="0" w:type="auto"/>
+            <w:tcBorders>
+              <w:top w:val="single" w:sz="6" w:space="0" w:color="C4C7C5"/>
+              <w:left w:val="single" w:sz="6" w:space="0" w:color="C4C7C5"/>
+              <w:bottom w:val="single" w:sz="6" w:space="0" w:color="C4C7C5"/>
+              <w:right w:val="single" w:sz="6" w:space="0" w:color="C4C7C5"/>
+            </w:tcBorders>
+            <w:tcMar>
+              <w:top w:w="120" w:type="dxa"/>
+              <w:left w:w="180" w:type="dxa"/>
+              <w:bottom w:w="120" w:type="dxa"/>
+              <w:right w:w="180" w:type="dxa"/>
+            </w:tcMar>
+            <w:vAlign w:val="center"/>
+            <w:hideMark/>
+          </w:tcPr>
+          <w:p>
+            <w:r>
+              <w:t>The negative aspects or challenges of the module.</w:t>
+            </w:r>
+          </w:p>
+        </w:tc>
+      </w:tr>
+      <w:tr>
+        <w:trPr>
+          <w:tblCellSpacing w:w="15" w:type="dxa"/>
+        </w:trPr>
+        <w:tc>
+          <w:tcPr>
+            <w:tcW w:w="0" w:type="auto"/>
+            <w:tcBorders>
+              <w:top w:val="single" w:sz="6" w:space="0" w:color="C4C7C5"/>
+              <w:left w:val="single" w:sz="6" w:space="0" w:color="C4C7C5"/>
+              <w:bottom w:val="single" w:sz="6" w:space="0" w:color="C4C7C5"/>
+              <w:right w:val="single" w:sz="6" w:space="0" w:color="C4C7C5"/>
+            </w:tcBorders>
+            <w:tcMar>
+              <w:top w:w="120" w:type="dxa"/>
+              <w:left w:w="180" w:type="dxa"/>
+              <w:bottom w:w="120" w:type="dxa"/>
+              <w:right w:w="180" w:type="dxa"/>
+            </w:tcMar>
+            <w:vAlign w:val="center"/>
+            <w:hideMark/>
+          </w:tcPr>
+          <w:p>
+            <w:r>
+              <w:rPr>
+                <w:b/>
+                <w:bCs/>
+              </w:rPr>
+              <w:t>general_advice</w:t>
+            </w:r>
+          </w:p>
+        </w:tc>
+        <w:tc>
+          <w:tcPr>
+            <w:tcW w:w="0" w:type="auto"/>
+            <w:tcBorders>
+              <w:top w:val="single" w:sz="6" w:space="0" w:color="C4C7C5"/>
+              <w:left w:val="single" w:sz="6" w:space="0" w:color="C4C7C5"/>
+              <w:bottom w:val="single" w:sz="6" w:space="0" w:color="C4C7C5"/>
+              <w:right w:val="single" w:sz="6" w:space="0" w:color="C4C7C5"/>
+            </w:tcBorders>
+            <w:tcMar>
+              <w:top w:w="120" w:type="dxa"/>
+              <w:left w:w="180" w:type="dxa"/>
+              <w:bottom w:w="120" w:type="dxa"/>
+              <w:right w:w="180" w:type="dxa"/>
+            </w:tcMar>
+            <w:vAlign w:val="center"/>
+            <w:hideMark/>
+          </w:tcPr>
+          <w:p>
+            <w:r>
+              <w:t>TEXT</w:t>
+            </w:r>
+          </w:p>
+        </w:tc>
+        <w:tc>
+          <w:tcPr>
+            <w:tcW w:w="0" w:type="auto"/>
+            <w:tcBorders>
+              <w:top w:val="single" w:sz="6" w:space="0" w:color="C4C7C5"/>
+              <w:left w:val="single" w:sz="6" w:space="0" w:color="C4C7C5"/>
+              <w:bottom w:val="single" w:sz="6" w:space="0" w:color="C4C7C5"/>
+              <w:right w:val="single" w:sz="6" w:space="0" w:color="C4C7C5"/>
+            </w:tcBorders>
+            <w:tcMar>
+              <w:top w:w="120" w:type="dxa"/>
+              <w:left w:w="180" w:type="dxa"/>
+              <w:bottom w:w="120" w:type="dxa"/>
+              <w:right w:w="180" w:type="dxa"/>
+            </w:tcMar>
+            <w:vAlign w:val="center"/>
+            <w:hideMark/>
+          </w:tcPr>
+          <w:p>
+            <w:r>
+              <w:t>Overall advice for students planning to take the module.</w:t>
+            </w:r>
+          </w:p>
+        </w:tc>
+      </w:tr>
+      <w:tr>
+        <w:trPr>
+          <w:tblCellSpacing w:w="15" w:type="dxa"/>
+        </w:trPr>
+        <w:tc>
+          <w:tcPr>
+            <w:tcW w:w="0" w:type="auto"/>
+            <w:tcBorders>
+              <w:top w:val="single" w:sz="6" w:space="0" w:color="C4C7C5"/>
+              <w:left w:val="single" w:sz="6" w:space="0" w:color="C4C7C5"/>
+              <w:bottom w:val="single" w:sz="6" w:space="0" w:color="C4C7C5"/>
+              <w:right w:val="single" w:sz="6" w:space="0" w:color="C4C7C5"/>
+            </w:tcBorders>
+            <w:tcMar>
+              <w:top w:w="120" w:type="dxa"/>
+              <w:left w:w="180" w:type="dxa"/>
+              <w:bottom w:w="120" w:type="dxa"/>
+              <w:right w:w="180" w:type="dxa"/>
+            </w:tcMar>
+            <w:vAlign w:val="center"/>
+            <w:hideMark/>
+          </w:tcPr>
+          <w:p>
+            <w:r>
+              <w:rPr>
+                <w:b/>
+                <w:bCs/>
+              </w:rPr>
+              <w:t>is_anonymous</w:t>
+            </w:r>
+          </w:p>
+        </w:tc>
+        <w:tc>
+          <w:tcPr>
+            <w:tcW w:w="0" w:type="auto"/>
+            <w:tcBorders>
+              <w:top w:val="single" w:sz="6" w:space="0" w:color="C4C7C5"/>
+              <w:left w:val="single" w:sz="6" w:space="0" w:color="C4C7C5"/>
+              <w:bottom w:val="single" w:sz="6" w:space="0" w:color="C4C7C5"/>
+              <w:right w:val="single" w:sz="6" w:space="0" w:color="C4C7C5"/>
+            </w:tcBorders>
+            <w:tcMar>
+              <w:top w:w="120" w:type="dxa"/>
+              <w:left w:w="180" w:type="dxa"/>
+              <w:bottom w:w="120" w:type="dxa"/>
+              <w:right w:w="180" w:type="dxa"/>
+            </w:tcMar>
+            <w:vAlign w:val="center"/>
+            <w:hideMark/>
+          </w:tcPr>
+          <w:p>
+            <w:r>
+              <w:t>BOOLEAN</w:t>
+            </w:r>
+          </w:p>
+        </w:tc>
+        <w:tc>
+          <w:tcPr>
+            <w:tcW w:w="0" w:type="auto"/>
+            <w:tcBorders>
+              <w:top w:val="single" w:sz="6" w:space="0" w:color="C4C7C5"/>
+              <w:left w:val="single" w:sz="6" w:space="0" w:color="C4C7C5"/>
+              <w:bottom w:val="single" w:sz="6" w:space="0" w:color="C4C7C5"/>
+              <w:right w:val="single" w:sz="6" w:space="0" w:color="C4C7C5"/>
+            </w:tcBorders>
+            <w:tcMar>
+              <w:top w:w="120" w:type="dxa"/>
+              <w:left w:w="180" w:type="dxa"/>
+              <w:bottom w:w="120" w:type="dxa"/>
+              <w:right w:w="180" w:type="dxa"/>
+            </w:tcMar>
+            <w:vAlign w:val="center"/>
+            <w:hideMark/>
+          </w:tcPr>
+          <w:p>
+            <w:r>
+              <w:t>Toggles whether the reviewer's username is hidden from the public (1 = True, 0 = False).</w:t>
+            </w:r>
+          </w:p>
+        </w:tc>
+      </w:tr>
+      <w:tr>
+        <w:trPr>
+          <w:tblCellSpacing w:w="15" w:type="dxa"/>
+        </w:trPr>
+        <w:tc>
+          <w:tcPr>
+            <w:tcW w:w="0" w:type="auto"/>
+            <w:tcBorders>
+              <w:top w:val="single" w:sz="6" w:space="0" w:color="C4C7C5"/>
+              <w:left w:val="single" w:sz="6" w:space="0" w:color="C4C7C5"/>
+              <w:bottom w:val="single" w:sz="6" w:space="0" w:color="C4C7C5"/>
+              <w:right w:val="single" w:sz="6" w:space="0" w:color="C4C7C5"/>
+            </w:tcBorders>
+            <w:tcMar>
+              <w:top w:w="120" w:type="dxa"/>
+              <w:left w:w="180" w:type="dxa"/>
+              <w:bottom w:w="120" w:type="dxa"/>
+              <w:right w:w="180" w:type="dxa"/>
+            </w:tcMar>
+            <w:vAlign w:val="center"/>
+            <w:hideMark/>
+          </w:tcPr>
+          <w:p>
+            <w:r>
+              <w:rPr>
+                <w:b/>
+                <w:bCs/>
+              </w:rPr>
+              <w:t>helpful_votes</w:t>
+            </w:r>
+          </w:p>
+        </w:tc>
+        <w:tc>
+          <w:tcPr>
+            <w:tcW w:w="0" w:type="auto"/>
+            <w:tcBorders>
+              <w:top w:val="single" w:sz="6" w:space="0" w:color="C4C7C5"/>
+              <w:left w:val="single" w:sz="6" w:space="0" w:color="C4C7C5"/>
+              <w:bottom w:val="single" w:sz="6" w:space="0" w:color="C4C7C5"/>
+              <w:right w:val="single" w:sz="6" w:space="0" w:color="C4C7C5"/>
+            </w:tcBorders>
+            <w:tcMar>
+              <w:top w:w="120" w:type="dxa"/>
+              <w:left w:w="180" w:type="dxa"/>
+              <w:bottom w:w="120" w:type="dxa"/>
+              <w:right w:w="180" w:type="dxa"/>
+            </w:tcMar>
+            <w:vAlign w:val="center"/>
+            <w:hideMark/>
+          </w:tcPr>
+          <w:p>
+            <w:r>
+              <w:t>INT</w:t>
+            </w:r>
+          </w:p>
+        </w:tc>
+        <w:tc>
+          <w:tcPr>
+            <w:tcW w:w="0" w:type="auto"/>
+            <w:tcBorders>
+              <w:top w:val="single" w:sz="6" w:space="0" w:color="C4C7C5"/>
+              <w:left w:val="single" w:sz="6" w:space="0" w:color="C4C7C5"/>
+              <w:bottom w:val="single" w:sz="6" w:space="0" w:color="C4C7C5"/>
+              <w:right w:val="single" w:sz="6" w:space="0" w:color="C4C7C5"/>
+            </w:tcBorders>
+            <w:tcMar>
+              <w:top w:w="120" w:type="dxa"/>
+              <w:left w:w="180" w:type="dxa"/>
+              <w:bottom w:w="120" w:type="dxa"/>
+              <w:right w:w="180" w:type="dxa"/>
+            </w:tcMar>
+            <w:vAlign w:val="center"/>
+            <w:hideMark/>
+          </w:tcPr>
+          <w:p>
+            <w:r>
+              <w:t>Total number of "Useful" upvotes this specific review has received.</w:t>
+            </w:r>
+          </w:p>
+        </w:tc>
+      </w:tr>
+      <w:tr>
+        <w:trPr>
+          <w:tblCellSpacing w:w="15" w:type="dxa"/>
+        </w:trPr>
+        <w:tc>
+          <w:tcPr>
+            <w:tcW w:w="0" w:type="auto"/>
+            <w:tcBorders>
+              <w:top w:val="single" w:sz="6" w:space="0" w:color="C4C7C5"/>
+              <w:left w:val="single" w:sz="6" w:space="0" w:color="C4C7C5"/>
+              <w:bottom w:val="single" w:sz="6" w:space="0" w:color="C4C7C5"/>
+              <w:right w:val="single" w:sz="6" w:space="0" w:color="C4C7C5"/>
+            </w:tcBorders>
+            <w:tcMar>
+              <w:top w:w="120" w:type="dxa"/>
+              <w:left w:w="180" w:type="dxa"/>
+              <w:bottom w:w="120" w:type="dxa"/>
+              <w:right w:w="180" w:type="dxa"/>
+            </w:tcMar>
+            <w:vAlign w:val="center"/>
+            <w:hideMark/>
+          </w:tcPr>
+          <w:p>
+            <w:r>
+              <w:rPr>
+                <w:b/>
+                <w:bCs/>
+              </w:rPr>
+              <w:t>date_posted</w:t>
+            </w:r>
+          </w:p>
+        </w:tc>
+        <w:tc>
+          <w:tcPr>
+            <w:tcW w:w="0" w:type="auto"/>
+            <w:tcBorders>
+              <w:top w:val="single" w:sz="6" w:space="0" w:color="C4C7C5"/>
+              <w:left w:val="single" w:sz="6" w:space="0" w:color="C4C7C5"/>
+              <w:bottom w:val="single" w:sz="6" w:space="0" w:color="C4C7C5"/>
+              <w:right w:val="single" w:sz="6" w:space="0" w:color="C4C7C5"/>
+            </w:tcBorders>
+            <w:tcMar>
+              <w:top w:w="120" w:type="dxa"/>
+              <w:left w:w="180" w:type="dxa"/>
+              <w:bottom w:w="120" w:type="dxa"/>
+              <w:right w:w="180" w:type="dxa"/>
+            </w:tcMar>
+            <w:vAlign w:val="center"/>
+            <w:hideMark/>
+          </w:tcPr>
+          <w:p>
+            <w:r>
+              <w:t>TIMESTAMP</w:t>
+            </w:r>
+          </w:p>
+        </w:tc>
+        <w:tc>
+          <w:tcPr>
+            <w:tcW w:w="0" w:type="auto"/>
+            <w:tcBorders>
+              <w:top w:val="single" w:sz="6" w:space="0" w:color="C4C7C5"/>
+              <w:left w:val="single" w:sz="6" w:space="0" w:color="C4C7C5"/>
+              <w:bottom w:val="single" w:sz="6" w:space="0" w:color="C4C7C5"/>
+              <w:right w:val="single" w:sz="6" w:space="0" w:color="C4C7C5"/>
+            </w:tcBorders>
+            <w:tcMar>
+              <w:top w:w="120" w:type="dxa"/>
+              <w:left w:w="180" w:type="dxa"/>
+              <w:bottom w:w="120" w:type="dxa"/>
+              <w:right w:w="180" w:type="dxa"/>
+            </w:tcMar>
+            <w:vAlign w:val="center"/>
+            <w:hideMark/>
+          </w:tcPr>
+          <w:p>
+            <w:r>
+              <w:t>The date and time the review was submitted.</w:t>
+            </w:r>
+          </w:p>
+        </w:tc>
+      </w:tr>
+      <w:tr>
+        <w:trPr>
+          <w:tblCellSpacing w:w="15" w:type="dxa"/>
+        </w:trPr>
+        <w:tc>
+          <w:tcPr>
+            <w:tcW w:w="0" w:type="auto"/>
+            <w:tcBorders>
+              <w:top w:val="single" w:sz="6" w:space="0" w:color="C4C7C5"/>
+              <w:left w:val="single" w:sz="6" w:space="0" w:color="C4C7C5"/>
+              <w:bottom w:val="single" w:sz="6" w:space="0" w:color="C4C7C5"/>
+              <w:right w:val="single" w:sz="6" w:space="0" w:color="C4C7C5"/>
+            </w:tcBorders>
+            <w:tcMar>
+              <w:top w:w="120" w:type="dxa"/>
+              <w:left w:w="180" w:type="dxa"/>
+              <w:bottom w:w="120" w:type="dxa"/>
+              <w:right w:w="180" w:type="dxa"/>
+            </w:tcMar>
+            <w:vAlign w:val="center"/>
+            <w:hideMark/>
+          </w:tcPr>
+          <w:p>
+            <w:r>
+              <w:rPr>
+                <w:b/>
+                <w:bCs/>
+              </w:rPr>
+              <w:t>user_id</w:t>
+            </w:r>
+          </w:p>
+        </w:tc>
+        <w:tc>
+          <w:tcPr>
+            <w:tcW w:w="0" w:type="auto"/>
+            <w:tcBorders>
+              <w:top w:val="single" w:sz="6" w:space="0" w:color="C4C7C5"/>
+              <w:left w:val="single" w:sz="6" w:space="0" w:color="C4C7C5"/>
+              <w:bottom w:val="single" w:sz="6" w:space="0" w:color="C4C7C5"/>
+              <w:right w:val="single" w:sz="6" w:space="0" w:color="C4C7C5"/>
+            </w:tcBorders>
+            <w:tcMar>
+              <w:top w:w="120" w:type="dxa"/>
+              <w:left w:w="180" w:type="dxa"/>
+              <w:bottom w:w="120" w:type="dxa"/>
+              <w:right w:w="180" w:type="dxa"/>
+            </w:tcMar>
+            <w:vAlign w:val="center"/>
+            <w:hideMark/>
+          </w:tcPr>
+          <w:p>
+            <w:r>
+              <w:t>INT</w:t>
+            </w:r>
+          </w:p>
+        </w:tc>
+        <w:tc>
+          <w:tcPr>
+            <w:tcW w:w="0" w:type="auto"/>
+            <w:tcBorders>
+              <w:top w:val="single" w:sz="6" w:space="0" w:color="C4C7C5"/>
+              <w:left w:val="single" w:sz="6" w:space="0" w:color="C4C7C5"/>
+              <w:bottom w:val="single" w:sz="6" w:space="0" w:color="C4C7C5"/>
+              <w:right w:val="single" w:sz="6" w:space="0" w:color="C4C7C5"/>
+            </w:tcBorders>
+            <w:tcMar>
+              <w:top w:w="120" w:type="dxa"/>
+              <w:left w:w="180" w:type="dxa"/>
+              <w:bottom w:w="120" w:type="dxa"/>
+              <w:right w:w="180" w:type="dxa"/>
+            </w:tcMar>
+            <w:vAlign w:val="center"/>
+            <w:hideMark/>
+          </w:tcPr>
+          <w:p>
+            <w:r>
+              <w:t xml:space="preserve">Foreign Key referencing id in the </w:t>
+            </w:r>
+            <w:proofErr w:type="gramStart"/>
+            <w:r>
+              <w:t>users</w:t>
+            </w:r>
+            <w:proofErr w:type="gramEnd"/>
+            <w:r>
+              <w:t xml:space="preserve"> table.</w:t>
+            </w:r>
+          </w:p>
+        </w:tc>
+      </w:tr>
+      <w:tr>
+        <w:trPr>
+          <w:tblCellSpacing w:w="15" w:type="dxa"/>
+        </w:trPr>
+        <w:tc>
+          <w:tcPr>
+            <w:tcW w:w="0" w:type="auto"/>
+            <w:tcBorders>
+              <w:top w:val="single" w:sz="6" w:space="0" w:color="C4C7C5"/>
+              <w:left w:val="single" w:sz="6" w:space="0" w:color="C4C7C5"/>
+              <w:bottom w:val="single" w:sz="6" w:space="0" w:color="C4C7C5"/>
+              <w:right w:val="single" w:sz="6" w:space="0" w:color="C4C7C5"/>
+            </w:tcBorders>
+            <w:tcMar>
+              <w:top w:w="120" w:type="dxa"/>
+              <w:left w:w="180" w:type="dxa"/>
+              <w:bottom w:w="120" w:type="dxa"/>
+              <w:right w:w="180" w:type="dxa"/>
+            </w:tcMar>
+            <w:vAlign w:val="center"/>
+            <w:hideMark/>
+          </w:tcPr>
+          <w:p>
+            <w:r>
+              <w:rPr>
+                <w:b/>
+                <w:bCs/>
+              </w:rPr>
+              <w:t>module_id</w:t>
+            </w:r>
+          </w:p>
+        </w:tc>
+        <w:tc>
+          <w:tcPr>
+            <w:tcW w:w="0" w:type="auto"/>
+            <w:tcBorders>
+              <w:top w:val="single" w:sz="6" w:space="0" w:color="C4C7C5"/>
+              <w:left w:val="single" w:sz="6" w:space="0" w:color="C4C7C5"/>
+              <w:bottom w:val="single" w:sz="6" w:space="0" w:color="C4C7C5"/>
+              <w:right w:val="single" w:sz="6" w:space="0" w:color="C4C7C5"/>
+            </w:tcBorders>
+            <w:tcMar>
+              <w:top w:w="120" w:type="dxa"/>
+              <w:left w:w="180" w:type="dxa"/>
+              <w:bottom w:w="120" w:type="dxa"/>
+              <w:right w:w="180" w:type="dxa"/>
+            </w:tcMar>
+            <w:vAlign w:val="center"/>
+            <w:hideMark/>
+          </w:tcPr>
+          <w:p>
+            <w:r>
+              <w:t>INT</w:t>
+            </w:r>
+          </w:p>
+        </w:tc>
+        <w:tc>
+          <w:tcPr>
+            <w:tcW w:w="0" w:type="auto"/>
+            <w:tcBorders>
+              <w:top w:val="single" w:sz="6" w:space="0" w:color="C4C7C5"/>
+              <w:left w:val="single" w:sz="6" w:space="0" w:color="C4C7C5"/>
+              <w:bottom w:val="single" w:sz="6" w:space="0" w:color="C4C7C5"/>
+              <w:right w:val="single" w:sz="6" w:space="0" w:color="C4C7C5"/>
+            </w:tcBorders>
+            <w:tcMar>
+              <w:top w:w="120" w:type="dxa"/>
+              <w:left w:w="180" w:type="dxa"/>
+              <w:bottom w:w="120" w:type="dxa"/>
+              <w:right w:w="180" w:type="dxa"/>
+            </w:tcMar>
+            <w:vAlign w:val="center"/>
+            <w:hideMark/>
+          </w:tcPr>
+          <w:p>
+            <w:r>
+              <w:t>Foreign Key referencing id in the modules table.</w:t>
+            </w:r>
+          </w:p>
+        </w:tc>
+      </w:tr>
+    </w:tbl>
     <w:p>
       <w:r>
+        <w:t xml:space="preserve">Table: </w:t>
+      </w:r>
+      <w:r>
+        <w:rPr>
+          <w:b/>
+          <w:bCs/>
+        </w:rPr>
+        <w:t>reviews</w:t>
+      </w:r>
+    </w:p>
+    <w:p>
+      <w:r>
+        <w:lastRenderedPageBreak/>
         <w:t xml:space="preserve">Table: </w:t>
       </w:r>
       <w:r>
@@ -1839,11 +3237,9 @@
             <w:hideMark/>
           </w:tcPr>
           <w:p>
-            <w:proofErr w:type="spellStart"/>
             <w:r>
               <w:t>course_code</w:t>
             </w:r>
-            <w:proofErr w:type="spellEnd"/>
           </w:p>
         </w:tc>
         <w:tc>
@@ -1930,11 +3326,9 @@
             <w:hideMark/>
           </w:tcPr>
           <w:p>
-            <w:proofErr w:type="spellStart"/>
             <w:r>
               <w:t>course_name</w:t>
             </w:r>
-            <w:proofErr w:type="spellEnd"/>
           </w:p>
         </w:tc>
         <w:tc>
@@ -2116,11 +3510,9 @@
             <w:hideMark/>
           </w:tcPr>
           <w:p>
-            <w:proofErr w:type="spellStart"/>
             <w:r>
               <w:t>duration_years</w:t>
             </w:r>
-            <w:proofErr w:type="spellEnd"/>
           </w:p>
         </w:tc>
         <w:tc>
@@ -2202,11 +3594,9 @@
             <w:hideMark/>
           </w:tcPr>
           <w:p>
-            <w:proofErr w:type="spellStart"/>
             <w:r>
               <w:t>faculty_id</w:t>
             </w:r>
-            <w:proofErr w:type="spellEnd"/>
           </w:p>
         </w:tc>
         <w:tc>
@@ -2279,9 +3669,9 @@
     <w:p/>
     <w:p>
       <w:r>
+        <w:lastRenderedPageBreak/>
         <w:t xml:space="preserve">Table: </w:t>
       </w:r>
-      <w:proofErr w:type="spellStart"/>
       <w:r>
         <w:rPr>
           <w:b/>
@@ -2289,7 +3679,6 @@
         </w:rPr>
         <w:t>course_modules</w:t>
       </w:r>
-      <w:proofErr w:type="spellEnd"/>
     </w:p>
     <w:tbl>
       <w:tblPr>
@@ -2419,11 +3808,9 @@
             <w:hideMark/>
           </w:tcPr>
           <w:p>
-            <w:proofErr w:type="spellStart"/>
             <w:r>
               <w:t>course_id</w:t>
             </w:r>
-            <w:proofErr w:type="spellEnd"/>
           </w:p>
         </w:tc>
         <w:tc>
@@ -2505,11 +3892,9 @@
             <w:hideMark/>
           </w:tcPr>
           <w:p>
-            <w:proofErr w:type="spellStart"/>
             <w:r>
               <w:t>module_id</w:t>
             </w:r>
-            <w:proofErr w:type="spellEnd"/>
           </w:p>
         </w:tc>
         <w:tc>
@@ -2591,11 +3976,9 @@
             <w:hideMark/>
           </w:tcPr>
           <w:p>
-            <w:proofErr w:type="spellStart"/>
             <w:r>
               <w:t>year_of_study</w:t>
             </w:r>
-            <w:proofErr w:type="spellEnd"/>
           </w:p>
         </w:tc>
         <w:tc>
@@ -3358,7 +4741,6 @@
   <w:style w:type="character" w:default="1" w:styleId="DefaultParagraphFont">
     <w:name w:val="Default Paragraph Font"/>
     <w:uiPriority w:val="1"/>
-    <w:semiHidden/>
     <w:unhideWhenUsed/>
   </w:style>
   <w:style w:type="table" w:default="1" w:styleId="TableNormal">

</xml_diff>

<commit_message>
I am begining to work on the front end while I am still learning about flask
</commit_message>
<xml_diff>
--- a/DATABASE/Data dictionary/Database Tables.docx
+++ b/DATABASE/Data dictionary/Database Tables.docx
@@ -222,9 +222,11 @@
             <w:hideMark/>
           </w:tcPr>
           <w:p>
+            <w:proofErr w:type="spellStart"/>
             <w:r>
               <w:t>mod_code</w:t>
             </w:r>
+            <w:proofErr w:type="spellEnd"/>
           </w:p>
         </w:tc>
         <w:tc>
@@ -311,9 +313,11 @@
             <w:hideMark/>
           </w:tcPr>
           <w:p>
+            <w:proofErr w:type="spellStart"/>
             <w:r>
               <w:t>mod_name</w:t>
             </w:r>
+            <w:proofErr w:type="spellEnd"/>
           </w:p>
         </w:tc>
         <w:tc>
@@ -781,9 +785,11 @@
             <w:hideMark/>
           </w:tcPr>
           <w:p>
+            <w:proofErr w:type="spellStart"/>
             <w:r>
               <w:t>fac_name</w:t>
             </w:r>
+            <w:proofErr w:type="spellEnd"/>
           </w:p>
         </w:tc>
         <w:tc>
@@ -870,9 +876,11 @@
             <w:hideMark/>
           </w:tcPr>
           <w:p>
+            <w:proofErr w:type="spellStart"/>
             <w:r>
               <w:t>is_available</w:t>
             </w:r>
+            <w:proofErr w:type="spellEnd"/>
           </w:p>
         </w:tc>
         <w:tc>
@@ -957,9 +965,11 @@
             <w:hideMark/>
           </w:tcPr>
           <w:p>
+            <w:proofErr w:type="spellStart"/>
             <w:r>
               <w:t>icon_name</w:t>
             </w:r>
+            <w:proofErr w:type="spellEnd"/>
           </w:p>
         </w:tc>
         <w:tc>
@@ -1334,6 +1344,7 @@
             <w:hideMark/>
           </w:tcPr>
           <w:p>
+            <w:proofErr w:type="spellStart"/>
             <w:r>
               <w:rPr>
                 <w:b/>
@@ -1341,6 +1352,7 @@
               </w:rPr>
               <w:t>student_email</w:t>
             </w:r>
+            <w:proofErr w:type="spellEnd"/>
           </w:p>
         </w:tc>
         <w:tc>
@@ -1592,6 +1604,7 @@
             <w:hideMark/>
           </w:tcPr>
           <w:p>
+            <w:proofErr w:type="spellStart"/>
             <w:r>
               <w:rPr>
                 <w:b/>
@@ -1599,6 +1612,7 @@
               </w:rPr>
               <w:t>degree_program</w:t>
             </w:r>
+            <w:proofErr w:type="spellEnd"/>
           </w:p>
         </w:tc>
         <w:tc>
@@ -1678,6 +1692,7 @@
             <w:hideMark/>
           </w:tcPr>
           <w:p>
+            <w:proofErr w:type="spellStart"/>
             <w:r>
               <w:rPr>
                 <w:b/>
@@ -1685,6 +1700,7 @@
               </w:rPr>
               <w:t>year_of_study</w:t>
             </w:r>
+            <w:proofErr w:type="spellEnd"/>
           </w:p>
         </w:tc>
         <w:tc>
@@ -1764,6 +1780,7 @@
             <w:hideMark/>
           </w:tcPr>
           <w:p>
+            <w:proofErr w:type="spellStart"/>
             <w:r>
               <w:rPr>
                 <w:b/>
@@ -1771,6 +1788,7 @@
               </w:rPr>
               <w:t>helpful_votes</w:t>
             </w:r>
+            <w:proofErr w:type="spellEnd"/>
           </w:p>
         </w:tc>
         <w:tc>
@@ -1853,6 +1871,7 @@
             <w:hideMark/>
           </w:tcPr>
           <w:p>
+            <w:proofErr w:type="spellStart"/>
             <w:r>
               <w:rPr>
                 <w:b/>
@@ -1860,6 +1879,7 @@
               </w:rPr>
               <w:t>created_at</w:t>
             </w:r>
+            <w:proofErr w:type="spellEnd"/>
           </w:p>
         </w:tc>
         <w:tc>
@@ -2130,6 +2150,7 @@
             <w:hideMark/>
           </w:tcPr>
           <w:p>
+            <w:proofErr w:type="spellStart"/>
             <w:r>
               <w:rPr>
                 <w:b/>
@@ -2137,6 +2158,7 @@
               </w:rPr>
               <w:t>difficulty_rating</w:t>
             </w:r>
+            <w:proofErr w:type="spellEnd"/>
           </w:p>
         </w:tc>
         <w:tc>
@@ -2211,6 +2233,7 @@
             <w:hideMark/>
           </w:tcPr>
           <w:p>
+            <w:proofErr w:type="spellStart"/>
             <w:r>
               <w:rPr>
                 <w:b/>
@@ -2218,6 +2241,7 @@
               </w:rPr>
               <w:t>teaching_rating</w:t>
             </w:r>
+            <w:proofErr w:type="spellEnd"/>
           </w:p>
         </w:tc>
         <w:tc>
@@ -2292,6 +2316,7 @@
             <w:hideMark/>
           </w:tcPr>
           <w:p>
+            <w:proofErr w:type="spellStart"/>
             <w:r>
               <w:rPr>
                 <w:b/>
@@ -2299,6 +2324,7 @@
               </w:rPr>
               <w:t>content_rating</w:t>
             </w:r>
+            <w:proofErr w:type="spellEnd"/>
           </w:p>
         </w:tc>
         <w:tc>
@@ -2535,6 +2561,7 @@
             <w:hideMark/>
           </w:tcPr>
           <w:p>
+            <w:proofErr w:type="spellStart"/>
             <w:r>
               <w:rPr>
                 <w:b/>
@@ -2542,6 +2569,7 @@
               </w:rPr>
               <w:t>general_advice</w:t>
             </w:r>
+            <w:proofErr w:type="spellEnd"/>
           </w:p>
         </w:tc>
         <w:tc>
@@ -2616,6 +2644,7 @@
             <w:hideMark/>
           </w:tcPr>
           <w:p>
+            <w:proofErr w:type="spellStart"/>
             <w:r>
               <w:rPr>
                 <w:b/>
@@ -2623,6 +2652,7 @@
               </w:rPr>
               <w:t>is_anonymous</w:t>
             </w:r>
+            <w:proofErr w:type="spellEnd"/>
           </w:p>
         </w:tc>
         <w:tc>
@@ -2697,6 +2727,7 @@
             <w:hideMark/>
           </w:tcPr>
           <w:p>
+            <w:proofErr w:type="spellStart"/>
             <w:r>
               <w:rPr>
                 <w:b/>
@@ -2704,6 +2735,7 @@
               </w:rPr>
               <w:t>helpful_votes</w:t>
             </w:r>
+            <w:proofErr w:type="spellEnd"/>
           </w:p>
         </w:tc>
         <w:tc>
@@ -2778,6 +2810,7 @@
             <w:hideMark/>
           </w:tcPr>
           <w:p>
+            <w:proofErr w:type="spellStart"/>
             <w:r>
               <w:rPr>
                 <w:b/>
@@ -2785,6 +2818,7 @@
               </w:rPr>
               <w:t>date_posted</w:t>
             </w:r>
+            <w:proofErr w:type="spellEnd"/>
           </w:p>
         </w:tc>
         <w:tc>
@@ -2859,6 +2893,7 @@
             <w:hideMark/>
           </w:tcPr>
           <w:p>
+            <w:proofErr w:type="spellStart"/>
             <w:r>
               <w:rPr>
                 <w:b/>
@@ -2866,6 +2901,7 @@
               </w:rPr>
               <w:t>user_id</w:t>
             </w:r>
+            <w:proofErr w:type="spellEnd"/>
           </w:p>
         </w:tc>
         <w:tc>
@@ -2948,6 +2984,7 @@
             <w:hideMark/>
           </w:tcPr>
           <w:p>
+            <w:proofErr w:type="spellStart"/>
             <w:r>
               <w:rPr>
                 <w:b/>
@@ -2955,6 +2992,7 @@
               </w:rPr>
               <w:t>module_id</w:t>
             </w:r>
+            <w:proofErr w:type="spellEnd"/>
           </w:p>
         </w:tc>
         <w:tc>
@@ -3237,9 +3275,11 @@
             <w:hideMark/>
           </w:tcPr>
           <w:p>
+            <w:proofErr w:type="spellStart"/>
             <w:r>
               <w:t>course_code</w:t>
             </w:r>
+            <w:proofErr w:type="spellEnd"/>
           </w:p>
         </w:tc>
         <w:tc>
@@ -3326,9 +3366,11 @@
             <w:hideMark/>
           </w:tcPr>
           <w:p>
+            <w:proofErr w:type="spellStart"/>
             <w:r>
               <w:t>course_name</w:t>
             </w:r>
+            <w:proofErr w:type="spellEnd"/>
           </w:p>
         </w:tc>
         <w:tc>
@@ -3510,9 +3552,11 @@
             <w:hideMark/>
           </w:tcPr>
           <w:p>
+            <w:proofErr w:type="spellStart"/>
             <w:r>
               <w:t>duration_years</w:t>
             </w:r>
+            <w:proofErr w:type="spellEnd"/>
           </w:p>
         </w:tc>
         <w:tc>
@@ -3594,9 +3638,11 @@
             <w:hideMark/>
           </w:tcPr>
           <w:p>
+            <w:proofErr w:type="spellStart"/>
             <w:r>
               <w:t>faculty_id</w:t>
             </w:r>
+            <w:proofErr w:type="spellEnd"/>
           </w:p>
         </w:tc>
         <w:tc>
@@ -3672,6 +3718,7 @@
         <w:lastRenderedPageBreak/>
         <w:t xml:space="preserve">Table: </w:t>
       </w:r>
+      <w:proofErr w:type="spellStart"/>
       <w:r>
         <w:rPr>
           <w:b/>
@@ -3679,6 +3726,7 @@
         </w:rPr>
         <w:t>course_modules</w:t>
       </w:r>
+      <w:proofErr w:type="spellEnd"/>
     </w:p>
     <w:tbl>
       <w:tblPr>
@@ -3691,9 +3739,9 @@
         <w:tblLook w:val="04A0" w:firstRow="1" w:lastRow="0" w:firstColumn="1" w:lastColumn="0" w:noHBand="0" w:noVBand="1"/>
       </w:tblPr>
       <w:tblGrid>
-        <w:gridCol w:w="1931"/>
-        <w:gridCol w:w="1856"/>
-        <w:gridCol w:w="5223"/>
+        <w:gridCol w:w="1956"/>
+        <w:gridCol w:w="1109"/>
+        <w:gridCol w:w="5945"/>
       </w:tblGrid>
       <w:tr>
         <w:trPr>
@@ -3808,9 +3856,11 @@
             <w:hideMark/>
           </w:tcPr>
           <w:p>
+            <w:proofErr w:type="spellStart"/>
             <w:r>
               <w:t>course_id</w:t>
             </w:r>
+            <w:proofErr w:type="spellEnd"/>
           </w:p>
         </w:tc>
         <w:tc>
@@ -3892,9 +3942,11 @@
             <w:hideMark/>
           </w:tcPr>
           <w:p>
+            <w:proofErr w:type="spellStart"/>
             <w:r>
               <w:t>module_id</w:t>
             </w:r>
+            <w:proofErr w:type="spellEnd"/>
           </w:p>
         </w:tc>
         <w:tc>
@@ -3976,9 +4028,11 @@
             <w:hideMark/>
           </w:tcPr>
           <w:p>
+            <w:proofErr w:type="spellStart"/>
             <w:r>
               <w:t>year_of_study</w:t>
             </w:r>
+            <w:proofErr w:type="spellEnd"/>
           </w:p>
         </w:tc>
         <w:tc>
@@ -4026,95 +4080,6 @@
           <w:p>
             <w:r>
               <w:t xml:space="preserve">Records which academic year this module belongs to (e.g., 1, 2, 3). </w:t>
-            </w:r>
-            <w:r>
-              <w:rPr>
-                <w:b/>
-                <w:bCs/>
-              </w:rPr>
-              <w:t>NOT NULL.</w:t>
-            </w:r>
-          </w:p>
-        </w:tc>
-      </w:tr>
-      <w:tr>
-        <w:trPr>
-          <w:tblCellSpacing w:w="15" w:type="dxa"/>
-        </w:trPr>
-        <w:tc>
-          <w:tcPr>
-            <w:tcW w:w="0" w:type="auto"/>
-            <w:tcBorders>
-              <w:top w:val="single" w:sz="6" w:space="0" w:color="C4C7C5"/>
-              <w:left w:val="single" w:sz="6" w:space="0" w:color="C4C7C5"/>
-              <w:bottom w:val="single" w:sz="6" w:space="0" w:color="C4C7C5"/>
-              <w:right w:val="single" w:sz="6" w:space="0" w:color="C4C7C5"/>
-            </w:tcBorders>
-            <w:tcMar>
-              <w:top w:w="120" w:type="dxa"/>
-              <w:left w:w="180" w:type="dxa"/>
-              <w:bottom w:w="120" w:type="dxa"/>
-              <w:right w:w="180" w:type="dxa"/>
-            </w:tcMar>
-            <w:vAlign w:val="center"/>
-            <w:hideMark/>
-          </w:tcPr>
-          <w:p>
-            <w:r>
-              <w:t>semester</w:t>
-            </w:r>
-          </w:p>
-        </w:tc>
-        <w:tc>
-          <w:tcPr>
-            <w:tcW w:w="0" w:type="auto"/>
-            <w:tcBorders>
-              <w:top w:val="single" w:sz="6" w:space="0" w:color="C4C7C5"/>
-              <w:left w:val="single" w:sz="6" w:space="0" w:color="C4C7C5"/>
-              <w:bottom w:val="single" w:sz="6" w:space="0" w:color="C4C7C5"/>
-              <w:right w:val="single" w:sz="6" w:space="0" w:color="C4C7C5"/>
-            </w:tcBorders>
-            <w:tcMar>
-              <w:top w:w="120" w:type="dxa"/>
-              <w:left w:w="180" w:type="dxa"/>
-              <w:bottom w:w="120" w:type="dxa"/>
-              <w:right w:w="180" w:type="dxa"/>
-            </w:tcMar>
-            <w:vAlign w:val="center"/>
-            <w:hideMark/>
-          </w:tcPr>
-          <w:p>
-            <w:proofErr w:type="gramStart"/>
-            <w:r>
-              <w:t>VARCHAR(</w:t>
-            </w:r>
-            <w:proofErr w:type="gramEnd"/>
-            <w:r>
-              <w:t>15)</w:t>
-            </w:r>
-          </w:p>
-        </w:tc>
-        <w:tc>
-          <w:tcPr>
-            <w:tcW w:w="0" w:type="auto"/>
-            <w:tcBorders>
-              <w:top w:val="single" w:sz="6" w:space="0" w:color="C4C7C5"/>
-              <w:left w:val="single" w:sz="6" w:space="0" w:color="C4C7C5"/>
-              <w:bottom w:val="single" w:sz="6" w:space="0" w:color="C4C7C5"/>
-              <w:right w:val="single" w:sz="6" w:space="0" w:color="C4C7C5"/>
-            </w:tcBorders>
-            <w:tcMar>
-              <w:top w:w="120" w:type="dxa"/>
-              <w:left w:w="180" w:type="dxa"/>
-              <w:bottom w:w="120" w:type="dxa"/>
-              <w:right w:w="180" w:type="dxa"/>
-            </w:tcMar>
-            <w:vAlign w:val="center"/>
-            <w:hideMark/>
-          </w:tcPr>
-          <w:p>
-            <w:r>
-              <w:t xml:space="preserve">Records when the module is taken (e.g., 'Semester 1', 'Semester 2', 'Year-Long'). </w:t>
             </w:r>
             <w:r>
               <w:rPr>
@@ -4741,6 +4706,7 @@
   <w:style w:type="character" w:default="1" w:styleId="DefaultParagraphFont">
     <w:name w:val="Default Paragraph Font"/>
     <w:uiPriority w:val="1"/>
+    <w:semiHidden/>
     <w:unhideWhenUsed/>
   </w:style>
   <w:style w:type="table" w:default="1" w:styleId="TableNormal">

</xml_diff>

<commit_message>
I have solved the in review AI feature, I just need to now solve the main AI review page
</commit_message>
<xml_diff>
--- a/DATABASE/Data dictionary/Database Tables.docx
+++ b/DATABASE/Data dictionary/Database Tables.docx
@@ -1,6 +1,6 @@
 
 <file path=word/document.xml><?xml version="1.0" encoding="utf-8"?>
-<w:document xmlns:wpc="http://schemas.microsoft.com/office/word/2010/wordprocessingCanvas" xmlns:cx="http://schemas.microsoft.com/office/drawing/2014/chartex" xmlns:cx1="http://schemas.microsoft.com/office/drawing/2015/9/8/chartex" xmlns:cx2="http://schemas.microsoft.com/office/drawing/2015/10/21/chartex" xmlns:cx3="http://schemas.microsoft.com/office/drawing/2016/5/9/chartex" xmlns:cx4="http://schemas.microsoft.com/office/drawing/2016/5/10/chartex" xmlns:cx5="http://schemas.microsoft.com/office/drawing/2016/5/11/chartex" xmlns:cx6="http://schemas.microsoft.com/office/drawing/2016/5/12/chartex" xmlns:cx7="http://schemas.microsoft.com/office/drawing/2016/5/13/chartex" xmlns:cx8="http://schemas.microsoft.com/office/drawing/2016/5/14/chartex" xmlns:mc="http://schemas.openxmlformats.org/markup-compatibility/2006" xmlns:aink="http://schemas.microsoft.com/office/drawing/2016/ink" xmlns:am3d="http://schemas.microsoft.com/office/drawing/2017/model3d" xmlns:o="urn:schemas-microsoft-com:office:office" xmlns:oel="http://schemas.microsoft.com/office/2019/extlst" xmlns:r="http://schemas.openxmlformats.org/officeDocument/2006/relationships" xmlns:m="http://schemas.openxmlformats.org/officeDocument/2006/math" xmlns:v="urn:schemas-microsoft-com:vml" xmlns:wp14="http://schemas.microsoft.com/office/word/2010/wordprocessingDrawing" xmlns:wp="http://schemas.openxmlformats.org/drawingml/2006/wordprocessingDrawing" xmlns:w10="urn:schemas-microsoft-com:office:word" xmlns:w="http://schemas.openxmlformats.org/wordprocessingml/2006/main" xmlns:w14="http://schemas.microsoft.com/office/word/2010/wordml" xmlns:w15="http://schemas.microsoft.com/office/word/2012/wordml" xmlns:w16cex="http://schemas.microsoft.com/office/word/2018/wordml/cex" xmlns:w16cid="http://schemas.microsoft.com/office/word/2016/wordml/cid" xmlns:w16="http://schemas.microsoft.com/office/word/2018/wordml" xmlns:w16du="http://schemas.microsoft.com/office/word/2023/wordml/word16du" xmlns:w16sdtdh="http://schemas.microsoft.com/office/word/2020/wordml/sdtdatahash" xmlns:w16sdtfl="http://schemas.microsoft.com/office/word/2024/wordml/sdtformatlock" xmlns:w16se="http://schemas.microsoft.com/office/word/2015/wordml/symex" xmlns:wpg="http://schemas.microsoft.com/office/word/2010/wordprocessingGroup" xmlns:wpi="http://schemas.microsoft.com/office/word/2010/wordprocessingInk" xmlns:wne="http://schemas.microsoft.com/office/word/2006/wordml" xmlns:wps="http://schemas.microsoft.com/office/word/2010/wordprocessingShape" mc:Ignorable="w14 w15 w16se w16cid w16 w16cex w16sdtdh w16sdtfl w16du wp14">
+<w:document xmlns:wpc="http://schemas.microsoft.com/office/word/2010/wordprocessingCanvas" xmlns:cx="http://schemas.microsoft.com/office/drawing/2014/chartex" xmlns:cx1="http://schemas.microsoft.com/office/drawing/2015/9/8/chartex" xmlns:cx2="http://schemas.microsoft.com/office/drawing/2015/10/21/chartex" xmlns:cx3="http://schemas.microsoft.com/office/drawing/2016/5/9/chartex" xmlns:cx4="http://schemas.microsoft.com/office/drawing/2016/5/10/chartex" xmlns:cx5="http://schemas.microsoft.com/office/drawing/2016/5/11/chartex" xmlns:cx6="http://schemas.microsoft.com/office/drawing/2016/5/12/chartex" xmlns:cx7="http://schemas.microsoft.com/office/drawing/2016/5/13/chartex" xmlns:cx8="http://schemas.microsoft.com/office/drawing/2016/5/14/chartex" xmlns:mc="http://schemas.openxmlformats.org/markup-compatibility/2006" xmlns:aink="http://schemas.microsoft.com/office/drawing/2016/ink" xmlns:am3d="http://schemas.microsoft.com/office/drawing/2017/model3d" xmlns:o="urn:schemas-microsoft-com:office:office" xmlns:oel="http://schemas.microsoft.com/office/2019/extlst" xmlns:r="http://schemas.openxmlformats.org/officeDocument/2006/relationships" xmlns:m="http://schemas.openxmlformats.org/officeDocument/2006/math" xmlns:v="urn:schemas-microsoft-com:vml" xmlns:wp14="http://schemas.microsoft.com/office/word/2010/wordprocessingDrawing" xmlns:wp="http://schemas.openxmlformats.org/drawingml/2006/wordprocessingDrawing" xmlns:w10="urn:schemas-microsoft-com:office:word" xmlns:w="http://schemas.openxmlformats.org/wordprocessingml/2006/main" xmlns:w14="http://schemas.microsoft.com/office/word/2010/wordml" xmlns:w15="http://schemas.microsoft.com/office/word/2012/wordml" xmlns:w16cei="http://schemas.microsoft.com/office/word/2026/wordml/cei" xmlns:w16cex="http://schemas.microsoft.com/office/word/2018/wordml/cex" xmlns:w16cid="http://schemas.microsoft.com/office/word/2016/wordml/cid" xmlns:w16="http://schemas.microsoft.com/office/word/2018/wordml" xmlns:w16du="http://schemas.microsoft.com/office/word/2023/wordml/word16du" xmlns:w16sdtdh="http://schemas.microsoft.com/office/word/2020/wordml/sdtdatahash" xmlns:w16sdtfl="http://schemas.microsoft.com/office/word/2024/wordml/sdtformatlock" xmlns:w16se="http://schemas.microsoft.com/office/word/2015/wordml/symex" xmlns:wpg="http://schemas.microsoft.com/office/word/2010/wordprocessingGroup" xmlns:wpi="http://schemas.microsoft.com/office/word/2010/wordprocessingInk" xmlns:wne="http://schemas.microsoft.com/office/word/2006/wordml" xmlns:wps="http://schemas.microsoft.com/office/word/2010/wordprocessingShape" mc:Ignorable="w14 w15 w16se w16cid w16 w16cex w16sdtdh w16sdtfl w16du wp14">
   <w:body>
     <w:p>
       <w:r>
@@ -28,9 +28,9 @@
         <w:tblLook w:val="04A0" w:firstRow="1" w:lastRow="0" w:firstColumn="1" w:lastColumn="0" w:noHBand="0" w:noVBand="1"/>
       </w:tblPr>
       <w:tblGrid>
-        <w:gridCol w:w="1924"/>
-        <w:gridCol w:w="1984"/>
-        <w:gridCol w:w="5102"/>
+        <w:gridCol w:w="2412"/>
+        <w:gridCol w:w="2112"/>
+        <w:gridCol w:w="4486"/>
       </w:tblGrid>
       <w:tr>
         <w:trPr>
@@ -146,6 +146,10 @@
           </w:tcPr>
           <w:p>
             <w:r>
+              <w:rPr>
+                <w:b/>
+                <w:bCs/>
+              </w:rPr>
               <w:t>id</w:t>
             </w:r>
           </w:p>
@@ -224,6 +228,10 @@
           <w:p>
             <w:proofErr w:type="spellStart"/>
             <w:r>
+              <w:rPr>
+                <w:b/>
+                <w:bCs/>
+              </w:rPr>
               <w:t>mod_code</w:t>
             </w:r>
             <w:proofErr w:type="spellEnd"/>
@@ -315,6 +323,10 @@
           <w:p>
             <w:proofErr w:type="spellStart"/>
             <w:r>
+              <w:rPr>
+                <w:b/>
+                <w:bCs/>
+              </w:rPr>
               <w:t>mod_name</w:t>
             </w:r>
             <w:proofErr w:type="spellEnd"/>
@@ -405,6 +417,10 @@
           </w:tcPr>
           <w:p>
             <w:r>
+              <w:rPr>
+                <w:b/>
+                <w:bCs/>
+              </w:rPr>
               <w:t>prerequisites</w:t>
             </w:r>
           </w:p>
@@ -494,6 +510,10 @@
           </w:tcPr>
           <w:p>
             <w:r>
+              <w:rPr>
+                <w:b/>
+                <w:bCs/>
+              </w:rPr>
               <w:t>corequisites</w:t>
             </w:r>
           </w:p>
@@ -555,11 +575,297 @@
                 <w:bCs/>
               </w:rPr>
               <w:t>Defaults to 'None'</w:t>
+            </w:r>
+          </w:p>
+        </w:tc>
+      </w:tr>
+      <w:tr>
+        <w:trPr>
+          <w:tblCellSpacing w:w="15" w:type="dxa"/>
+        </w:trPr>
+        <w:tc>
+          <w:tcPr>
+            <w:tcW w:w="0" w:type="auto"/>
+            <w:tcBorders>
+              <w:top w:val="single" w:sz="6" w:space="0" w:color="C4C7C5"/>
+              <w:left w:val="single" w:sz="6" w:space="0" w:color="C4C7C5"/>
+              <w:bottom w:val="single" w:sz="6" w:space="0" w:color="C4C7C5"/>
+              <w:right w:val="single" w:sz="6" w:space="0" w:color="C4C7C5"/>
+            </w:tcBorders>
+            <w:tcMar>
+              <w:top w:w="120" w:type="dxa"/>
+              <w:left w:w="180" w:type="dxa"/>
+              <w:bottom w:w="120" w:type="dxa"/>
+              <w:right w:w="180" w:type="dxa"/>
+            </w:tcMar>
+            <w:vAlign w:val="center"/>
+            <w:hideMark/>
+          </w:tcPr>
+          <w:p>
+            <w:proofErr w:type="spellStart"/>
+            <w:r>
+              <w:rPr>
+                <w:b/>
+                <w:bCs/>
+              </w:rPr>
+              <w:t>learning_outcome</w:t>
+            </w:r>
+            <w:proofErr w:type="spellEnd"/>
+          </w:p>
+        </w:tc>
+        <w:tc>
+          <w:tcPr>
+            <w:tcW w:w="0" w:type="auto"/>
+            <w:tcBorders>
+              <w:top w:val="single" w:sz="6" w:space="0" w:color="C4C7C5"/>
+              <w:left w:val="single" w:sz="6" w:space="0" w:color="C4C7C5"/>
+              <w:bottom w:val="single" w:sz="6" w:space="0" w:color="C4C7C5"/>
+              <w:right w:val="single" w:sz="6" w:space="0" w:color="C4C7C5"/>
+            </w:tcBorders>
+            <w:tcMar>
+              <w:top w:w="120" w:type="dxa"/>
+              <w:left w:w="180" w:type="dxa"/>
+              <w:bottom w:w="120" w:type="dxa"/>
+              <w:right w:w="180" w:type="dxa"/>
+            </w:tcMar>
+            <w:vAlign w:val="center"/>
+            <w:hideMark/>
+          </w:tcPr>
+          <w:p>
+            <w:proofErr w:type="gramStart"/>
+            <w:r>
+              <w:t>VARCHAR(</w:t>
+            </w:r>
+            <w:proofErr w:type="gramEnd"/>
+            <w:r>
+              <w:t>2000)</w:t>
+            </w:r>
+          </w:p>
+        </w:tc>
+        <w:tc>
+          <w:tcPr>
+            <w:tcW w:w="0" w:type="auto"/>
+            <w:tcBorders>
+              <w:top w:val="single" w:sz="6" w:space="0" w:color="C4C7C5"/>
+              <w:left w:val="single" w:sz="6" w:space="0" w:color="C4C7C5"/>
+              <w:bottom w:val="single" w:sz="6" w:space="0" w:color="C4C7C5"/>
+              <w:right w:val="single" w:sz="6" w:space="0" w:color="C4C7C5"/>
+            </w:tcBorders>
+            <w:tcMar>
+              <w:top w:w="120" w:type="dxa"/>
+              <w:left w:w="180" w:type="dxa"/>
+              <w:bottom w:w="120" w:type="dxa"/>
+              <w:right w:w="180" w:type="dxa"/>
+            </w:tcMar>
+            <w:vAlign w:val="center"/>
+            <w:hideMark/>
+          </w:tcPr>
+          <w:p>
+            <w:r>
+              <w:t xml:space="preserve">Intended learning outcomes for the module. </w:t>
+            </w:r>
+            <w:r>
+              <w:rPr>
+                <w:b/>
+                <w:bCs/>
+              </w:rPr>
+              <w:t>Cannot be empty. Defaults to 'None'</w:t>
+            </w:r>
+          </w:p>
+        </w:tc>
+      </w:tr>
+      <w:tr>
+        <w:trPr>
+          <w:tblCellSpacing w:w="15" w:type="dxa"/>
+        </w:trPr>
+        <w:tc>
+          <w:tcPr>
+            <w:tcW w:w="0" w:type="auto"/>
+            <w:tcBorders>
+              <w:top w:val="single" w:sz="6" w:space="0" w:color="C4C7C5"/>
+              <w:left w:val="single" w:sz="6" w:space="0" w:color="C4C7C5"/>
+              <w:bottom w:val="single" w:sz="6" w:space="0" w:color="C4C7C5"/>
+              <w:right w:val="single" w:sz="6" w:space="0" w:color="C4C7C5"/>
+            </w:tcBorders>
+            <w:tcMar>
+              <w:top w:w="120" w:type="dxa"/>
+              <w:left w:w="180" w:type="dxa"/>
+              <w:bottom w:w="120" w:type="dxa"/>
+              <w:right w:w="180" w:type="dxa"/>
+            </w:tcMar>
+            <w:vAlign w:val="center"/>
+            <w:hideMark/>
+          </w:tcPr>
+          <w:p>
+            <w:proofErr w:type="spellStart"/>
+            <w:r>
+              <w:rPr>
+                <w:b/>
+                <w:bCs/>
+              </w:rPr>
+              <w:t>main_content</w:t>
+            </w:r>
+            <w:proofErr w:type="spellEnd"/>
+          </w:p>
+        </w:tc>
+        <w:tc>
+          <w:tcPr>
+            <w:tcW w:w="0" w:type="auto"/>
+            <w:tcBorders>
+              <w:top w:val="single" w:sz="6" w:space="0" w:color="C4C7C5"/>
+              <w:left w:val="single" w:sz="6" w:space="0" w:color="C4C7C5"/>
+              <w:bottom w:val="single" w:sz="6" w:space="0" w:color="C4C7C5"/>
+              <w:right w:val="single" w:sz="6" w:space="0" w:color="C4C7C5"/>
+            </w:tcBorders>
+            <w:tcMar>
+              <w:top w:w="120" w:type="dxa"/>
+              <w:left w:w="180" w:type="dxa"/>
+              <w:bottom w:w="120" w:type="dxa"/>
+              <w:right w:w="180" w:type="dxa"/>
+            </w:tcMar>
+            <w:vAlign w:val="center"/>
+            <w:hideMark/>
+          </w:tcPr>
+          <w:p>
+            <w:proofErr w:type="gramStart"/>
+            <w:r>
+              <w:t>VARCHAR(</w:t>
+            </w:r>
+            <w:proofErr w:type="gramEnd"/>
+            <w:r>
+              <w:t>2000)</w:t>
+            </w:r>
+          </w:p>
+        </w:tc>
+        <w:tc>
+          <w:tcPr>
+            <w:tcW w:w="0" w:type="auto"/>
+            <w:tcBorders>
+              <w:top w:val="single" w:sz="6" w:space="0" w:color="C4C7C5"/>
+              <w:left w:val="single" w:sz="6" w:space="0" w:color="C4C7C5"/>
+              <w:bottom w:val="single" w:sz="6" w:space="0" w:color="C4C7C5"/>
+              <w:right w:val="single" w:sz="6" w:space="0" w:color="C4C7C5"/>
+            </w:tcBorders>
+            <w:tcMar>
+              <w:top w:w="120" w:type="dxa"/>
+              <w:left w:w="180" w:type="dxa"/>
+              <w:bottom w:w="120" w:type="dxa"/>
+              <w:right w:w="180" w:type="dxa"/>
+            </w:tcMar>
+            <w:vAlign w:val="center"/>
+            <w:hideMark/>
+          </w:tcPr>
+          <w:p>
+            <w:r>
+              <w:t xml:space="preserve">Key syllabus content covered in the module. </w:t>
+            </w:r>
+            <w:r>
+              <w:rPr>
+                <w:b/>
+                <w:bCs/>
+              </w:rPr>
+              <w:t>Cannot be empty. Defaults to 'None'</w:t>
+            </w:r>
+          </w:p>
+        </w:tc>
+      </w:tr>
+      <w:tr>
+        <w:trPr>
+          <w:tblCellSpacing w:w="15" w:type="dxa"/>
+        </w:trPr>
+        <w:tc>
+          <w:tcPr>
+            <w:tcW w:w="0" w:type="auto"/>
+            <w:tcBorders>
+              <w:top w:val="single" w:sz="6" w:space="0" w:color="C4C7C5"/>
+              <w:left w:val="single" w:sz="6" w:space="0" w:color="C4C7C5"/>
+              <w:bottom w:val="single" w:sz="6" w:space="0" w:color="C4C7C5"/>
+              <w:right w:val="single" w:sz="6" w:space="0" w:color="C4C7C5"/>
+            </w:tcBorders>
+            <w:tcMar>
+              <w:top w:w="120" w:type="dxa"/>
+              <w:left w:w="180" w:type="dxa"/>
+              <w:bottom w:w="120" w:type="dxa"/>
+              <w:right w:w="180" w:type="dxa"/>
+            </w:tcMar>
+            <w:vAlign w:val="center"/>
+            <w:hideMark/>
+          </w:tcPr>
+          <w:p>
+            <w:r>
+              <w:rPr>
+                <w:b/>
+                <w:bCs/>
+              </w:rPr>
+              <w:t>credits</w:t>
+            </w:r>
+          </w:p>
+        </w:tc>
+        <w:tc>
+          <w:tcPr>
+            <w:tcW w:w="0" w:type="auto"/>
+            <w:tcBorders>
+              <w:top w:val="single" w:sz="6" w:space="0" w:color="C4C7C5"/>
+              <w:left w:val="single" w:sz="6" w:space="0" w:color="C4C7C5"/>
+              <w:bottom w:val="single" w:sz="6" w:space="0" w:color="C4C7C5"/>
+              <w:right w:val="single" w:sz="6" w:space="0" w:color="C4C7C5"/>
+            </w:tcBorders>
+            <w:tcMar>
+              <w:top w:w="120" w:type="dxa"/>
+              <w:left w:w="180" w:type="dxa"/>
+              <w:bottom w:w="120" w:type="dxa"/>
+              <w:right w:w="180" w:type="dxa"/>
+            </w:tcMar>
+            <w:vAlign w:val="center"/>
+            <w:hideMark/>
+          </w:tcPr>
+          <w:p>
+            <w:proofErr w:type="gramStart"/>
+            <w:r>
+              <w:t>VARCHAR(</w:t>
+            </w:r>
+            <w:proofErr w:type="gramEnd"/>
+            <w:r>
+              <w:t>20)</w:t>
+            </w:r>
+          </w:p>
+        </w:tc>
+        <w:tc>
+          <w:tcPr>
+            <w:tcW w:w="0" w:type="auto"/>
+            <w:tcBorders>
+              <w:top w:val="single" w:sz="6" w:space="0" w:color="C4C7C5"/>
+              <w:left w:val="single" w:sz="6" w:space="0" w:color="C4C7C5"/>
+              <w:bottom w:val="single" w:sz="6" w:space="0" w:color="C4C7C5"/>
+              <w:right w:val="single" w:sz="6" w:space="0" w:color="C4C7C5"/>
+            </w:tcBorders>
+            <w:tcMar>
+              <w:top w:w="120" w:type="dxa"/>
+              <w:left w:w="180" w:type="dxa"/>
+              <w:bottom w:w="120" w:type="dxa"/>
+              <w:right w:w="180" w:type="dxa"/>
+            </w:tcMar>
+            <w:vAlign w:val="center"/>
+            <w:hideMark/>
+          </w:tcPr>
+          <w:p>
+            <w:r>
+              <w:t xml:space="preserve">Academic credit value (e.g., '12' or '10*'). </w:t>
+            </w:r>
+            <w:r>
+              <w:rPr>
+                <w:b/>
+                <w:bCs/>
+              </w:rPr>
+              <w:t>Cannot be empty. Defaults to 'None'</w:t>
             </w:r>
           </w:p>
         </w:tc>
       </w:tr>
     </w:tbl>
+    <w:p/>
+    <w:p/>
+    <w:p/>
     <w:p/>
     <w:p/>
     <w:p>
@@ -570,6 +876,7 @@
         </w:rPr>
       </w:pPr>
       <w:r>
+        <w:lastRenderedPageBreak/>
         <w:t xml:space="preserve">Table name: </w:t>
       </w:r>
       <w:r>
@@ -1034,6 +1341,22 @@
         </w:tc>
       </w:tr>
     </w:tbl>
+    <w:p/>
+    <w:p/>
+    <w:p/>
+    <w:p/>
+    <w:p/>
+    <w:p/>
+    <w:p/>
+    <w:p/>
+    <w:p/>
+    <w:p/>
+    <w:p/>
+    <w:p/>
+    <w:p/>
+    <w:p/>
+    <w:p/>
+    <w:p/>
     <w:p>
       <w:r>
         <w:lastRenderedPageBreak/>
@@ -4706,7 +5029,6 @@
   <w:style w:type="character" w:default="1" w:styleId="DefaultParagraphFont">
     <w:name w:val="Default Paragraph Font"/>
     <w:uiPriority w:val="1"/>
-    <w:semiHidden/>
     <w:unhideWhenUsed/>
   </w:style>
   <w:style w:type="table" w:default="1" w:styleId="TableNormal">
@@ -5018,6 +5340,30 @@
       <w:smallCaps/>
       <w:color w:val="0F4761" w:themeColor="accent1" w:themeShade="BF"/>
       <w:spacing w:val="5"/>
+    </w:rPr>
+  </w:style>
+  <w:style w:type="character" w:styleId="HTMLCode">
+    <w:name w:val="HTML Code"/>
+    <w:basedOn w:val="DefaultParagraphFont"/>
+    <w:uiPriority w:val="99"/>
+    <w:semiHidden/>
+    <w:unhideWhenUsed/>
+    <w:rsid w:val="00C93FFE"/>
+    <w:rPr>
+      <w:rFonts w:ascii="Courier New" w:eastAsia="Times New Roman" w:hAnsi="Courier New" w:cs="Courier New"/>
+      <w:sz w:val="20"/>
+      <w:szCs w:val="20"/>
+    </w:rPr>
+  </w:style>
+  <w:style w:type="character" w:styleId="Strong">
+    <w:name w:val="Strong"/>
+    <w:basedOn w:val="DefaultParagraphFont"/>
+    <w:uiPriority w:val="22"/>
+    <w:qFormat/>
+    <w:rsid w:val="00C93FFE"/>
+    <w:rPr>
+      <w:b/>
+      <w:bCs/>
     </w:rPr>
   </w:style>
 </w:styles>

</xml_diff>

<commit_message>
I have included all faculties
</commit_message>
<xml_diff>
--- a/DATABASE/Data dictionary/Database Tables.docx
+++ b/DATABASE/Data dictionary/Database Tables.docx
@@ -1,6 +1,6 @@
 
 <file path=word/document.xml><?xml version="1.0" encoding="utf-8"?>
-<w:document xmlns:wpc="http://schemas.microsoft.com/office/word/2010/wordprocessingCanvas" xmlns:cx="http://schemas.microsoft.com/office/drawing/2014/chartex" xmlns:cx1="http://schemas.microsoft.com/office/drawing/2015/9/8/chartex" xmlns:cx2="http://schemas.microsoft.com/office/drawing/2015/10/21/chartex" xmlns:cx3="http://schemas.microsoft.com/office/drawing/2016/5/9/chartex" xmlns:cx4="http://schemas.microsoft.com/office/drawing/2016/5/10/chartex" xmlns:cx5="http://schemas.microsoft.com/office/drawing/2016/5/11/chartex" xmlns:cx6="http://schemas.microsoft.com/office/drawing/2016/5/12/chartex" xmlns:cx7="http://schemas.microsoft.com/office/drawing/2016/5/13/chartex" xmlns:cx8="http://schemas.microsoft.com/office/drawing/2016/5/14/chartex" xmlns:mc="http://schemas.openxmlformats.org/markup-compatibility/2006" xmlns:aink="http://schemas.microsoft.com/office/drawing/2016/ink" xmlns:am3d="http://schemas.microsoft.com/office/drawing/2017/model3d" xmlns:o="urn:schemas-microsoft-com:office:office" xmlns:oel="http://schemas.microsoft.com/office/2019/extlst" xmlns:r="http://schemas.openxmlformats.org/officeDocument/2006/relationships" xmlns:m="http://schemas.openxmlformats.org/officeDocument/2006/math" xmlns:v="urn:schemas-microsoft-com:vml" xmlns:wp14="http://schemas.microsoft.com/office/word/2010/wordprocessingDrawing" xmlns:wp="http://schemas.openxmlformats.org/drawingml/2006/wordprocessingDrawing" xmlns:w10="urn:schemas-microsoft-com:office:word" xmlns:w="http://schemas.openxmlformats.org/wordprocessingml/2006/main" xmlns:w14="http://schemas.microsoft.com/office/word/2010/wordml" xmlns:w15="http://schemas.microsoft.com/office/word/2012/wordml" xmlns:w16cei="http://schemas.microsoft.com/office/word/2026/wordml/cei" xmlns:w16cex="http://schemas.microsoft.com/office/word/2018/wordml/cex" xmlns:w16cid="http://schemas.microsoft.com/office/word/2016/wordml/cid" xmlns:w16="http://schemas.microsoft.com/office/word/2018/wordml" xmlns:w16du="http://schemas.microsoft.com/office/word/2023/wordml/word16du" xmlns:w16sdtdh="http://schemas.microsoft.com/office/word/2020/wordml/sdtdatahash" xmlns:w16sdtfl="http://schemas.microsoft.com/office/word/2024/wordml/sdtformatlock" xmlns:w16se="http://schemas.microsoft.com/office/word/2015/wordml/symex" xmlns:wpg="http://schemas.microsoft.com/office/word/2010/wordprocessingGroup" xmlns:wpi="http://schemas.microsoft.com/office/word/2010/wordprocessingInk" xmlns:wne="http://schemas.microsoft.com/office/word/2006/wordml" xmlns:wps="http://schemas.microsoft.com/office/word/2010/wordprocessingShape" mc:Ignorable="w14 w15 w16se w16cid w16 w16cex w16sdtdh w16sdtfl w16du wp14">
+<w:document xmlns:wpc="http://schemas.microsoft.com/office/word/2010/wordprocessingCanvas" xmlns:cx="http://schemas.microsoft.com/office/drawing/2014/chartex" xmlns:cx1="http://schemas.microsoft.com/office/drawing/2015/9/8/chartex" xmlns:cx2="http://schemas.microsoft.com/office/drawing/2015/10/21/chartex" xmlns:cx3="http://schemas.microsoft.com/office/drawing/2016/5/9/chartex" xmlns:cx4="http://schemas.microsoft.com/office/drawing/2016/5/10/chartex" xmlns:cx5="http://schemas.microsoft.com/office/drawing/2016/5/11/chartex" xmlns:cx6="http://schemas.microsoft.com/office/drawing/2016/5/12/chartex" xmlns:cx7="http://schemas.microsoft.com/office/drawing/2016/5/13/chartex" xmlns:cx8="http://schemas.microsoft.com/office/drawing/2016/5/14/chartex" xmlns:mc="http://schemas.openxmlformats.org/markup-compatibility/2006" xmlns:aink="http://schemas.microsoft.com/office/drawing/2016/ink" xmlns:am3d="http://schemas.microsoft.com/office/drawing/2017/model3d" xmlns:o="urn:schemas-microsoft-com:office:office" xmlns:oel="http://schemas.microsoft.com/office/2019/extlst" xmlns:r="http://schemas.openxmlformats.org/officeDocument/2006/relationships" xmlns:m="http://schemas.openxmlformats.org/officeDocument/2006/math" xmlns:v="urn:schemas-microsoft-com:vml" xmlns:wp14="http://schemas.microsoft.com/office/word/2010/wordprocessingDrawing" xmlns:wp="http://schemas.openxmlformats.org/drawingml/2006/wordprocessingDrawing" xmlns:w10="urn:schemas-microsoft-com:office:word" xmlns:w="http://schemas.openxmlformats.org/wordprocessingml/2006/main" xmlns:w14="http://schemas.microsoft.com/office/word/2010/wordml" xmlns:w15="http://schemas.microsoft.com/office/word/2012/wordml" xmlns:w16cex="http://schemas.microsoft.com/office/word/2018/wordml/cex" xmlns:w16cid="http://schemas.microsoft.com/office/word/2016/wordml/cid" xmlns:w16="http://schemas.microsoft.com/office/word/2018/wordml" xmlns:w16du="http://schemas.microsoft.com/office/word/2023/wordml/word16du" xmlns:w16sdtdh="http://schemas.microsoft.com/office/word/2020/wordml/sdtdatahash" xmlns:w16sdtfl="http://schemas.microsoft.com/office/word/2024/wordml/sdtformatlock" xmlns:w16se="http://schemas.microsoft.com/office/word/2015/wordml/symex" xmlns:wpg="http://schemas.microsoft.com/office/word/2010/wordprocessingGroup" xmlns:wpi="http://schemas.microsoft.com/office/word/2010/wordprocessingInk" xmlns:wne="http://schemas.microsoft.com/office/word/2006/wordml" xmlns:wps="http://schemas.microsoft.com/office/word/2010/wordprocessingShape" mc:Ignorable="w14 w15 w16se w16cid w16 w16cex w16sdtdh w16sdtfl w16du wp14">
   <w:body>
     <w:p>
       <w:r>
@@ -226,7 +226,6 @@
             <w:hideMark/>
           </w:tcPr>
           <w:p>
-            <w:proofErr w:type="spellStart"/>
             <w:r>
               <w:rPr>
                 <w:b/>
@@ -234,35 +233,29 @@
               </w:rPr>
               <w:t>mod_code</w:t>
             </w:r>
-            <w:proofErr w:type="spellEnd"/>
-          </w:p>
-        </w:tc>
-        <w:tc>
-          <w:tcPr>
-            <w:tcW w:w="0" w:type="auto"/>
-            <w:tcBorders>
-              <w:top w:val="single" w:sz="6" w:space="0" w:color="C4C7C5"/>
-              <w:left w:val="single" w:sz="6" w:space="0" w:color="C4C7C5"/>
-              <w:bottom w:val="single" w:sz="6" w:space="0" w:color="C4C7C5"/>
-              <w:right w:val="single" w:sz="6" w:space="0" w:color="C4C7C5"/>
-            </w:tcBorders>
-            <w:tcMar>
-              <w:top w:w="120" w:type="dxa"/>
-              <w:left w:w="180" w:type="dxa"/>
-              <w:bottom w:w="120" w:type="dxa"/>
-              <w:right w:w="180" w:type="dxa"/>
-            </w:tcMar>
-            <w:vAlign w:val="center"/>
-            <w:hideMark/>
-          </w:tcPr>
-          <w:p>
-            <w:proofErr w:type="gramStart"/>
-            <w:r>
-              <w:t>VARCHAR(</w:t>
-            </w:r>
-            <w:proofErr w:type="gramEnd"/>
-            <w:r>
-              <w:t>15)</w:t>
+          </w:p>
+        </w:tc>
+        <w:tc>
+          <w:tcPr>
+            <w:tcW w:w="0" w:type="auto"/>
+            <w:tcBorders>
+              <w:top w:val="single" w:sz="6" w:space="0" w:color="C4C7C5"/>
+              <w:left w:val="single" w:sz="6" w:space="0" w:color="C4C7C5"/>
+              <w:bottom w:val="single" w:sz="6" w:space="0" w:color="C4C7C5"/>
+              <w:right w:val="single" w:sz="6" w:space="0" w:color="C4C7C5"/>
+            </w:tcBorders>
+            <w:tcMar>
+              <w:top w:w="120" w:type="dxa"/>
+              <w:left w:w="180" w:type="dxa"/>
+              <w:bottom w:w="120" w:type="dxa"/>
+              <w:right w:w="180" w:type="dxa"/>
+            </w:tcMar>
+            <w:vAlign w:val="center"/>
+            <w:hideMark/>
+          </w:tcPr>
+          <w:p>
+            <w:r>
+              <w:t>VARCHAR(15)</w:t>
             </w:r>
           </w:p>
         </w:tc>
@@ -321,7 +314,6 @@
             <w:hideMark/>
           </w:tcPr>
           <w:p>
-            <w:proofErr w:type="spellStart"/>
             <w:r>
               <w:rPr>
                 <w:b/>
@@ -329,35 +321,29 @@
               </w:rPr>
               <w:t>mod_name</w:t>
             </w:r>
-            <w:proofErr w:type="spellEnd"/>
-          </w:p>
-        </w:tc>
-        <w:tc>
-          <w:tcPr>
-            <w:tcW w:w="0" w:type="auto"/>
-            <w:tcBorders>
-              <w:top w:val="single" w:sz="6" w:space="0" w:color="C4C7C5"/>
-              <w:left w:val="single" w:sz="6" w:space="0" w:color="C4C7C5"/>
-              <w:bottom w:val="single" w:sz="6" w:space="0" w:color="C4C7C5"/>
-              <w:right w:val="single" w:sz="6" w:space="0" w:color="C4C7C5"/>
-            </w:tcBorders>
-            <w:tcMar>
-              <w:top w:w="120" w:type="dxa"/>
-              <w:left w:w="180" w:type="dxa"/>
-              <w:bottom w:w="120" w:type="dxa"/>
-              <w:right w:w="180" w:type="dxa"/>
-            </w:tcMar>
-            <w:vAlign w:val="center"/>
-            <w:hideMark/>
-          </w:tcPr>
-          <w:p>
-            <w:proofErr w:type="gramStart"/>
-            <w:r>
-              <w:t>VARCHAR(</w:t>
-            </w:r>
-            <w:proofErr w:type="gramEnd"/>
-            <w:r>
-              <w:t>127)</w:t>
+          </w:p>
+        </w:tc>
+        <w:tc>
+          <w:tcPr>
+            <w:tcW w:w="0" w:type="auto"/>
+            <w:tcBorders>
+              <w:top w:val="single" w:sz="6" w:space="0" w:color="C4C7C5"/>
+              <w:left w:val="single" w:sz="6" w:space="0" w:color="C4C7C5"/>
+              <w:bottom w:val="single" w:sz="6" w:space="0" w:color="C4C7C5"/>
+              <w:right w:val="single" w:sz="6" w:space="0" w:color="C4C7C5"/>
+            </w:tcBorders>
+            <w:tcMar>
+              <w:top w:w="120" w:type="dxa"/>
+              <w:left w:w="180" w:type="dxa"/>
+              <w:bottom w:w="120" w:type="dxa"/>
+              <w:right w:w="180" w:type="dxa"/>
+            </w:tcMar>
+            <w:vAlign w:val="center"/>
+            <w:hideMark/>
+          </w:tcPr>
+          <w:p>
+            <w:r>
+              <w:t>VARCHAR(127)</w:t>
             </w:r>
           </w:p>
         </w:tc>
@@ -444,13 +430,8 @@
             <w:hideMark/>
           </w:tcPr>
           <w:p>
-            <w:proofErr w:type="gramStart"/>
-            <w:r>
-              <w:t>VARCHAR(</w:t>
-            </w:r>
-            <w:proofErr w:type="gramEnd"/>
-            <w:r>
-              <w:t>255)</w:t>
+            <w:r>
+              <w:t>VARCHAR(255)</w:t>
             </w:r>
           </w:p>
         </w:tc>
@@ -537,13 +518,8 @@
             <w:hideMark/>
           </w:tcPr>
           <w:p>
-            <w:proofErr w:type="gramStart"/>
-            <w:r>
-              <w:t>VARCHAR(</w:t>
-            </w:r>
-            <w:proofErr w:type="gramEnd"/>
-            <w:r>
-              <w:t>255)</w:t>
+            <w:r>
+              <w:t>VARCHAR(255)</w:t>
             </w:r>
           </w:p>
         </w:tc>
@@ -602,7 +578,6 @@
             <w:hideMark/>
           </w:tcPr>
           <w:p>
-            <w:proofErr w:type="spellStart"/>
             <w:r>
               <w:rPr>
                 <w:b/>
@@ -610,35 +585,29 @@
               </w:rPr>
               <w:t>learning_outcome</w:t>
             </w:r>
-            <w:proofErr w:type="spellEnd"/>
-          </w:p>
-        </w:tc>
-        <w:tc>
-          <w:tcPr>
-            <w:tcW w:w="0" w:type="auto"/>
-            <w:tcBorders>
-              <w:top w:val="single" w:sz="6" w:space="0" w:color="C4C7C5"/>
-              <w:left w:val="single" w:sz="6" w:space="0" w:color="C4C7C5"/>
-              <w:bottom w:val="single" w:sz="6" w:space="0" w:color="C4C7C5"/>
-              <w:right w:val="single" w:sz="6" w:space="0" w:color="C4C7C5"/>
-            </w:tcBorders>
-            <w:tcMar>
-              <w:top w:w="120" w:type="dxa"/>
-              <w:left w:w="180" w:type="dxa"/>
-              <w:bottom w:w="120" w:type="dxa"/>
-              <w:right w:w="180" w:type="dxa"/>
-            </w:tcMar>
-            <w:vAlign w:val="center"/>
-            <w:hideMark/>
-          </w:tcPr>
-          <w:p>
-            <w:proofErr w:type="gramStart"/>
-            <w:r>
-              <w:t>VARCHAR(</w:t>
-            </w:r>
-            <w:proofErr w:type="gramEnd"/>
-            <w:r>
-              <w:t>2000)</w:t>
+          </w:p>
+        </w:tc>
+        <w:tc>
+          <w:tcPr>
+            <w:tcW w:w="0" w:type="auto"/>
+            <w:tcBorders>
+              <w:top w:val="single" w:sz="6" w:space="0" w:color="C4C7C5"/>
+              <w:left w:val="single" w:sz="6" w:space="0" w:color="C4C7C5"/>
+              <w:bottom w:val="single" w:sz="6" w:space="0" w:color="C4C7C5"/>
+              <w:right w:val="single" w:sz="6" w:space="0" w:color="C4C7C5"/>
+            </w:tcBorders>
+            <w:tcMar>
+              <w:top w:w="120" w:type="dxa"/>
+              <w:left w:w="180" w:type="dxa"/>
+              <w:bottom w:w="120" w:type="dxa"/>
+              <w:right w:w="180" w:type="dxa"/>
+            </w:tcMar>
+            <w:vAlign w:val="center"/>
+            <w:hideMark/>
+          </w:tcPr>
+          <w:p>
+            <w:r>
+              <w:t>VARCHAR(2000)</w:t>
             </w:r>
           </w:p>
         </w:tc>
@@ -697,7 +666,6 @@
             <w:hideMark/>
           </w:tcPr>
           <w:p>
-            <w:proofErr w:type="spellStart"/>
             <w:r>
               <w:rPr>
                 <w:b/>
@@ -705,35 +673,29 @@
               </w:rPr>
               <w:t>main_content</w:t>
             </w:r>
-            <w:proofErr w:type="spellEnd"/>
-          </w:p>
-        </w:tc>
-        <w:tc>
-          <w:tcPr>
-            <w:tcW w:w="0" w:type="auto"/>
-            <w:tcBorders>
-              <w:top w:val="single" w:sz="6" w:space="0" w:color="C4C7C5"/>
-              <w:left w:val="single" w:sz="6" w:space="0" w:color="C4C7C5"/>
-              <w:bottom w:val="single" w:sz="6" w:space="0" w:color="C4C7C5"/>
-              <w:right w:val="single" w:sz="6" w:space="0" w:color="C4C7C5"/>
-            </w:tcBorders>
-            <w:tcMar>
-              <w:top w:w="120" w:type="dxa"/>
-              <w:left w:w="180" w:type="dxa"/>
-              <w:bottom w:w="120" w:type="dxa"/>
-              <w:right w:w="180" w:type="dxa"/>
-            </w:tcMar>
-            <w:vAlign w:val="center"/>
-            <w:hideMark/>
-          </w:tcPr>
-          <w:p>
-            <w:proofErr w:type="gramStart"/>
-            <w:r>
-              <w:t>VARCHAR(</w:t>
-            </w:r>
-            <w:proofErr w:type="gramEnd"/>
-            <w:r>
-              <w:t>2000)</w:t>
+          </w:p>
+        </w:tc>
+        <w:tc>
+          <w:tcPr>
+            <w:tcW w:w="0" w:type="auto"/>
+            <w:tcBorders>
+              <w:top w:val="single" w:sz="6" w:space="0" w:color="C4C7C5"/>
+              <w:left w:val="single" w:sz="6" w:space="0" w:color="C4C7C5"/>
+              <w:bottom w:val="single" w:sz="6" w:space="0" w:color="C4C7C5"/>
+              <w:right w:val="single" w:sz="6" w:space="0" w:color="C4C7C5"/>
+            </w:tcBorders>
+            <w:tcMar>
+              <w:top w:w="120" w:type="dxa"/>
+              <w:left w:w="180" w:type="dxa"/>
+              <w:bottom w:w="120" w:type="dxa"/>
+              <w:right w:w="180" w:type="dxa"/>
+            </w:tcMar>
+            <w:vAlign w:val="center"/>
+            <w:hideMark/>
+          </w:tcPr>
+          <w:p>
+            <w:r>
+              <w:t>VARCHAR(2000)</w:t>
             </w:r>
           </w:p>
         </w:tc>
@@ -820,13 +782,8 @@
             <w:hideMark/>
           </w:tcPr>
           <w:p>
-            <w:proofErr w:type="gramStart"/>
-            <w:r>
-              <w:t>VARCHAR(</w:t>
-            </w:r>
-            <w:proofErr w:type="gramEnd"/>
-            <w:r>
-              <w:t>20)</w:t>
+            <w:r>
+              <w:t>VARCHAR(20)</w:t>
             </w:r>
           </w:p>
         </w:tc>
@@ -1092,39 +1049,32 @@
             <w:hideMark/>
           </w:tcPr>
           <w:p>
-            <w:proofErr w:type="spellStart"/>
             <w:r>
               <w:t>fac_name</w:t>
             </w:r>
-            <w:proofErr w:type="spellEnd"/>
-          </w:p>
-        </w:tc>
-        <w:tc>
-          <w:tcPr>
-            <w:tcW w:w="0" w:type="auto"/>
-            <w:tcBorders>
-              <w:top w:val="single" w:sz="6" w:space="0" w:color="C4C7C5"/>
-              <w:left w:val="single" w:sz="6" w:space="0" w:color="C4C7C5"/>
-              <w:bottom w:val="single" w:sz="6" w:space="0" w:color="C4C7C5"/>
-              <w:right w:val="single" w:sz="6" w:space="0" w:color="C4C7C5"/>
-            </w:tcBorders>
-            <w:tcMar>
-              <w:top w:w="120" w:type="dxa"/>
-              <w:left w:w="180" w:type="dxa"/>
-              <w:bottom w:w="120" w:type="dxa"/>
-              <w:right w:w="180" w:type="dxa"/>
-            </w:tcMar>
-            <w:vAlign w:val="center"/>
-            <w:hideMark/>
-          </w:tcPr>
-          <w:p>
-            <w:proofErr w:type="gramStart"/>
-            <w:r>
-              <w:t>VARCHAR(</w:t>
-            </w:r>
-            <w:proofErr w:type="gramEnd"/>
-            <w:r>
-              <w:t>63)</w:t>
+          </w:p>
+        </w:tc>
+        <w:tc>
+          <w:tcPr>
+            <w:tcW w:w="0" w:type="auto"/>
+            <w:tcBorders>
+              <w:top w:val="single" w:sz="6" w:space="0" w:color="C4C7C5"/>
+              <w:left w:val="single" w:sz="6" w:space="0" w:color="C4C7C5"/>
+              <w:bottom w:val="single" w:sz="6" w:space="0" w:color="C4C7C5"/>
+              <w:right w:val="single" w:sz="6" w:space="0" w:color="C4C7C5"/>
+            </w:tcBorders>
+            <w:tcMar>
+              <w:top w:w="120" w:type="dxa"/>
+              <w:left w:w="180" w:type="dxa"/>
+              <w:bottom w:w="120" w:type="dxa"/>
+              <w:right w:w="180" w:type="dxa"/>
+            </w:tcMar>
+            <w:vAlign w:val="center"/>
+            <w:hideMark/>
+          </w:tcPr>
+          <w:p>
+            <w:r>
+              <w:t>VARCHAR(63)</w:t>
             </w:r>
           </w:p>
         </w:tc>
@@ -1183,11 +1133,9 @@
             <w:hideMark/>
           </w:tcPr>
           <w:p>
-            <w:proofErr w:type="spellStart"/>
             <w:r>
               <w:t>is_available</w:t>
             </w:r>
-            <w:proofErr w:type="spellEnd"/>
           </w:p>
         </w:tc>
         <w:tc>
@@ -1272,39 +1220,32 @@
             <w:hideMark/>
           </w:tcPr>
           <w:p>
-            <w:proofErr w:type="spellStart"/>
             <w:r>
               <w:t>icon_name</w:t>
             </w:r>
-            <w:proofErr w:type="spellEnd"/>
-          </w:p>
-        </w:tc>
-        <w:tc>
-          <w:tcPr>
-            <w:tcW w:w="0" w:type="auto"/>
-            <w:tcBorders>
-              <w:top w:val="single" w:sz="6" w:space="0" w:color="C4C7C5"/>
-              <w:left w:val="single" w:sz="6" w:space="0" w:color="C4C7C5"/>
-              <w:bottom w:val="single" w:sz="6" w:space="0" w:color="C4C7C5"/>
-              <w:right w:val="single" w:sz="6" w:space="0" w:color="C4C7C5"/>
-            </w:tcBorders>
-            <w:tcMar>
-              <w:top w:w="120" w:type="dxa"/>
-              <w:left w:w="180" w:type="dxa"/>
-              <w:bottom w:w="120" w:type="dxa"/>
-              <w:right w:w="180" w:type="dxa"/>
-            </w:tcMar>
-            <w:vAlign w:val="center"/>
-            <w:hideMark/>
-          </w:tcPr>
-          <w:p>
-            <w:proofErr w:type="gramStart"/>
-            <w:r>
-              <w:t>VARCHAR(</w:t>
-            </w:r>
-            <w:proofErr w:type="gramEnd"/>
-            <w:r>
-              <w:t>63)</w:t>
+          </w:p>
+        </w:tc>
+        <w:tc>
+          <w:tcPr>
+            <w:tcW w:w="0" w:type="auto"/>
+            <w:tcBorders>
+              <w:top w:val="single" w:sz="6" w:space="0" w:color="C4C7C5"/>
+              <w:left w:val="single" w:sz="6" w:space="0" w:color="C4C7C5"/>
+              <w:bottom w:val="single" w:sz="6" w:space="0" w:color="C4C7C5"/>
+              <w:right w:val="single" w:sz="6" w:space="0" w:color="C4C7C5"/>
+            </w:tcBorders>
+            <w:tcMar>
+              <w:top w:w="120" w:type="dxa"/>
+              <w:left w:w="180" w:type="dxa"/>
+              <w:bottom w:w="120" w:type="dxa"/>
+              <w:right w:w="180" w:type="dxa"/>
+            </w:tcMar>
+            <w:vAlign w:val="center"/>
+            <w:hideMark/>
+          </w:tcPr>
+          <w:p>
+            <w:r>
+              <w:t>VARCHAR(63)</w:t>
             </w:r>
           </w:p>
         </w:tc>
@@ -1609,13 +1550,8 @@
             <w:hideMark/>
           </w:tcPr>
           <w:p>
-            <w:proofErr w:type="gramStart"/>
-            <w:r>
-              <w:t>VARCHAR(</w:t>
-            </w:r>
-            <w:proofErr w:type="gramEnd"/>
-            <w:r>
-              <w:t>50)</w:t>
+            <w:r>
+              <w:t>VARCHAR(50)</w:t>
             </w:r>
           </w:p>
         </w:tc>
@@ -1667,7 +1603,6 @@
             <w:hideMark/>
           </w:tcPr>
           <w:p>
-            <w:proofErr w:type="spellStart"/>
             <w:r>
               <w:rPr>
                 <w:b/>
@@ -1675,35 +1610,29 @@
               </w:rPr>
               <w:t>student_email</w:t>
             </w:r>
-            <w:proofErr w:type="spellEnd"/>
-          </w:p>
-        </w:tc>
-        <w:tc>
-          <w:tcPr>
-            <w:tcW w:w="0" w:type="auto"/>
-            <w:tcBorders>
-              <w:top w:val="single" w:sz="6" w:space="0" w:color="C4C7C5"/>
-              <w:left w:val="single" w:sz="6" w:space="0" w:color="C4C7C5"/>
-              <w:bottom w:val="single" w:sz="6" w:space="0" w:color="C4C7C5"/>
-              <w:right w:val="single" w:sz="6" w:space="0" w:color="C4C7C5"/>
-            </w:tcBorders>
-            <w:tcMar>
-              <w:top w:w="120" w:type="dxa"/>
-              <w:left w:w="180" w:type="dxa"/>
-              <w:bottom w:w="120" w:type="dxa"/>
-              <w:right w:w="180" w:type="dxa"/>
-            </w:tcMar>
-            <w:vAlign w:val="center"/>
-            <w:hideMark/>
-          </w:tcPr>
-          <w:p>
-            <w:proofErr w:type="gramStart"/>
-            <w:r>
-              <w:t>VARCHAR(</w:t>
-            </w:r>
-            <w:proofErr w:type="gramEnd"/>
-            <w:r>
-              <w:t>100)</w:t>
+          </w:p>
+        </w:tc>
+        <w:tc>
+          <w:tcPr>
+            <w:tcW w:w="0" w:type="auto"/>
+            <w:tcBorders>
+              <w:top w:val="single" w:sz="6" w:space="0" w:color="C4C7C5"/>
+              <w:left w:val="single" w:sz="6" w:space="0" w:color="C4C7C5"/>
+              <w:bottom w:val="single" w:sz="6" w:space="0" w:color="C4C7C5"/>
+              <w:right w:val="single" w:sz="6" w:space="0" w:color="C4C7C5"/>
+            </w:tcBorders>
+            <w:tcMar>
+              <w:top w:w="120" w:type="dxa"/>
+              <w:left w:w="180" w:type="dxa"/>
+              <w:bottom w:w="120" w:type="dxa"/>
+              <w:right w:w="180" w:type="dxa"/>
+            </w:tcMar>
+            <w:vAlign w:val="center"/>
+            <w:hideMark/>
+          </w:tcPr>
+          <w:p>
+            <w:r>
+              <w:t>VARCHAR(100)</w:t>
             </w:r>
           </w:p>
         </w:tc>
@@ -1783,13 +1712,8 @@
             <w:hideMark/>
           </w:tcPr>
           <w:p>
-            <w:proofErr w:type="gramStart"/>
-            <w:r>
-              <w:t>VARCHAR(</w:t>
-            </w:r>
-            <w:proofErr w:type="gramEnd"/>
-            <w:r>
-              <w:t>255)</w:t>
+            <w:r>
+              <w:t>VARCHAR(255)</w:t>
             </w:r>
           </w:p>
         </w:tc>
@@ -1869,13 +1793,8 @@
             <w:hideMark/>
           </w:tcPr>
           <w:p>
-            <w:proofErr w:type="gramStart"/>
-            <w:r>
-              <w:t>VARCHAR(</w:t>
-            </w:r>
-            <w:proofErr w:type="gramEnd"/>
-            <w:r>
-              <w:t>20)</w:t>
+            <w:r>
+              <w:t>VARCHAR(20)</w:t>
             </w:r>
           </w:p>
         </w:tc>
@@ -1927,7 +1846,6 @@
             <w:hideMark/>
           </w:tcPr>
           <w:p>
-            <w:proofErr w:type="spellStart"/>
             <w:r>
               <w:rPr>
                 <w:b/>
@@ -1935,35 +1853,29 @@
               </w:rPr>
               <w:t>degree_program</w:t>
             </w:r>
-            <w:proofErr w:type="spellEnd"/>
-          </w:p>
-        </w:tc>
-        <w:tc>
-          <w:tcPr>
-            <w:tcW w:w="0" w:type="auto"/>
-            <w:tcBorders>
-              <w:top w:val="single" w:sz="6" w:space="0" w:color="C4C7C5"/>
-              <w:left w:val="single" w:sz="6" w:space="0" w:color="C4C7C5"/>
-              <w:bottom w:val="single" w:sz="6" w:space="0" w:color="C4C7C5"/>
-              <w:right w:val="single" w:sz="6" w:space="0" w:color="C4C7C5"/>
-            </w:tcBorders>
-            <w:tcMar>
-              <w:top w:w="120" w:type="dxa"/>
-              <w:left w:w="180" w:type="dxa"/>
-              <w:bottom w:w="120" w:type="dxa"/>
-              <w:right w:w="180" w:type="dxa"/>
-            </w:tcMar>
-            <w:vAlign w:val="center"/>
-            <w:hideMark/>
-          </w:tcPr>
-          <w:p>
-            <w:proofErr w:type="gramStart"/>
-            <w:r>
-              <w:t>VARCHAR(</w:t>
-            </w:r>
-            <w:proofErr w:type="gramEnd"/>
-            <w:r>
-              <w:t>100)</w:t>
+          </w:p>
+        </w:tc>
+        <w:tc>
+          <w:tcPr>
+            <w:tcW w:w="0" w:type="auto"/>
+            <w:tcBorders>
+              <w:top w:val="single" w:sz="6" w:space="0" w:color="C4C7C5"/>
+              <w:left w:val="single" w:sz="6" w:space="0" w:color="C4C7C5"/>
+              <w:bottom w:val="single" w:sz="6" w:space="0" w:color="C4C7C5"/>
+              <w:right w:val="single" w:sz="6" w:space="0" w:color="C4C7C5"/>
+            </w:tcBorders>
+            <w:tcMar>
+              <w:top w:w="120" w:type="dxa"/>
+              <w:left w:w="180" w:type="dxa"/>
+              <w:bottom w:w="120" w:type="dxa"/>
+              <w:right w:w="180" w:type="dxa"/>
+            </w:tcMar>
+            <w:vAlign w:val="center"/>
+            <w:hideMark/>
+          </w:tcPr>
+          <w:p>
+            <w:r>
+              <w:t>VARCHAR(100)</w:t>
             </w:r>
           </w:p>
         </w:tc>
@@ -2015,7 +1927,6 @@
             <w:hideMark/>
           </w:tcPr>
           <w:p>
-            <w:proofErr w:type="spellStart"/>
             <w:r>
               <w:rPr>
                 <w:b/>
@@ -2023,35 +1934,29 @@
               </w:rPr>
               <w:t>year_of_study</w:t>
             </w:r>
-            <w:proofErr w:type="spellEnd"/>
-          </w:p>
-        </w:tc>
-        <w:tc>
-          <w:tcPr>
-            <w:tcW w:w="0" w:type="auto"/>
-            <w:tcBorders>
-              <w:top w:val="single" w:sz="6" w:space="0" w:color="C4C7C5"/>
-              <w:left w:val="single" w:sz="6" w:space="0" w:color="C4C7C5"/>
-              <w:bottom w:val="single" w:sz="6" w:space="0" w:color="C4C7C5"/>
-              <w:right w:val="single" w:sz="6" w:space="0" w:color="C4C7C5"/>
-            </w:tcBorders>
-            <w:tcMar>
-              <w:top w:w="120" w:type="dxa"/>
-              <w:left w:w="180" w:type="dxa"/>
-              <w:bottom w:w="120" w:type="dxa"/>
-              <w:right w:w="180" w:type="dxa"/>
-            </w:tcMar>
-            <w:vAlign w:val="center"/>
-            <w:hideMark/>
-          </w:tcPr>
-          <w:p>
-            <w:proofErr w:type="gramStart"/>
-            <w:r>
-              <w:t>VARCHAR(</w:t>
-            </w:r>
-            <w:proofErr w:type="gramEnd"/>
-            <w:r>
-              <w:t>20)</w:t>
+          </w:p>
+        </w:tc>
+        <w:tc>
+          <w:tcPr>
+            <w:tcW w:w="0" w:type="auto"/>
+            <w:tcBorders>
+              <w:top w:val="single" w:sz="6" w:space="0" w:color="C4C7C5"/>
+              <w:left w:val="single" w:sz="6" w:space="0" w:color="C4C7C5"/>
+              <w:bottom w:val="single" w:sz="6" w:space="0" w:color="C4C7C5"/>
+              <w:right w:val="single" w:sz="6" w:space="0" w:color="C4C7C5"/>
+            </w:tcBorders>
+            <w:tcMar>
+              <w:top w:w="120" w:type="dxa"/>
+              <w:left w:w="180" w:type="dxa"/>
+              <w:bottom w:w="120" w:type="dxa"/>
+              <w:right w:w="180" w:type="dxa"/>
+            </w:tcMar>
+            <w:vAlign w:val="center"/>
+            <w:hideMark/>
+          </w:tcPr>
+          <w:p>
+            <w:r>
+              <w:t>VARCHAR(20)</w:t>
             </w:r>
           </w:p>
         </w:tc>
@@ -2103,7 +2008,6 @@
             <w:hideMark/>
           </w:tcPr>
           <w:p>
-            <w:proofErr w:type="spellStart"/>
             <w:r>
               <w:rPr>
                 <w:b/>
@@ -2111,7 +2015,6 @@
               </w:rPr>
               <w:t>helpful_votes</w:t>
             </w:r>
-            <w:proofErr w:type="spellEnd"/>
           </w:p>
         </w:tc>
         <w:tc>
@@ -2158,15 +2061,7 @@
           </w:tcPr>
           <w:p>
             <w:r>
-              <w:t xml:space="preserve">Total number of "Useful" upvotes received across </w:t>
-            </w:r>
-            <w:proofErr w:type="gramStart"/>
-            <w:r>
-              <w:t>all of</w:t>
-            </w:r>
-            <w:proofErr w:type="gramEnd"/>
-            <w:r>
-              <w:t xml:space="preserve"> their reviews.</w:t>
+              <w:t>Total number of "Useful" upvotes received across all of their reviews.</w:t>
             </w:r>
           </w:p>
         </w:tc>
@@ -2194,7 +2089,6 @@
             <w:hideMark/>
           </w:tcPr>
           <w:p>
-            <w:proofErr w:type="spellStart"/>
             <w:r>
               <w:rPr>
                 <w:b/>
@@ -2202,7 +2096,6 @@
               </w:rPr>
               <w:t>created_at</w:t>
             </w:r>
-            <w:proofErr w:type="spellEnd"/>
           </w:p>
         </w:tc>
         <w:tc>
@@ -2473,7 +2366,6 @@
             <w:hideMark/>
           </w:tcPr>
           <w:p>
-            <w:proofErr w:type="spellStart"/>
             <w:r>
               <w:rPr>
                 <w:b/>
@@ -2481,7 +2373,6 @@
               </w:rPr>
               <w:t>difficulty_rating</w:t>
             </w:r>
-            <w:proofErr w:type="spellEnd"/>
           </w:p>
         </w:tc>
         <w:tc>
@@ -2556,7 +2447,6 @@
             <w:hideMark/>
           </w:tcPr>
           <w:p>
-            <w:proofErr w:type="spellStart"/>
             <w:r>
               <w:rPr>
                 <w:b/>
@@ -2564,7 +2454,6 @@
               </w:rPr>
               <w:t>teaching_rating</w:t>
             </w:r>
-            <w:proofErr w:type="spellEnd"/>
           </w:p>
         </w:tc>
         <w:tc>
@@ -2639,7 +2528,6 @@
             <w:hideMark/>
           </w:tcPr>
           <w:p>
-            <w:proofErr w:type="spellStart"/>
             <w:r>
               <w:rPr>
                 <w:b/>
@@ -2647,7 +2535,6 @@
               </w:rPr>
               <w:t>content_rating</w:t>
             </w:r>
-            <w:proofErr w:type="spellEnd"/>
           </w:p>
         </w:tc>
         <w:tc>
@@ -2884,7 +2771,6 @@
             <w:hideMark/>
           </w:tcPr>
           <w:p>
-            <w:proofErr w:type="spellStart"/>
             <w:r>
               <w:rPr>
                 <w:b/>
@@ -2892,7 +2778,6 @@
               </w:rPr>
               <w:t>general_advice</w:t>
             </w:r>
-            <w:proofErr w:type="spellEnd"/>
           </w:p>
         </w:tc>
         <w:tc>
@@ -2967,7 +2852,6 @@
             <w:hideMark/>
           </w:tcPr>
           <w:p>
-            <w:proofErr w:type="spellStart"/>
             <w:r>
               <w:rPr>
                 <w:b/>
@@ -2975,7 +2859,6 @@
               </w:rPr>
               <w:t>is_anonymous</w:t>
             </w:r>
-            <w:proofErr w:type="spellEnd"/>
           </w:p>
         </w:tc>
         <w:tc>
@@ -3050,7 +2933,6 @@
             <w:hideMark/>
           </w:tcPr>
           <w:p>
-            <w:proofErr w:type="spellStart"/>
             <w:r>
               <w:rPr>
                 <w:b/>
@@ -3058,7 +2940,6 @@
               </w:rPr>
               <w:t>helpful_votes</w:t>
             </w:r>
-            <w:proofErr w:type="spellEnd"/>
           </w:p>
         </w:tc>
         <w:tc>
@@ -3133,7 +3014,6 @@
             <w:hideMark/>
           </w:tcPr>
           <w:p>
-            <w:proofErr w:type="spellStart"/>
             <w:r>
               <w:rPr>
                 <w:b/>
@@ -3141,7 +3021,6 @@
               </w:rPr>
               <w:t>date_posted</w:t>
             </w:r>
-            <w:proofErr w:type="spellEnd"/>
           </w:p>
         </w:tc>
         <w:tc>
@@ -3216,7 +3095,6 @@
             <w:hideMark/>
           </w:tcPr>
           <w:p>
-            <w:proofErr w:type="spellStart"/>
             <w:r>
               <w:rPr>
                 <w:b/>
@@ -3224,7 +3102,6 @@
               </w:rPr>
               <w:t>user_id</w:t>
             </w:r>
-            <w:proofErr w:type="spellEnd"/>
           </w:p>
         </w:tc>
         <w:tc>
@@ -3271,15 +3148,7 @@
           </w:tcPr>
           <w:p>
             <w:r>
-              <w:t xml:space="preserve">Foreign Key referencing id in the </w:t>
-            </w:r>
-            <w:proofErr w:type="gramStart"/>
-            <w:r>
-              <w:t>users</w:t>
-            </w:r>
-            <w:proofErr w:type="gramEnd"/>
-            <w:r>
-              <w:t xml:space="preserve"> table.</w:t>
+              <w:t>Foreign Key referencing id in the users table.</w:t>
             </w:r>
           </w:p>
         </w:tc>
@@ -3307,7 +3176,6 @@
             <w:hideMark/>
           </w:tcPr>
           <w:p>
-            <w:proofErr w:type="spellStart"/>
             <w:r>
               <w:rPr>
                 <w:b/>
@@ -3315,7 +3183,6 @@
               </w:rPr>
               <w:t>module_id</w:t>
             </w:r>
-            <w:proofErr w:type="spellEnd"/>
           </w:p>
         </w:tc>
         <w:tc>
@@ -3598,39 +3465,32 @@
             <w:hideMark/>
           </w:tcPr>
           <w:p>
-            <w:proofErr w:type="spellStart"/>
             <w:r>
               <w:t>course_code</w:t>
             </w:r>
-            <w:proofErr w:type="spellEnd"/>
-          </w:p>
-        </w:tc>
-        <w:tc>
-          <w:tcPr>
-            <w:tcW w:w="0" w:type="auto"/>
-            <w:tcBorders>
-              <w:top w:val="single" w:sz="6" w:space="0" w:color="C4C7C5"/>
-              <w:left w:val="single" w:sz="6" w:space="0" w:color="C4C7C5"/>
-              <w:bottom w:val="single" w:sz="6" w:space="0" w:color="C4C7C5"/>
-              <w:right w:val="single" w:sz="6" w:space="0" w:color="C4C7C5"/>
-            </w:tcBorders>
-            <w:tcMar>
-              <w:top w:w="120" w:type="dxa"/>
-              <w:left w:w="180" w:type="dxa"/>
-              <w:bottom w:w="120" w:type="dxa"/>
-              <w:right w:w="180" w:type="dxa"/>
-            </w:tcMar>
-            <w:vAlign w:val="center"/>
-            <w:hideMark/>
-          </w:tcPr>
-          <w:p>
-            <w:proofErr w:type="gramStart"/>
-            <w:r>
-              <w:t>VARCHAR(</w:t>
-            </w:r>
-            <w:proofErr w:type="gramEnd"/>
-            <w:r>
-              <w:t>15)</w:t>
+          </w:p>
+        </w:tc>
+        <w:tc>
+          <w:tcPr>
+            <w:tcW w:w="0" w:type="auto"/>
+            <w:tcBorders>
+              <w:top w:val="single" w:sz="6" w:space="0" w:color="C4C7C5"/>
+              <w:left w:val="single" w:sz="6" w:space="0" w:color="C4C7C5"/>
+              <w:bottom w:val="single" w:sz="6" w:space="0" w:color="C4C7C5"/>
+              <w:right w:val="single" w:sz="6" w:space="0" w:color="C4C7C5"/>
+            </w:tcBorders>
+            <w:tcMar>
+              <w:top w:w="120" w:type="dxa"/>
+              <w:left w:w="180" w:type="dxa"/>
+              <w:bottom w:w="120" w:type="dxa"/>
+              <w:right w:w="180" w:type="dxa"/>
+            </w:tcMar>
+            <w:vAlign w:val="center"/>
+            <w:hideMark/>
+          </w:tcPr>
+          <w:p>
+            <w:r>
+              <w:t>VARCHAR(15)</w:t>
             </w:r>
           </w:p>
         </w:tc>
@@ -3689,39 +3549,32 @@
             <w:hideMark/>
           </w:tcPr>
           <w:p>
-            <w:proofErr w:type="spellStart"/>
             <w:r>
               <w:t>course_name</w:t>
             </w:r>
-            <w:proofErr w:type="spellEnd"/>
-          </w:p>
-        </w:tc>
-        <w:tc>
-          <w:tcPr>
-            <w:tcW w:w="0" w:type="auto"/>
-            <w:tcBorders>
-              <w:top w:val="single" w:sz="6" w:space="0" w:color="C4C7C5"/>
-              <w:left w:val="single" w:sz="6" w:space="0" w:color="C4C7C5"/>
-              <w:bottom w:val="single" w:sz="6" w:space="0" w:color="C4C7C5"/>
-              <w:right w:val="single" w:sz="6" w:space="0" w:color="C4C7C5"/>
-            </w:tcBorders>
-            <w:tcMar>
-              <w:top w:w="120" w:type="dxa"/>
-              <w:left w:w="180" w:type="dxa"/>
-              <w:bottom w:w="120" w:type="dxa"/>
-              <w:right w:w="180" w:type="dxa"/>
-            </w:tcMar>
-            <w:vAlign w:val="center"/>
-            <w:hideMark/>
-          </w:tcPr>
-          <w:p>
-            <w:proofErr w:type="gramStart"/>
-            <w:r>
-              <w:t>VARCHAR(</w:t>
-            </w:r>
-            <w:proofErr w:type="gramEnd"/>
-            <w:r>
-              <w:t>127)</w:t>
+          </w:p>
+        </w:tc>
+        <w:tc>
+          <w:tcPr>
+            <w:tcW w:w="0" w:type="auto"/>
+            <w:tcBorders>
+              <w:top w:val="single" w:sz="6" w:space="0" w:color="C4C7C5"/>
+              <w:left w:val="single" w:sz="6" w:space="0" w:color="C4C7C5"/>
+              <w:bottom w:val="single" w:sz="6" w:space="0" w:color="C4C7C5"/>
+              <w:right w:val="single" w:sz="6" w:space="0" w:color="C4C7C5"/>
+            </w:tcBorders>
+            <w:tcMar>
+              <w:top w:w="120" w:type="dxa"/>
+              <w:left w:w="180" w:type="dxa"/>
+              <w:bottom w:w="120" w:type="dxa"/>
+              <w:right w:w="180" w:type="dxa"/>
+            </w:tcMar>
+            <w:vAlign w:val="center"/>
+            <w:hideMark/>
+          </w:tcPr>
+          <w:p>
+            <w:r>
+              <w:t>VARCHAR(127)</w:t>
             </w:r>
           </w:p>
         </w:tc>
@@ -3804,13 +3657,8 @@
             <w:hideMark/>
           </w:tcPr>
           <w:p>
-            <w:proofErr w:type="gramStart"/>
-            <w:r>
-              <w:t>VARCHAR(</w:t>
-            </w:r>
-            <w:proofErr w:type="gramEnd"/>
-            <w:r>
-              <w:t>63)</w:t>
+            <w:r>
+              <w:t>VARCHAR(63)</w:t>
             </w:r>
           </w:p>
         </w:tc>
@@ -3875,34 +3723,32 @@
             <w:hideMark/>
           </w:tcPr>
           <w:p>
-            <w:proofErr w:type="spellStart"/>
             <w:r>
               <w:t>duration_years</w:t>
             </w:r>
-            <w:proofErr w:type="spellEnd"/>
-          </w:p>
-        </w:tc>
-        <w:tc>
-          <w:tcPr>
-            <w:tcW w:w="0" w:type="auto"/>
-            <w:tcBorders>
-              <w:top w:val="single" w:sz="6" w:space="0" w:color="C4C7C5"/>
-              <w:left w:val="single" w:sz="6" w:space="0" w:color="C4C7C5"/>
-              <w:bottom w:val="single" w:sz="6" w:space="0" w:color="C4C7C5"/>
-              <w:right w:val="single" w:sz="6" w:space="0" w:color="C4C7C5"/>
-            </w:tcBorders>
-            <w:tcMar>
-              <w:top w:w="120" w:type="dxa"/>
-              <w:left w:w="180" w:type="dxa"/>
-              <w:bottom w:w="120" w:type="dxa"/>
-              <w:right w:w="180" w:type="dxa"/>
-            </w:tcMar>
-            <w:vAlign w:val="center"/>
-            <w:hideMark/>
-          </w:tcPr>
-          <w:p>
-            <w:r>
-              <w:t>INT</w:t>
+          </w:p>
+        </w:tc>
+        <w:tc>
+          <w:tcPr>
+            <w:tcW w:w="0" w:type="auto"/>
+            <w:tcBorders>
+              <w:top w:val="single" w:sz="6" w:space="0" w:color="C4C7C5"/>
+              <w:left w:val="single" w:sz="6" w:space="0" w:color="C4C7C5"/>
+              <w:bottom w:val="single" w:sz="6" w:space="0" w:color="C4C7C5"/>
+              <w:right w:val="single" w:sz="6" w:space="0" w:color="C4C7C5"/>
+            </w:tcBorders>
+            <w:tcMar>
+              <w:top w:w="120" w:type="dxa"/>
+              <w:left w:w="180" w:type="dxa"/>
+              <w:bottom w:w="120" w:type="dxa"/>
+              <w:right w:w="180" w:type="dxa"/>
+            </w:tcMar>
+            <w:vAlign w:val="center"/>
+            <w:hideMark/>
+          </w:tcPr>
+          <w:p>
+            <w:r>
+              <w:t>VARCHAR(10)</w:t>
             </w:r>
           </w:p>
         </w:tc>
@@ -3961,11 +3807,9 @@
             <w:hideMark/>
           </w:tcPr>
           <w:p>
-            <w:proofErr w:type="spellStart"/>
             <w:r>
               <w:t>faculty_id</w:t>
             </w:r>
-            <w:proofErr w:type="spellEnd"/>
           </w:p>
         </w:tc>
         <w:tc>
@@ -4041,7 +3885,6 @@
         <w:lastRenderedPageBreak/>
         <w:t xml:space="preserve">Table: </w:t>
       </w:r>
-      <w:proofErr w:type="spellStart"/>
       <w:r>
         <w:rPr>
           <w:b/>
@@ -4049,7 +3892,6 @@
         </w:rPr>
         <w:t>course_modules</w:t>
       </w:r>
-      <w:proofErr w:type="spellEnd"/>
     </w:p>
     <w:tbl>
       <w:tblPr>
@@ -4179,11 +4021,9 @@
             <w:hideMark/>
           </w:tcPr>
           <w:p>
-            <w:proofErr w:type="spellStart"/>
             <w:r>
               <w:t>course_id</w:t>
             </w:r>
-            <w:proofErr w:type="spellEnd"/>
           </w:p>
         </w:tc>
         <w:tc>
@@ -4265,11 +4105,9 @@
             <w:hideMark/>
           </w:tcPr>
           <w:p>
-            <w:proofErr w:type="spellStart"/>
             <w:r>
               <w:t>module_id</w:t>
             </w:r>
-            <w:proofErr w:type="spellEnd"/>
           </w:p>
         </w:tc>
         <w:tc>
@@ -4351,11 +4189,9 @@
             <w:hideMark/>
           </w:tcPr>
           <w:p>
-            <w:proofErr w:type="spellStart"/>
             <w:r>
               <w:t>year_of_study</w:t>
             </w:r>
-            <w:proofErr w:type="spellEnd"/>
           </w:p>
         </w:tc>
         <w:tc>
@@ -5029,6 +4865,7 @@
   <w:style w:type="character" w:default="1" w:styleId="DefaultParagraphFont">
     <w:name w:val="Default Paragraph Font"/>
     <w:uiPriority w:val="1"/>
+    <w:semiHidden/>
     <w:unhideWhenUsed/>
   </w:style>
   <w:style w:type="table" w:default="1" w:styleId="TableNormal">

</xml_diff>